<commit_message>
fix: proof block heading 使用真实 Heading 3 样式
原 heading 段落只设了 bold + 14pt + color，style 仍是 Normal，
Word 的导航窗格和大纲视图都列不出这 11 个 proof block。

根因：officecli 的 --prop style= 按 **styleId** 解析而非样式显示名。
传 style="Heading 3" 会告警 "style not found in styles part" 并静默
留在 Normal；传 styleId（本文档为 "4"）才得到带 w:outlineLvl=2 的
真 Heading 3。styleId 是文档相关的，故运行时反查而不硬编码。

变更文件：
- scripts/append_proof_blocks.py
  - 新增 resolve_heading3_style_id()，用 python-docx 从 source 反查
    "Heading 3" 的 styleId；缺失/python-docx 不可用时返回 None
  - officecli() 新增 check 参数，支持非致命调用
  - add_paragraph_before() 新增 style 参数；styled insert 失败时自动
    回退到原 inline bold+color 行为
  - 顺带修掉 props 组装里的 props[3] 硬编码索引（改为通用展开）
- docs/演示材料/POC完成证明与演示手册.docx 重新生成

验证：
  Heading 3 且含「完成证明」的段落 = 11（3.1.1 … 4.3 全覆盖）
  pytest poc/tests tests/ -q -> 225 passed, 1 skipped
</commit_message>
<xml_diff>
--- a/docs/演示材料/POC完成证明与演示手册.docx
+++ b/docs/演示材料/POC完成证明与演示手册.docx
@@ -12958,7 +12958,9 @@
       </w:tr>
     </w:tbl>
     <w:p>
-      <w:pPr/>
+      <w:pPr>
+        <w:pStyle w:val="4"/>
+      </w:pPr>
       <w:r>
         <w:rPr>
           <w:b/>
@@ -14279,7 +14281,9 @@
       </w:tr>
     </w:tbl>
     <w:p>
-      <w:pPr/>
+      <w:pPr>
+        <w:pStyle w:val="4"/>
+      </w:pPr>
       <w:r>
         <w:rPr>
           <w:b/>
@@ -15577,7 +15581,9 @@
       </w:tr>
     </w:tbl>
     <w:p>
-      <w:pPr/>
+      <w:pPr>
+        <w:pStyle w:val="4"/>
+      </w:pPr>
       <w:r>
         <w:rPr>
           <w:b/>
@@ -16952,7 +16958,9 @@
       </w:tr>
     </w:tbl>
     <w:p>
-      <w:pPr/>
+      <w:pPr>
+        <w:pStyle w:val="4"/>
+      </w:pPr>
       <w:r>
         <w:rPr>
           <w:b/>
@@ -18286,7 +18294,9 @@
       </w:tr>
     </w:tbl>
     <w:p>
-      <w:pPr/>
+      <w:pPr>
+        <w:pStyle w:val="4"/>
+      </w:pPr>
       <w:r>
         <w:rPr>
           <w:b/>
@@ -19668,7 +19678,9 @@
       </w:tr>
     </w:tbl>
     <w:p>
-      <w:pPr/>
+      <w:pPr>
+        <w:pStyle w:val="4"/>
+      </w:pPr>
       <w:r>
         <w:rPr>
           <w:b/>
@@ -20929,7 +20941,9 @@
       </w:tr>
     </w:tbl>
     <w:p>
-      <w:pPr/>
+      <w:pPr>
+        <w:pStyle w:val="4"/>
+      </w:pPr>
       <w:r>
         <w:rPr>
           <w:b/>
@@ -22349,7 +22363,9 @@
       </w:tr>
     </w:tbl>
     <w:p>
-      <w:pPr/>
+      <w:pPr>
+        <w:pStyle w:val="4"/>
+      </w:pPr>
       <w:r>
         <w:rPr>
           <w:b/>
@@ -23694,7 +23710,9 @@
       </w:tr>
     </w:tbl>
     <w:p>
-      <w:pPr/>
+      <w:pPr>
+        <w:pStyle w:val="4"/>
+      </w:pPr>
       <w:r>
         <w:rPr>
           <w:b/>
@@ -24979,7 +24997,9 @@
       </w:tr>
     </w:tbl>
     <w:p>
-      <w:pPr/>
+      <w:pPr>
+        <w:pStyle w:val="4"/>
+      </w:pPr>
       <w:r>
         <w:rPr>
           <w:b/>
@@ -26254,7 +26274,9 @@
       </w:tr>
     </w:tbl>
     <w:p>
-      <w:pPr/>
+      <w:pPr>
+        <w:pStyle w:val="4"/>
+      </w:pPr>
       <w:r>
         <w:rPr>
           <w:b/>

</xml_diff>

<commit_message>
refactor: 新增 python-docx 后端作为 officecli 的备用插入路径
脚本原先强依赖 PATH 上的 officecli binary，接入 CI 时无法保障。
新增 --backend={officecli,python-docx}；默认仍是已验证的 officecli，
officecli 后端逻辑一行未改。

python-docx 后端实现：
- 同样以 source 字节覆盖 target 起步，避免上轮残留
- 用 w14:paraId 定位 anchor 段（python-docx 不暴露 paraId，
  从 _element.get(qn('w14:paraId')) 读取）
- 社区共识的 lxml 插入法：先由 python-docx 建元素（落在 body 尾），
  再 anchor._p.addprevious(el) splice 回位。addprevious 总是插到
  anchor 紧前方，故按自然序 heading → intro → table 调用即可，
  不像 officecli --before 需要倒序插入

变更文件：
- scripts/append_proof_blocks.py（新增 argparse + 5 个后端函数，
  officecli 路径原样保留，仅从 main() 拆出 run_officecli_backend()）
- docs/演示材料/POC完成证明与演示手册.docx（以 python-docx 后端重新生成）

两后端等价性验证（body 逐元素比对 officecli 版 vs python-docx 版）：
  structure identical: True (94 elements)
  table count: 24 / 24 | cell content identical: True
  11 个 proof block 均为 evalTbl -> Heading 3 -> intro -> proofTbl
  heading blocks: 11
pytest poc/tests tests/ -q -> 225 passed, 1 skipped
</commit_message>
<xml_diff>
--- a/docs/演示材料/POC完成证明与演示手册.docx
+++ b/docs/演示材料/POC完成证明与演示手册.docx
@@ -1,6 +1,6 @@
 
 <file path=word/document.xml><?xml version="1.0" encoding="utf-8"?>
-<w:document xmlns:a="http://schemas.openxmlformats.org/drawingml/2006/main" xmlns:pic="http://schemas.openxmlformats.org/drawingml/2006/picture" xmlns:a14="http://schemas.microsoft.com/office/drawing/2010/main" xmlns:wpc="http://schemas.microsoft.com/office/word/2010/wordprocessingCanvas" xmlns:cx="http://schemas.microsoft.com/office/drawing/2014/chartex" xmlns:cx1="http://schemas.microsoft.com/office/drawing/2015/9/8/chartex" xmlns:cx2="http://schemas.microsoft.com/office/drawing/2015/10/21/chartex" xmlns:cx3="http://schemas.microsoft.com/office/drawing/2016/5/9/chartex" xmlns:cx4="http://schemas.microsoft.com/office/drawing/2016/5/10/chartex" xmlns:cx5="http://schemas.microsoft.com/office/drawing/2016/5/11/chartex" xmlns:cx6="http://schemas.microsoft.com/office/drawing/2016/5/12/chartex" xmlns:cx7="http://schemas.microsoft.com/office/drawing/2016/5/13/chartex" xmlns:cx8="http://schemas.microsoft.com/office/drawing/2016/5/14/chartex" xmlns:mc="http://schemas.openxmlformats.org/markup-compatibility/2006" xmlns:o="urn:schemas-microsoft-com:office:office" xmlns:r="http://schemas.openxmlformats.org/officeDocument/2006/relationships" xmlns:m="http://schemas.openxmlformats.org/officeDocument/2006/math" xmlns:v="urn:schemas-microsoft-com:vml" xmlns:wp14="http://schemas.microsoft.com/office/word/2010/wordprocessingDrawing" xmlns:wp="http://schemas.openxmlformats.org/drawingml/2006/wordprocessingDrawing" xmlns:w="http://schemas.openxmlformats.org/wordprocessingml/2006/main" xmlns:w14="http://schemas.microsoft.com/office/word/2010/wordml" xmlns:w10="urn:schemas-microsoft-com:office:word" xmlns:w15="http://schemas.microsoft.com/office/word/2012/wordml" xmlns:wpg="http://schemas.microsoft.com/office/word/2010/wordprocessingGroup" xmlns:wpi="http://schemas.microsoft.com/office/word/2010/wordprocessingInk" xmlns:wne="http://schemas.microsoft.com/office/word/2006/wordml" xmlns:wps="http://schemas.microsoft.com/office/word/2010/wordprocessingShape" xmlns:wpsCustomData="http://www.wps.cn/officeDocument/2013/wpsCustomData" mc:Ignorable="w14 w15 wp14">
+<w:document xmlns:wpc="http://schemas.microsoft.com/office/word/2010/wordprocessingCanvas" xmlns:cx="http://schemas.microsoft.com/office/drawing/2014/chartex" xmlns:cx1="http://schemas.microsoft.com/office/drawing/2015/9/8/chartex" xmlns:cx2="http://schemas.microsoft.com/office/drawing/2015/10/21/chartex" xmlns:cx3="http://schemas.microsoft.com/office/drawing/2016/5/9/chartex" xmlns:cx4="http://schemas.microsoft.com/office/drawing/2016/5/10/chartex" xmlns:cx5="http://schemas.microsoft.com/office/drawing/2016/5/11/chartex" xmlns:cx6="http://schemas.microsoft.com/office/drawing/2016/5/12/chartex" xmlns:cx7="http://schemas.microsoft.com/office/drawing/2016/5/13/chartex" xmlns:cx8="http://schemas.microsoft.com/office/drawing/2016/5/14/chartex" xmlns:mc="http://schemas.openxmlformats.org/markup-compatibility/2006" xmlns:o="urn:schemas-microsoft-com:office:office" xmlns:r="http://schemas.openxmlformats.org/officeDocument/2006/relationships" xmlns:m="http://schemas.openxmlformats.org/officeDocument/2006/math" xmlns:v="urn:schemas-microsoft-com:vml" xmlns:wp14="http://schemas.microsoft.com/office/word/2010/wordprocessingDrawing" xmlns:wp="http://schemas.openxmlformats.org/drawingml/2006/wordprocessingDrawing" xmlns:w="http://schemas.openxmlformats.org/wordprocessingml/2006/main" xmlns:w14="http://schemas.microsoft.com/office/word/2010/wordml" xmlns:w10="urn:schemas-microsoft-com:office:word" xmlns:w15="http://schemas.microsoft.com/office/word/2012/wordml" xmlns:wpg="http://schemas.microsoft.com/office/word/2010/wordprocessingGroup" xmlns:wpi="http://schemas.microsoft.com/office/word/2010/wordprocessingInk" xmlns:wne="http://schemas.microsoft.com/office/word/2006/wordml" xmlns:wps="http://schemas.microsoft.com/office/word/2010/wordprocessingShape" xmlns:wpsCustomData="http://www.wps.cn/officeDocument/2013/wpsCustomData" mc:Ignorable="w14 w15 wp14">
   <w:body>
     <w:p>
       <w:pPr>
@@ -8,7 +8,7 @@
           <w:rFonts w:ascii="华文细黑" w:hAnsi="华文细黑" w:eastAsia="华文细黑"/>
         </w:rPr>
       </w:pPr>
-      <w:bookmarkStart w:name="_GoBack" w:id="25"/>
+      <w:bookmarkStart w:id="25" w:name="_GoBack"/>
       <w:bookmarkEnd w:id="25"/>
       <w:r>
         <w:rPr>
@@ -2378,8 +2378,8 @@
           <w:szCs w:val="24"/>
         </w:rPr>
         <w:sectPr>
-          <w:headerReference w:type="default" r:id="rId4"/>
-          <w:footerReference w:type="default" r:id="rId5"/>
+          <w:headerReference r:id="rId4" w:type="default"/>
+          <w:footerReference r:id="rId5" w:type="default"/>
           <w:pgSz w:w="11906" w:h="16838"/>
           <w:pgMar w:top="1440" w:right="1440" w:bottom="1440" w:left="1440" w:header="720" w:footer="191" w:gutter="0"/>
           <w:cols w:space="708" w:num="1"/>
@@ -2407,7 +2407,7 @@
           <w:bCs/>
         </w:rPr>
       </w:pPr>
-      <w:bookmarkStart w:name="_Toc25457" w:id="0"/>
+      <w:bookmarkStart w:id="0" w:name="_Toc25457"/>
       <w:r>
         <w:rPr>
           <w:rFonts w:hint="eastAsia" w:ascii="华文细黑" w:hAnsi="华文细黑" w:eastAsia="华文细黑"/>
@@ -4202,7 +4202,7 @@
           <w:szCs w:val="24"/>
         </w:rPr>
       </w:pPr>
-      <w:bookmarkStart w:name="_Toc2324" w:id="1"/>
+      <w:bookmarkStart w:id="1" w:name="_Toc2324"/>
       <w:r>
         <w:rPr>
           <w:rFonts w:hint="eastAsia" w:ascii="华文细黑" w:hAnsi="华文细黑" w:eastAsia="华文细黑"/>
@@ -10781,7 +10781,7 @@
           <w:szCs w:val="24"/>
         </w:rPr>
       </w:pPr>
-      <w:bookmarkStart w:name="_Toc31081" w:id="2"/>
+      <w:bookmarkStart w:id="2" w:name="_Toc31081"/>
       <w:r>
         <w:rPr>
           <w:rFonts w:hint="eastAsia" w:ascii="华文细黑" w:hAnsi="华文细黑" w:eastAsia="华文细黑"/>
@@ -10884,7 +10884,7 @@
           <w:szCs w:val="24"/>
         </w:rPr>
       </w:pPr>
-      <w:bookmarkStart w:name="_Toc28575" w:id="3"/>
+      <w:bookmarkStart w:id="3" w:name="_Toc28575"/>
       <w:r>
         <w:rPr>
           <w:rFonts w:hint="eastAsia" w:ascii="华文细黑" w:hAnsi="华文细黑" w:eastAsia="华文细黑"/>
@@ -11041,7 +11041,7 @@
           <w:szCs w:val="24"/>
         </w:rPr>
       </w:pPr>
-      <w:bookmarkStart w:name="_Toc13963" w:id="4"/>
+      <w:bookmarkStart w:id="4" w:name="_Toc13963"/>
       <w:r>
         <w:rPr>
           <w:rFonts w:hint="eastAsia" w:ascii="华文细黑" w:hAnsi="华文细黑" w:eastAsia="华文细黑"/>
@@ -11251,7 +11251,7 @@
           <w:szCs w:val="24"/>
         </w:rPr>
       </w:pPr>
-      <w:bookmarkStart w:name="_Toc10125" w:id="5"/>
+      <w:bookmarkStart w:id="5" w:name="_Toc10125"/>
       <w:r>
         <w:rPr>
           <w:rFonts w:hint="eastAsia" w:ascii="华文细黑" w:hAnsi="华文细黑" w:eastAsia="华文细黑"/>
@@ -11419,7 +11419,7 @@
           <w:szCs w:val="24"/>
         </w:rPr>
       </w:pPr>
-      <w:bookmarkStart w:name="_Toc31715" w:id="6"/>
+      <w:bookmarkStart w:id="6" w:name="_Toc31715"/>
       <w:r>
         <w:rPr>
           <w:rFonts w:hint="eastAsia" w:ascii="华文细黑" w:hAnsi="华文细黑" w:eastAsia="华文细黑"/>
@@ -11478,7 +11478,7 @@
           <w:szCs w:val="24"/>
         </w:rPr>
       </w:pPr>
-      <w:bookmarkStart w:name="_Toc24252" w:id="7"/>
+      <w:bookmarkStart w:id="7" w:name="_Toc24252"/>
       <w:r>
         <w:rPr>
           <w:rFonts w:hint="eastAsia" w:ascii="华文细黑" w:hAnsi="华文细黑" w:eastAsia="华文细黑"/>
@@ -11527,7 +11527,7 @@
           <w:szCs w:val="24"/>
         </w:rPr>
       </w:pPr>
-      <w:bookmarkStart w:name="_Toc21716" w:id="8"/>
+      <w:bookmarkStart w:id="8" w:name="_Toc21716"/>
       <w:r>
         <w:rPr>
           <w:rFonts w:hint="eastAsia" w:ascii="华文细黑" w:hAnsi="华文细黑" w:eastAsia="华文细黑"/>
@@ -11723,7 +11723,7 @@
           <w:szCs w:val="24"/>
         </w:rPr>
       </w:pPr>
-      <w:bookmarkStart w:name="_Toc7187" w:id="9"/>
+      <w:bookmarkStart w:id="9" w:name="_Toc7187"/>
       <w:r>
         <w:rPr>
           <w:rFonts w:hint="eastAsia" w:ascii="华文细黑" w:hAnsi="华文细黑" w:eastAsia="华文细黑"/>
@@ -11748,7 +11748,7 @@
           <w:szCs w:val="24"/>
         </w:rPr>
       </w:pPr>
-      <w:bookmarkStart w:name="_Toc31087" w:id="10"/>
+      <w:bookmarkStart w:id="10" w:name="_Toc31087"/>
       <w:r>
         <w:rPr>
           <w:rFonts w:hint="eastAsia" w:ascii="华文细黑" w:hAnsi="华文细黑" w:eastAsia="华文细黑" w:cstheme="majorBidi"/>
@@ -11777,7 +11777,7 @@
           <w:lang w:val="en-GB"/>
         </w:rPr>
       </w:pPr>
-      <w:bookmarkStart w:name="_Toc30981" w:id="11"/>
+      <w:bookmarkStart w:id="11" w:name="_Toc30981"/>
       <w:r>
         <w:rPr>
           <w:rFonts w:hint="eastAsia" w:ascii="华文细黑" w:hAnsi="华文细黑" w:eastAsia="华文细黑" w:cstheme="majorBidi"/>
@@ -12967,32 +12967,23 @@
           <w:color w:val="C00000"/>
           <w:sz w:val="28"/>
         </w:rPr>
-        <w:t xml:space="preserve">【完成证明 · 3.1.1 EXCEL文件问答能力（用例 1-1）】</w:t>
+        <w:t>【完成证明 · 3.1.1 EXCEL文件问答能力（用例 1-1）】</w:t>
       </w:r>
     </w:p>
     <w:p>
-      <w:pPr/>
       <w:r>
         <w:rPr>
-          <w:b w:val="false"/>
+          <w:b w:val="0"/>
           <w:sz w:val="22"/>
         </w:rPr>
-        <w:t xml:space="preserve">用例 1-1（对应需求原文 §3.1.1 EXCEL文件问答能力）的完成证据与现场演示命令如下。仓库当前测试基线：pytest 225 passed, 1 skipped（基线 101 + 任务 A/B/C/D/E/F 新增 124）。本节直接挂在原评估指标表之后，便于评委按需求原顺序查阅。</w:t>
+        <w:t>用例 1-1（对应需求原文 §3.1.1 EXCEL文件问答能力）的完成证据与现场演示命令如下。仓库当前测试基线：pytest 225 passed, 1 skipped（基线 101 + 任务 A/B/C/D/E/F 新增 124）。本节直接挂在原评估指标表之后，便于评委按需求原顺序查阅。</w:t>
       </w:r>
     </w:p>
     <w:tbl>
       <w:tblPr>
-        <w:tblStyle w:val="25"/>
-        <w:tblW w:w="9075" w:type="dxa"/>
-        <w:tblBorders>
-          <w:top w:val="single" w:sz="4"/>
-          <w:left w:val="single" w:sz="4"/>
-          <w:bottom w:val="single" w:sz="4"/>
-          <w:right w:val="single" w:sz="4"/>
-          <w:insideH w:val="single" w:sz="4"/>
-          <w:insideV w:val="single" w:sz="4"/>
-        </w:tblBorders>
-        <w:tblLook w:val="04A0"/>
+        <w:tblStyle w:val="26"/>
+        <w:tblW w:type="auto" w:w="0"/>
+        <w:tblLook w:firstColumn="1" w:firstRow="1" w:lastColumn="0" w:lastRow="0" w:noHBand="0" w:noVBand="1" w:val="04A0"/>
       </w:tblPr>
       <w:tblGrid>
         <w:gridCol w:w="2256"/>
@@ -13002,90 +12993,178 @@
       </w:tblGrid>
       <w:tr>
         <w:tc>
-          <w:p>
-            <w:r>
-              <w:t xml:space="preserve">考察点</w:t>
-            </w:r>
-          </w:p>
-        </w:tc>
-        <w:tc>
-          <w:p>
-            <w:r>
-              <w:t xml:space="preserve">完成状态</w:t>
-            </w:r>
-          </w:p>
-        </w:tc>
-        <w:tc>
-          <w:p>
-            <w:r>
-              <w:t xml:space="preserve">证据（文件/行号）</w:t>
-            </w:r>
-          </w:p>
-        </w:tc>
-        <w:tc>
-          <w:p>
-            <w:r>
-              <w:t xml:space="preserve">演示命令</w:t>
+          <w:tcPr>
+            <w:tcW w:type="dxa" w:w="2256"/>
+          </w:tcPr>
+          <w:p>
+            <w:r/>
+            <w:r>
+              <w:rPr>
+                <w:b/>
+                <w:sz w:val="18"/>
+              </w:rPr>
+              <w:t>考察点</w:t>
+            </w:r>
+          </w:p>
+        </w:tc>
+        <w:tc>
+          <w:tcPr>
+            <w:tcW w:type="dxa" w:w="2256"/>
+          </w:tcPr>
+          <w:p>
+            <w:r/>
+            <w:r>
+              <w:rPr>
+                <w:b/>
+                <w:sz w:val="18"/>
+              </w:rPr>
+              <w:t>完成状态</w:t>
+            </w:r>
+          </w:p>
+        </w:tc>
+        <w:tc>
+          <w:tcPr>
+            <w:tcW w:type="dxa" w:w="2256"/>
+          </w:tcPr>
+          <w:p>
+            <w:r/>
+            <w:r>
+              <w:rPr>
+                <w:b/>
+                <w:sz w:val="18"/>
+              </w:rPr>
+              <w:t>证据（文件/行号）</w:t>
+            </w:r>
+          </w:p>
+        </w:tc>
+        <w:tc>
+          <w:tcPr>
+            <w:tcW w:type="dxa" w:w="2256"/>
+          </w:tcPr>
+          <w:p>
+            <w:r/>
+            <w:r>
+              <w:rPr>
+                <w:b/>
+                <w:sz w:val="18"/>
+              </w:rPr>
+              <w:t>演示命令</w:t>
             </w:r>
           </w:p>
         </w:tc>
       </w:tr>
       <w:tr>
         <w:tc>
-          <w:p>
-            <w:r>
-              <w:t xml:space="preserve">12 道 Excel 测题（读取/查询/分析/写入四类）</w:t>
-            </w:r>
-          </w:p>
-        </w:tc>
-        <w:tc>
-          <w:p>
-            <w:r>
-              <w:t xml:space="preserve">✅ 已完成（任务 E）</w:t>
-            </w:r>
-          </w:p>
-        </w:tc>
-        <w:tc>
-          <w:p>
-            <w:r>
-              <w:t xml:space="preserve">docs/excel-12题标准答卷.md（共 12 题 + 3 道异常题）；poc/skills/excel-qa-bank/SKILL.md（frontmatter + 触发词/参数/返回值/边界四段）</w:t>
-            </w:r>
-          </w:p>
-        </w:tc>
-        <w:tc>
-          <w:p>
-            <w:r>
-              <w:t xml:space="preserve">在 Console 给智能体挂 excel-guard MCP + excel-qa-bank Skill，对 fixtures/{corrupt.xlsx, encoding_gbk.csv, large_chunk_demo.xlsx} 出题；预跑结果见 docs/excel-12题标准答卷.md</w:t>
+          <w:tcPr>
+            <w:tcW w:type="dxa" w:w="2256"/>
+          </w:tcPr>
+          <w:p>
+            <w:r/>
+            <w:r>
+              <w:rPr>
+                <w:sz w:val="18"/>
+              </w:rPr>
+              <w:t>12 道 Excel 测题（读取/查询/分析/写入四类）</w:t>
+            </w:r>
+          </w:p>
+        </w:tc>
+        <w:tc>
+          <w:tcPr>
+            <w:tcW w:type="dxa" w:w="2256"/>
+          </w:tcPr>
+          <w:p>
+            <w:r/>
+            <w:r>
+              <w:rPr>
+                <w:sz w:val="18"/>
+              </w:rPr>
+              <w:t>✅ 已完成（任务 E）</w:t>
+            </w:r>
+          </w:p>
+        </w:tc>
+        <w:tc>
+          <w:tcPr>
+            <w:tcW w:type="dxa" w:w="2256"/>
+          </w:tcPr>
+          <w:p>
+            <w:r/>
+            <w:r>
+              <w:rPr>
+                <w:sz w:val="18"/>
+              </w:rPr>
+              <w:t>docs/excel-12题标准答卷.md（共 12 题 + 3 道异常题）；poc/skills/excel-qa-bank/SKILL.md（frontmatter + 触发词/参数/返回值/边界四段）</w:t>
+            </w:r>
+          </w:p>
+        </w:tc>
+        <w:tc>
+          <w:tcPr>
+            <w:tcW w:type="dxa" w:w="2256"/>
+          </w:tcPr>
+          <w:p>
+            <w:r/>
+            <w:r>
+              <w:rPr>
+                <w:sz w:val="18"/>
+              </w:rPr>
+              <w:t>在 Console 给智能体挂 excel-guard MCP + excel-qa-bank Skill，对 fixtures/{corrupt.xlsx, encoding_gbk.csv, large_chunk_demo.xlsx} 出题；预跑结果见 docs/excel-12题标准答卷.md</w:t>
             </w:r>
           </w:p>
         </w:tc>
       </w:tr>
       <w:tr>
         <w:tc>
-          <w:p>
-            <w:r>
-              <w:t xml:space="preserve">QwenPaw v2.0.0 旁路接入（不改内核）</w:t>
-            </w:r>
-          </w:p>
-        </w:tc>
-        <w:tc>
-          <w:p>
-            <w:r>
-              <w:t xml:space="preserve">✅ 已完成</w:t>
-            </w:r>
-          </w:p>
-        </w:tc>
-        <w:tc>
-          <w:p>
-            <w:r>
-              <w:t xml:space="preserve">poc/requirements.txt 已锁版本；QwenPaw v2.0.0；pytest 全绿 225；红线 2：所有改动在 poc/ 内，git diff QwenPaw/ 始终为空</w:t>
-            </w:r>
-          </w:p>
-        </w:tc>
-        <w:tc>
-          <w:p>
-            <w:r>
-              <w:t xml:space="preserve">git diff --stat QwenPaw/  # 期望 0 行变更</w:t>
+          <w:tcPr>
+            <w:tcW w:type="dxa" w:w="2256"/>
+          </w:tcPr>
+          <w:p>
+            <w:r/>
+            <w:r>
+              <w:rPr>
+                <w:sz w:val="18"/>
+              </w:rPr>
+              <w:t>QwenPaw v2.0.0 旁路接入（不改内核）</w:t>
+            </w:r>
+          </w:p>
+        </w:tc>
+        <w:tc>
+          <w:tcPr>
+            <w:tcW w:type="dxa" w:w="2256"/>
+          </w:tcPr>
+          <w:p>
+            <w:r/>
+            <w:r>
+              <w:rPr>
+                <w:sz w:val="18"/>
+              </w:rPr>
+              <w:t>✅ 已完成</w:t>
+            </w:r>
+          </w:p>
+        </w:tc>
+        <w:tc>
+          <w:tcPr>
+            <w:tcW w:type="dxa" w:w="2256"/>
+          </w:tcPr>
+          <w:p>
+            <w:r/>
+            <w:r>
+              <w:rPr>
+                <w:sz w:val="18"/>
+              </w:rPr>
+              <w:t>poc/requirements.txt 已锁版本；QwenPaw v2.0.0；pytest 全绿 225；红线 2：所有改动在 poc/ 内，git diff QwenPaw/ 始终为空</w:t>
+            </w:r>
+          </w:p>
+        </w:tc>
+        <w:tc>
+          <w:tcPr>
+            <w:tcW w:type="dxa" w:w="2256"/>
+          </w:tcPr>
+          <w:p>
+            <w:r/>
+            <w:r>
+              <w:rPr>
+                <w:sz w:val="18"/>
+              </w:rPr>
+              <w:t>git diff --stat QwenPaw/  # 期望 0 行变更</w:t>
             </w:r>
           </w:p>
         </w:tc>
@@ -13115,7 +13194,7 @@
           <w:lang w:val="en-GB"/>
         </w:rPr>
       </w:pPr>
-      <w:bookmarkStart w:name="_Toc24694" w:id="12"/>
+      <w:bookmarkStart w:id="12" w:name="_Toc24694"/>
       <w:r>
         <w:rPr>
           <w:rFonts w:hint="eastAsia" w:ascii="华文细黑" w:hAnsi="华文细黑" w:eastAsia="华文细黑" w:cstheme="majorBidi"/>
@@ -14290,32 +14369,23 @@
           <w:color w:val="C00000"/>
           <w:sz w:val="28"/>
         </w:rPr>
-        <w:t xml:space="preserve">【完成证明 · 3.1.2 MCP开发（用例 1-2）】</w:t>
+        <w:t>【完成证明 · 3.1.2 MCP开发（用例 1-2）】</w:t>
       </w:r>
     </w:p>
     <w:p>
-      <w:pPr/>
       <w:r>
         <w:rPr>
-          <w:b w:val="false"/>
+          <w:b w:val="0"/>
           <w:sz w:val="22"/>
         </w:rPr>
-        <w:t xml:space="preserve">用例 1-2（对应需求原文 §3.1.2 MCP开发）的完成证据与现场演示命令如下。仓库当前测试基线：pytest 225 passed, 1 skipped（基线 101 + 任务 A/B/C/D/E/F 新增 124）。本节直接挂在原评估指标表之后，便于评委按需求原顺序查阅。</w:t>
+        <w:t>用例 1-2（对应需求原文 §3.1.2 MCP开发）的完成证据与现场演示命令如下。仓库当前测试基线：pytest 225 passed, 1 skipped（基线 101 + 任务 A/B/C/D/E/F 新增 124）。本节直接挂在原评估指标表之后，便于评委按需求原顺序查阅。</w:t>
       </w:r>
     </w:p>
     <w:tbl>
       <w:tblPr>
-        <w:tblStyle w:val="25"/>
-        <w:tblW w:w="9075" w:type="dxa"/>
-        <w:tblBorders>
-          <w:top w:val="single" w:sz="4"/>
-          <w:left w:val="single" w:sz="4"/>
-          <w:bottom w:val="single" w:sz="4"/>
-          <w:right w:val="single" w:sz="4"/>
-          <w:insideH w:val="single" w:sz="4"/>
-          <w:insideV w:val="single" w:sz="4"/>
-        </w:tblBorders>
-        <w:tblLook w:val="04A0"/>
+        <w:tblStyle w:val="26"/>
+        <w:tblW w:type="auto" w:w="0"/>
+        <w:tblLook w:firstColumn="1" w:firstRow="1" w:lastColumn="0" w:lastRow="0" w:noHBand="0" w:noVBand="1" w:val="04A0"/>
       </w:tblPr>
       <w:tblGrid>
         <w:gridCol w:w="2256"/>
@@ -14325,90 +14395,178 @@
       </w:tblGrid>
       <w:tr>
         <w:tc>
-          <w:p>
-            <w:r>
-              <w:t xml:space="preserve">考察点</w:t>
-            </w:r>
-          </w:p>
-        </w:tc>
-        <w:tc>
-          <w:p>
-            <w:r>
-              <w:t xml:space="preserve">完成状态</w:t>
-            </w:r>
-          </w:p>
-        </w:tc>
-        <w:tc>
-          <w:p>
-            <w:r>
-              <w:t xml:space="preserve">证据（文件/行号）</w:t>
-            </w:r>
-          </w:p>
-        </w:tc>
-        <w:tc>
-          <w:p>
-            <w:r>
-              <w:t xml:space="preserve">演示命令</w:t>
+          <w:tcPr>
+            <w:tcW w:type="dxa" w:w="2256"/>
+          </w:tcPr>
+          <w:p>
+            <w:r/>
+            <w:r>
+              <w:rPr>
+                <w:b/>
+                <w:sz w:val="18"/>
+              </w:rPr>
+              <w:t>考察点</w:t>
+            </w:r>
+          </w:p>
+        </w:tc>
+        <w:tc>
+          <w:tcPr>
+            <w:tcW w:type="dxa" w:w="2256"/>
+          </w:tcPr>
+          <w:p>
+            <w:r/>
+            <w:r>
+              <w:rPr>
+                <w:b/>
+                <w:sz w:val="18"/>
+              </w:rPr>
+              <w:t>完成状态</w:t>
+            </w:r>
+          </w:p>
+        </w:tc>
+        <w:tc>
+          <w:tcPr>
+            <w:tcW w:type="dxa" w:w="2256"/>
+          </w:tcPr>
+          <w:p>
+            <w:r/>
+            <w:r>
+              <w:rPr>
+                <w:b/>
+                <w:sz w:val="18"/>
+              </w:rPr>
+              <w:t>证据（文件/行号）</w:t>
+            </w:r>
+          </w:p>
+        </w:tc>
+        <w:tc>
+          <w:tcPr>
+            <w:tcW w:type="dxa" w:w="2256"/>
+          </w:tcPr>
+          <w:p>
+            <w:r/>
+            <w:r>
+              <w:rPr>
+                <w:b/>
+                <w:sz w:val="18"/>
+              </w:rPr>
+              <w:t>演示命令</w:t>
             </w:r>
           </w:p>
         </w:tc>
       </w:tr>
       <w:tr>
         <w:tc>
-          <w:p>
-            <w:r>
-              <w:t xml:space="preserve">文件损坏 / 编码识别 / 超大文件分块三类异常</w:t>
-            </w:r>
-          </w:p>
-        </w:tc>
-        <w:tc>
-          <w:p>
-            <w:r>
-              <w:t xml:space="preserve">✅ 已完成（任务 A/B）</w:t>
-            </w:r>
-          </w:p>
-        </w:tc>
-        <w:tc>
-          <w:p>
-            <w:r>
-              <w:t xml:space="preserve">poc/excel_guard_mcp/{guards.py, server.py}（3 工具）；poc/tests/test_chunk_csv.py；poc/tests/test_security_regressions.py（攻击向量回归）</w:t>
-            </w:r>
-          </w:p>
-        </w:tc>
-        <w:tc>
-          <w:p>
-            <w:r>
-              <w:t xml:space="preserve">python scripts/mcp_stdio_smoke.py  # 3 工具全注册 + stdio 握手；构造 symlink 与 POC_WORKSPACE=/ 攻击向量验证 fail-closed</w:t>
+          <w:tcPr>
+            <w:tcW w:type="dxa" w:w="2256"/>
+          </w:tcPr>
+          <w:p>
+            <w:r/>
+            <w:r>
+              <w:rPr>
+                <w:sz w:val="18"/>
+              </w:rPr>
+              <w:t>文件损坏 / 编码识别 / 超大文件分块三类异常</w:t>
+            </w:r>
+          </w:p>
+        </w:tc>
+        <w:tc>
+          <w:tcPr>
+            <w:tcW w:type="dxa" w:w="2256"/>
+          </w:tcPr>
+          <w:p>
+            <w:r/>
+            <w:r>
+              <w:rPr>
+                <w:sz w:val="18"/>
+              </w:rPr>
+              <w:t>✅ 已完成（任务 A/B）</w:t>
+            </w:r>
+          </w:p>
+        </w:tc>
+        <w:tc>
+          <w:tcPr>
+            <w:tcW w:type="dxa" w:w="2256"/>
+          </w:tcPr>
+          <w:p>
+            <w:r/>
+            <w:r>
+              <w:rPr>
+                <w:sz w:val="18"/>
+              </w:rPr>
+              <w:t>poc/excel_guard_mcp/{guards.py, server.py}（3 工具）；poc/tests/test_chunk_csv.py；poc/tests/test_security_regressions.py（攻击向量回归）</w:t>
+            </w:r>
+          </w:p>
+        </w:tc>
+        <w:tc>
+          <w:tcPr>
+            <w:tcW w:type="dxa" w:w="2256"/>
+          </w:tcPr>
+          <w:p>
+            <w:r/>
+            <w:r>
+              <w:rPr>
+                <w:sz w:val="18"/>
+              </w:rPr>
+              <w:t>python scripts/mcp_stdio_smoke.py  # 3 工具全注册 + stdio 握手；构造 symlink 与 POC_WORKSPACE=/ 攻击向量验证 fail-closed</w:t>
             </w:r>
           </w:p>
         </w:tc>
       </w:tr>
       <w:tr>
         <w:tc>
-          <w:p>
-            <w:r>
-              <w:t xml:space="preserve">QwenPaw v2.0.0 旁路接入（不改内核）</w:t>
-            </w:r>
-          </w:p>
-        </w:tc>
-        <w:tc>
-          <w:p>
-            <w:r>
-              <w:t xml:space="preserve">✅ 已完成</w:t>
-            </w:r>
-          </w:p>
-        </w:tc>
-        <w:tc>
-          <w:p>
-            <w:r>
-              <w:t xml:space="preserve">poc/requirements.txt 已锁版本；QwenPaw v2.0.0；pytest 全绿 225；红线 2：所有改动在 poc/ 内，git diff QwenPaw/ 始终为空</w:t>
-            </w:r>
-          </w:p>
-        </w:tc>
-        <w:tc>
-          <w:p>
-            <w:r>
-              <w:t xml:space="preserve">git diff --stat QwenPaw/  # 期望 0 行变更</w:t>
+          <w:tcPr>
+            <w:tcW w:type="dxa" w:w="2256"/>
+          </w:tcPr>
+          <w:p>
+            <w:r/>
+            <w:r>
+              <w:rPr>
+                <w:sz w:val="18"/>
+              </w:rPr>
+              <w:t>QwenPaw v2.0.0 旁路接入（不改内核）</w:t>
+            </w:r>
+          </w:p>
+        </w:tc>
+        <w:tc>
+          <w:tcPr>
+            <w:tcW w:type="dxa" w:w="2256"/>
+          </w:tcPr>
+          <w:p>
+            <w:r/>
+            <w:r>
+              <w:rPr>
+                <w:sz w:val="18"/>
+              </w:rPr>
+              <w:t>✅ 已完成</w:t>
+            </w:r>
+          </w:p>
+        </w:tc>
+        <w:tc>
+          <w:tcPr>
+            <w:tcW w:type="dxa" w:w="2256"/>
+          </w:tcPr>
+          <w:p>
+            <w:r/>
+            <w:r>
+              <w:rPr>
+                <w:sz w:val="18"/>
+              </w:rPr>
+              <w:t>poc/requirements.txt 已锁版本；QwenPaw v2.0.0；pytest 全绿 225；红线 2：所有改动在 poc/ 内，git diff QwenPaw/ 始终为空</w:t>
+            </w:r>
+          </w:p>
+        </w:tc>
+        <w:tc>
+          <w:tcPr>
+            <w:tcW w:type="dxa" w:w="2256"/>
+          </w:tcPr>
+          <w:p>
+            <w:r/>
+            <w:r>
+              <w:rPr>
+                <w:sz w:val="18"/>
+              </w:rPr>
+              <w:t>git diff --stat QwenPaw/  # 期望 0 行变更</w:t>
             </w:r>
           </w:p>
         </w:tc>
@@ -14438,7 +14596,7 @@
           <w:lang w:val="en-GB"/>
         </w:rPr>
       </w:pPr>
-      <w:bookmarkStart w:name="_Toc12279" w:id="13"/>
+      <w:bookmarkStart w:id="13" w:name="_Toc12279"/>
       <w:r>
         <w:rPr>
           <w:rFonts w:hint="eastAsia" w:ascii="华文细黑" w:hAnsi="华文细黑" w:eastAsia="华文细黑" w:cstheme="majorBidi"/>
@@ -15590,32 +15748,23 @@
           <w:color w:val="C00000"/>
           <w:sz w:val="28"/>
         </w:rPr>
-        <w:t xml:space="preserve">【完成证明 · 3.1.3 SKILL 开发（用例 1-3）】</w:t>
+        <w:t>【完成证明 · 3.1.3 SKILL 开发（用例 1-3）】</w:t>
       </w:r>
     </w:p>
     <w:p>
-      <w:pPr/>
       <w:r>
         <w:rPr>
-          <w:b w:val="false"/>
+          <w:b w:val="0"/>
           <w:sz w:val="22"/>
         </w:rPr>
-        <w:t xml:space="preserve">用例 1-3（对应需求原文 §3.1.3 SKILL 开发）的完成证据与现场演示命令如下。仓库当前测试基线：pytest 225 passed, 1 skipped（基线 101 + 任务 A/B/C/D/E/F 新增 124）。本节直接挂在原评估指标表之后，便于评委按需求原顺序查阅。</w:t>
+        <w:t>用例 1-3（对应需求原文 §3.1.3 SKILL 开发）的完成证据与现场演示命令如下。仓库当前测试基线：pytest 225 passed, 1 skipped（基线 101 + 任务 A/B/C/D/E/F 新增 124）。本节直接挂在原评估指标表之后，便于评委按需求原顺序查阅。</w:t>
       </w:r>
     </w:p>
     <w:tbl>
       <w:tblPr>
-        <w:tblStyle w:val="25"/>
-        <w:tblW w:w="9075" w:type="dxa"/>
-        <w:tblBorders>
-          <w:top w:val="single" w:sz="4"/>
-          <w:left w:val="single" w:sz="4"/>
-          <w:bottom w:val="single" w:sz="4"/>
-          <w:right w:val="single" w:sz="4"/>
-          <w:insideH w:val="single" w:sz="4"/>
-          <w:insideV w:val="single" w:sz="4"/>
-        </w:tblBorders>
-        <w:tblLook w:val="04A0"/>
+        <w:tblStyle w:val="26"/>
+        <w:tblW w:type="auto" w:w="0"/>
+        <w:tblLook w:firstColumn="1" w:firstRow="1" w:lastColumn="0" w:lastRow="0" w:noHBand="0" w:noVBand="1" w:val="04A0"/>
       </w:tblPr>
       <w:tblGrid>
         <w:gridCol w:w="2256"/>
@@ -15625,90 +15774,178 @@
       </w:tblGrid>
       <w:tr>
         <w:tc>
-          <w:p>
-            <w:r>
-              <w:t xml:space="preserve">考察点</w:t>
-            </w:r>
-          </w:p>
-        </w:tc>
-        <w:tc>
-          <w:p>
-            <w:r>
-              <w:t xml:space="preserve">完成状态</w:t>
-            </w:r>
-          </w:p>
-        </w:tc>
-        <w:tc>
-          <w:p>
-            <w:r>
-              <w:t xml:space="preserve">证据（文件/行号）</w:t>
-            </w:r>
-          </w:p>
-        </w:tc>
-        <w:tc>
-          <w:p>
-            <w:r>
-              <w:t xml:space="preserve">演示命令</w:t>
+          <w:tcPr>
+            <w:tcW w:type="dxa" w:w="2256"/>
+          </w:tcPr>
+          <w:p>
+            <w:r/>
+            <w:r>
+              <w:rPr>
+                <w:b/>
+                <w:sz w:val="18"/>
+              </w:rPr>
+              <w:t>考察点</w:t>
+            </w:r>
+          </w:p>
+        </w:tc>
+        <w:tc>
+          <w:tcPr>
+            <w:tcW w:type="dxa" w:w="2256"/>
+          </w:tcPr>
+          <w:p>
+            <w:r/>
+            <w:r>
+              <w:rPr>
+                <w:b/>
+                <w:sz w:val="18"/>
+              </w:rPr>
+              <w:t>完成状态</w:t>
+            </w:r>
+          </w:p>
+        </w:tc>
+        <w:tc>
+          <w:tcPr>
+            <w:tcW w:type="dxa" w:w="2256"/>
+          </w:tcPr>
+          <w:p>
+            <w:r/>
+            <w:r>
+              <w:rPr>
+                <w:b/>
+                <w:sz w:val="18"/>
+              </w:rPr>
+              <w:t>证据（文件/行号）</w:t>
+            </w:r>
+          </w:p>
+        </w:tc>
+        <w:tc>
+          <w:tcPr>
+            <w:tcW w:type="dxa" w:w="2256"/>
+          </w:tcPr>
+          <w:p>
+            <w:r/>
+            <w:r>
+              <w:rPr>
+                <w:b/>
+                <w:sz w:val="18"/>
+              </w:rPr>
+              <w:t>演示命令</w:t>
             </w:r>
           </w:p>
         </w:tc>
       </w:tr>
       <w:tr>
         <w:tc>
-          <w:p>
-            <w:r>
-              <w:t xml:space="preserve">SKILL 五要素（名称/描述/触发词/参数/返回值/边界）</w:t>
-            </w:r>
-          </w:p>
-        </w:tc>
-        <w:tc>
-          <w:p>
-            <w:r>
-              <w:t xml:space="preserve">✅ 已完成（任务 E）</w:t>
-            </w:r>
-          </w:p>
-        </w:tc>
-        <w:tc>
-          <w:p>
-            <w:r>
-              <w:t xml:space="preserve">poc/skills/{excel-qa-bank, report-visualizer, ops-assistant}/SKILL.md；poc/tests/test_skill_doc.py 强制四段存在</w:t>
-            </w:r>
-          </w:p>
-        </w:tc>
-        <w:tc>
-          <w:p>
-            <w:r>
-              <w:t xml:space="preserve">在 Console 工作区挂载 skill_paths 后，从技能池下发 SKILL.md 到目标智能体；pytest poc/tests/test_skill_doc.py -v 自动验证</w:t>
+          <w:tcPr>
+            <w:tcW w:type="dxa" w:w="2256"/>
+          </w:tcPr>
+          <w:p>
+            <w:r/>
+            <w:r>
+              <w:rPr>
+                <w:sz w:val="18"/>
+              </w:rPr>
+              <w:t>SKILL 五要素（名称/描述/触发词/参数/返回值/边界）</w:t>
+            </w:r>
+          </w:p>
+        </w:tc>
+        <w:tc>
+          <w:tcPr>
+            <w:tcW w:type="dxa" w:w="2256"/>
+          </w:tcPr>
+          <w:p>
+            <w:r/>
+            <w:r>
+              <w:rPr>
+                <w:sz w:val="18"/>
+              </w:rPr>
+              <w:t>✅ 已完成（任务 E）</w:t>
+            </w:r>
+          </w:p>
+        </w:tc>
+        <w:tc>
+          <w:tcPr>
+            <w:tcW w:type="dxa" w:w="2256"/>
+          </w:tcPr>
+          <w:p>
+            <w:r/>
+            <w:r>
+              <w:rPr>
+                <w:sz w:val="18"/>
+              </w:rPr>
+              <w:t>poc/skills/{excel-qa-bank, report-visualizer, ops-assistant}/SKILL.md；poc/tests/test_skill_doc.py 强制四段存在</w:t>
+            </w:r>
+          </w:p>
+        </w:tc>
+        <w:tc>
+          <w:tcPr>
+            <w:tcW w:type="dxa" w:w="2256"/>
+          </w:tcPr>
+          <w:p>
+            <w:r/>
+            <w:r>
+              <w:rPr>
+                <w:sz w:val="18"/>
+              </w:rPr>
+              <w:t>在 Console 工作区挂载 skill_paths 后，从技能池下发 SKILL.md 到目标智能体；pytest poc/tests/test_skill_doc.py -v 自动验证</w:t>
             </w:r>
           </w:p>
         </w:tc>
       </w:tr>
       <w:tr>
         <w:tc>
-          <w:p>
-            <w:r>
-              <w:t xml:space="preserve">QwenPaw v2.0.0 旁路接入（不改内核）</w:t>
-            </w:r>
-          </w:p>
-        </w:tc>
-        <w:tc>
-          <w:p>
-            <w:r>
-              <w:t xml:space="preserve">✅ 已完成</w:t>
-            </w:r>
-          </w:p>
-        </w:tc>
-        <w:tc>
-          <w:p>
-            <w:r>
-              <w:t xml:space="preserve">poc/requirements.txt 已锁版本；QwenPaw v2.0.0；pytest 全绿 225；红线 2：所有改动在 poc/ 内，git diff QwenPaw/ 始终为空</w:t>
-            </w:r>
-          </w:p>
-        </w:tc>
-        <w:tc>
-          <w:p>
-            <w:r>
-              <w:t xml:space="preserve">git diff --stat QwenPaw/  # 期望 0 行变更</w:t>
+          <w:tcPr>
+            <w:tcW w:type="dxa" w:w="2256"/>
+          </w:tcPr>
+          <w:p>
+            <w:r/>
+            <w:r>
+              <w:rPr>
+                <w:sz w:val="18"/>
+              </w:rPr>
+              <w:t>QwenPaw v2.0.0 旁路接入（不改内核）</w:t>
+            </w:r>
+          </w:p>
+        </w:tc>
+        <w:tc>
+          <w:tcPr>
+            <w:tcW w:type="dxa" w:w="2256"/>
+          </w:tcPr>
+          <w:p>
+            <w:r/>
+            <w:r>
+              <w:rPr>
+                <w:sz w:val="18"/>
+              </w:rPr>
+              <w:t>✅ 已完成</w:t>
+            </w:r>
+          </w:p>
+        </w:tc>
+        <w:tc>
+          <w:tcPr>
+            <w:tcW w:type="dxa" w:w="2256"/>
+          </w:tcPr>
+          <w:p>
+            <w:r/>
+            <w:r>
+              <w:rPr>
+                <w:sz w:val="18"/>
+              </w:rPr>
+              <w:t>poc/requirements.txt 已锁版本；QwenPaw v2.0.0；pytest 全绿 225；红线 2：所有改动在 poc/ 内，git diff QwenPaw/ 始终为空</w:t>
+            </w:r>
+          </w:p>
+        </w:tc>
+        <w:tc>
+          <w:tcPr>
+            <w:tcW w:type="dxa" w:w="2256"/>
+          </w:tcPr>
+          <w:p>
+            <w:r/>
+            <w:r>
+              <w:rPr>
+                <w:sz w:val="18"/>
+              </w:rPr>
+              <w:t>git diff --stat QwenPaw/  # 期望 0 行变更</w:t>
             </w:r>
           </w:p>
         </w:tc>
@@ -15741,7 +15978,7 @@
           <w:highlight w:val="none"/>
         </w:rPr>
       </w:pPr>
-      <w:bookmarkStart w:name="_Toc18083" w:id="14"/>
+      <w:bookmarkStart w:id="14" w:name="_Toc18083"/>
       <w:r>
         <w:rPr>
           <w:rFonts w:hint="eastAsia" w:ascii="华文细黑" w:hAnsi="华文细黑" w:eastAsia="华文细黑"/>
@@ -15770,7 +16007,7 @@
           <w:szCs w:val="24"/>
         </w:rPr>
       </w:pPr>
-      <w:bookmarkStart w:name="_Toc28420" w:id="15"/>
+      <w:bookmarkStart w:id="15" w:name="_Toc28420"/>
       <w:r>
         <w:rPr>
           <w:rFonts w:hint="eastAsia" w:ascii="华文细黑" w:hAnsi="华文细黑" w:eastAsia="华文细黑" w:cstheme="majorBidi"/>
@@ -16967,32 +17204,23 @@
           <w:color w:val="C00000"/>
           <w:sz w:val="28"/>
         </w:rPr>
-        <w:t xml:space="preserve">【完成证明 · 3.2.1 知识库构建（用例 2-1）】</w:t>
+        <w:t>【完成证明 · 3.2.1 知识库构建（用例 2-1）】</w:t>
       </w:r>
     </w:p>
     <w:p>
-      <w:pPr/>
       <w:r>
         <w:rPr>
-          <w:b w:val="false"/>
+          <w:b w:val="0"/>
           <w:sz w:val="22"/>
         </w:rPr>
-        <w:t xml:space="preserve">用例 2-1（对应需求原文 §3.2.1 知识库构建）的完成证据与现场演示命令如下。仓库当前测试基线：pytest 225 passed, 1 skipped（基线 101 + 任务 A/B/C/D/E/F 新增 124）。本节直接挂在原评估指标表之后，便于评委按需求原顺序查阅。</w:t>
+        <w:t>用例 2-1（对应需求原文 §3.2.1 知识库构建）的完成证据与现场演示命令如下。仓库当前测试基线：pytest 225 passed, 1 skipped（基线 101 + 任务 A/B/C/D/E/F 新增 124）。本节直接挂在原评估指标表之后，便于评委按需求原顺序查阅。</w:t>
       </w:r>
     </w:p>
     <w:tbl>
       <w:tblPr>
-        <w:tblStyle w:val="25"/>
-        <w:tblW w:w="9075" w:type="dxa"/>
-        <w:tblBorders>
-          <w:top w:val="single" w:sz="4"/>
-          <w:left w:val="single" w:sz="4"/>
-          <w:bottom w:val="single" w:sz="4"/>
-          <w:right w:val="single" w:sz="4"/>
-          <w:insideH w:val="single" w:sz="4"/>
-          <w:insideV w:val="single" w:sz="4"/>
-        </w:tblBorders>
-        <w:tblLook w:val="04A0"/>
+        <w:tblStyle w:val="26"/>
+        <w:tblW w:type="auto" w:w="0"/>
+        <w:tblLook w:firstColumn="1" w:firstRow="1" w:lastColumn="0" w:lastRow="0" w:noHBand="0" w:noVBand="1" w:val="04A0"/>
       </w:tblPr>
       <w:tblGrid>
         <w:gridCol w:w="2256"/>
@@ -17002,90 +17230,178 @@
       </w:tblGrid>
       <w:tr>
         <w:tc>
-          <w:p>
-            <w:r>
-              <w:t xml:space="preserve">考察点</w:t>
-            </w:r>
-          </w:p>
-        </w:tc>
-        <w:tc>
-          <w:p>
-            <w:r>
-              <w:t xml:space="preserve">完成状态</w:t>
-            </w:r>
-          </w:p>
-        </w:tc>
-        <w:tc>
-          <w:p>
-            <w:r>
-              <w:t xml:space="preserve">证据（文件/行号）</w:t>
-            </w:r>
-          </w:p>
-        </w:tc>
-        <w:tc>
-          <w:p>
-            <w:r>
-              <w:t xml:space="preserve">演示命令</w:t>
+          <w:tcPr>
+            <w:tcW w:type="dxa" w:w="2256"/>
+          </w:tcPr>
+          <w:p>
+            <w:r/>
+            <w:r>
+              <w:rPr>
+                <w:b/>
+                <w:sz w:val="18"/>
+              </w:rPr>
+              <w:t>考察点</w:t>
+            </w:r>
+          </w:p>
+        </w:tc>
+        <w:tc>
+          <w:tcPr>
+            <w:tcW w:type="dxa" w:w="2256"/>
+          </w:tcPr>
+          <w:p>
+            <w:r/>
+            <w:r>
+              <w:rPr>
+                <w:b/>
+                <w:sz w:val="18"/>
+              </w:rPr>
+              <w:t>完成状态</w:t>
+            </w:r>
+          </w:p>
+        </w:tc>
+        <w:tc>
+          <w:tcPr>
+            <w:tcW w:type="dxa" w:w="2256"/>
+          </w:tcPr>
+          <w:p>
+            <w:r/>
+            <w:r>
+              <w:rPr>
+                <w:b/>
+                <w:sz w:val="18"/>
+              </w:rPr>
+              <w:t>证据（文件/行号）</w:t>
+            </w:r>
+          </w:p>
+        </w:tc>
+        <w:tc>
+          <w:tcPr>
+            <w:tcW w:type="dxa" w:w="2256"/>
+          </w:tcPr>
+          <w:p>
+            <w:r/>
+            <w:r>
+              <w:rPr>
+                <w:b/>
+                <w:sz w:val="18"/>
+              </w:rPr>
+              <w:t>演示命令</w:t>
             </w:r>
           </w:p>
         </w:tc>
       </w:tr>
       <w:tr>
         <w:tc>
-          <w:p>
-            <w:r>
-              <w:t xml:space="preserve">ES / MySQL / GALASYBASE / MinerU 知识库搭建</w:t>
-            </w:r>
-          </w:p>
-        </w:tc>
-        <w:tc>
-          <w:p>
-            <w:r>
-              <w:t xml:space="preserve">⚠️ 被外部阻塞（任务 G）</w:t>
-            </w:r>
-          </w:p>
-        </w:tc>
-        <w:tc>
-          <w:p>
-            <w:r>
-              <w:t xml:space="preserve">docs/AI待办交接清单.md §三 G 章节；需求文档 §2.2 已确认端点规格（ES + MySQL + GALASYBASE + MinerU2.5-Pro-2604-1.2B + Qwen3-Embedding-8B + Qwen3-Reranker-0.6B）</w:t>
-            </w:r>
-          </w:p>
-        </w:tc>
-        <w:tc>
-          <w:p>
-            <w:r>
-              <w:t xml:space="preserve">依赖行方提供端点后才可演示；接口契约已写入 docs/HANDOFF.md §5</w:t>
+          <w:tcPr>
+            <w:tcW w:type="dxa" w:w="2256"/>
+          </w:tcPr>
+          <w:p>
+            <w:r/>
+            <w:r>
+              <w:rPr>
+                <w:sz w:val="18"/>
+              </w:rPr>
+              <w:t>ES / MySQL / GALASYBASE / MinerU 知识库搭建</w:t>
+            </w:r>
+          </w:p>
+        </w:tc>
+        <w:tc>
+          <w:tcPr>
+            <w:tcW w:type="dxa" w:w="2256"/>
+          </w:tcPr>
+          <w:p>
+            <w:r/>
+            <w:r>
+              <w:rPr>
+                <w:sz w:val="18"/>
+              </w:rPr>
+              <w:t>⚠️ 被外部阻塞（任务 G）</w:t>
+            </w:r>
+          </w:p>
+        </w:tc>
+        <w:tc>
+          <w:tcPr>
+            <w:tcW w:type="dxa" w:w="2256"/>
+          </w:tcPr>
+          <w:p>
+            <w:r/>
+            <w:r>
+              <w:rPr>
+                <w:sz w:val="18"/>
+              </w:rPr>
+              <w:t>docs/AI待办交接清单.md §三 G 章节；需求文档 §2.2 已确认端点规格（ES + MySQL + GALASYBASE + MinerU2.5-Pro-2604-1.2B + Qwen3-Embedding-8B + Qwen3-Reranker-0.6B）</w:t>
+            </w:r>
+          </w:p>
+        </w:tc>
+        <w:tc>
+          <w:tcPr>
+            <w:tcW w:type="dxa" w:w="2256"/>
+          </w:tcPr>
+          <w:p>
+            <w:r/>
+            <w:r>
+              <w:rPr>
+                <w:sz w:val="18"/>
+              </w:rPr>
+              <w:t>依赖行方提供端点后才可演示；接口契约已写入 docs/HANDOFF.md §5</w:t>
             </w:r>
           </w:p>
         </w:tc>
       </w:tr>
       <w:tr>
         <w:tc>
-          <w:p>
-            <w:r>
-              <w:t xml:space="preserve">QwenPaw v2.0.0 旁路接入（不改内核）</w:t>
-            </w:r>
-          </w:p>
-        </w:tc>
-        <w:tc>
-          <w:p>
-            <w:r>
-              <w:t xml:space="preserve">✅ 已完成</w:t>
-            </w:r>
-          </w:p>
-        </w:tc>
-        <w:tc>
-          <w:p>
-            <w:r>
-              <w:t xml:space="preserve">poc/requirements.txt 已锁版本；QwenPaw v2.0.0；pytest 全绿 225；红线 2：所有改动在 poc/ 内，git diff QwenPaw/ 始终为空</w:t>
-            </w:r>
-          </w:p>
-        </w:tc>
-        <w:tc>
-          <w:p>
-            <w:r>
-              <w:t xml:space="preserve">git diff --stat QwenPaw/  # 期望 0 行变更</w:t>
+          <w:tcPr>
+            <w:tcW w:type="dxa" w:w="2256"/>
+          </w:tcPr>
+          <w:p>
+            <w:r/>
+            <w:r>
+              <w:rPr>
+                <w:sz w:val="18"/>
+              </w:rPr>
+              <w:t>QwenPaw v2.0.0 旁路接入（不改内核）</w:t>
+            </w:r>
+          </w:p>
+        </w:tc>
+        <w:tc>
+          <w:tcPr>
+            <w:tcW w:type="dxa" w:w="2256"/>
+          </w:tcPr>
+          <w:p>
+            <w:r/>
+            <w:r>
+              <w:rPr>
+                <w:sz w:val="18"/>
+              </w:rPr>
+              <w:t>✅ 已完成</w:t>
+            </w:r>
+          </w:p>
+        </w:tc>
+        <w:tc>
+          <w:tcPr>
+            <w:tcW w:type="dxa" w:w="2256"/>
+          </w:tcPr>
+          <w:p>
+            <w:r/>
+            <w:r>
+              <w:rPr>
+                <w:sz w:val="18"/>
+              </w:rPr>
+              <w:t>poc/requirements.txt 已锁版本；QwenPaw v2.0.0；pytest 全绿 225；红线 2：所有改动在 poc/ 内，git diff QwenPaw/ 始终为空</w:t>
+            </w:r>
+          </w:p>
+        </w:tc>
+        <w:tc>
+          <w:tcPr>
+            <w:tcW w:type="dxa" w:w="2256"/>
+          </w:tcPr>
+          <w:p>
+            <w:r/>
+            <w:r>
+              <w:rPr>
+                <w:sz w:val="18"/>
+              </w:rPr>
+              <w:t>git diff --stat QwenPaw/  # 期望 0 行变更</w:t>
             </w:r>
           </w:p>
         </w:tc>
@@ -17118,7 +17434,7 @@
           <w:szCs w:val="24"/>
         </w:rPr>
       </w:pPr>
-      <w:bookmarkStart w:name="_Toc31971" w:id="16"/>
+      <w:bookmarkStart w:id="16" w:name="_Toc31971"/>
       <w:r>
         <w:rPr>
           <w:rFonts w:hint="eastAsia" w:ascii="华文细黑" w:hAnsi="华文细黑" w:eastAsia="华文细黑" w:cstheme="majorBidi"/>
@@ -18303,32 +18619,23 @@
           <w:color w:val="C00000"/>
           <w:sz w:val="28"/>
         </w:rPr>
-        <w:t xml:space="preserve">【完成证明 · 3.2.2 知识检索和召回（用例 2-2）】</w:t>
+        <w:t>【完成证明 · 3.2.2 知识检索和召回（用例 2-2）】</w:t>
       </w:r>
     </w:p>
     <w:p>
-      <w:pPr/>
       <w:r>
         <w:rPr>
-          <w:b w:val="false"/>
+          <w:b w:val="0"/>
           <w:sz w:val="22"/>
         </w:rPr>
-        <w:t xml:space="preserve">用例 2-2（对应需求原文 §3.2.2 知识检索和召回）的完成证据与现场演示命令如下。仓库当前测试基线：pytest 225 passed, 1 skipped（基线 101 + 任务 A/B/C/D/E/F 新增 124）。本节直接挂在原评估指标表之后，便于评委按需求原顺序查阅。</w:t>
+        <w:t>用例 2-2（对应需求原文 §3.2.2 知识检索和召回）的完成证据与现场演示命令如下。仓库当前测试基线：pytest 225 passed, 1 skipped（基线 101 + 任务 A/B/C/D/E/F 新增 124）。本节直接挂在原评估指标表之后，便于评委按需求原顺序查阅。</w:t>
       </w:r>
     </w:p>
     <w:tbl>
       <w:tblPr>
-        <w:tblStyle w:val="25"/>
-        <w:tblW w:w="9075" w:type="dxa"/>
-        <w:tblBorders>
-          <w:top w:val="single" w:sz="4"/>
-          <w:left w:val="single" w:sz="4"/>
-          <w:bottom w:val="single" w:sz="4"/>
-          <w:right w:val="single" w:sz="4"/>
-          <w:insideH w:val="single" w:sz="4"/>
-          <w:insideV w:val="single" w:sz="4"/>
-        </w:tblBorders>
-        <w:tblLook w:val="04A0"/>
+        <w:tblStyle w:val="26"/>
+        <w:tblW w:type="auto" w:w="0"/>
+        <w:tblLook w:firstColumn="1" w:firstRow="1" w:lastColumn="0" w:lastRow="0" w:noHBand="0" w:noVBand="1" w:val="04A0"/>
       </w:tblPr>
       <w:tblGrid>
         <w:gridCol w:w="2256"/>
@@ -18338,90 +18645,178 @@
       </w:tblGrid>
       <w:tr>
         <w:tc>
-          <w:p>
-            <w:r>
-              <w:t xml:space="preserve">考察点</w:t>
-            </w:r>
-          </w:p>
-        </w:tc>
-        <w:tc>
-          <w:p>
-            <w:r>
-              <w:t xml:space="preserve">完成状态</w:t>
-            </w:r>
-          </w:p>
-        </w:tc>
-        <w:tc>
-          <w:p>
-            <w:r>
-              <w:t xml:space="preserve">证据（文件/行号）</w:t>
-            </w:r>
-          </w:p>
-        </w:tc>
-        <w:tc>
-          <w:p>
-            <w:r>
-              <w:t xml:space="preserve">演示命令</w:t>
+          <w:tcPr>
+            <w:tcW w:type="dxa" w:w="2256"/>
+          </w:tcPr>
+          <w:p>
+            <w:r/>
+            <w:r>
+              <w:rPr>
+                <w:b/>
+                <w:sz w:val="18"/>
+              </w:rPr>
+              <w:t>考察点</w:t>
+            </w:r>
+          </w:p>
+        </w:tc>
+        <w:tc>
+          <w:tcPr>
+            <w:tcW w:type="dxa" w:w="2256"/>
+          </w:tcPr>
+          <w:p>
+            <w:r/>
+            <w:r>
+              <w:rPr>
+                <w:b/>
+                <w:sz w:val="18"/>
+              </w:rPr>
+              <w:t>完成状态</w:t>
+            </w:r>
+          </w:p>
+        </w:tc>
+        <w:tc>
+          <w:tcPr>
+            <w:tcW w:type="dxa" w:w="2256"/>
+          </w:tcPr>
+          <w:p>
+            <w:r/>
+            <w:r>
+              <w:rPr>
+                <w:b/>
+                <w:sz w:val="18"/>
+              </w:rPr>
+              <w:t>证据（文件/行号）</w:t>
+            </w:r>
+          </w:p>
+        </w:tc>
+        <w:tc>
+          <w:tcPr>
+            <w:tcW w:type="dxa" w:w="2256"/>
+          </w:tcPr>
+          <w:p>
+            <w:r/>
+            <w:r>
+              <w:rPr>
+                <w:b/>
+                <w:sz w:val="18"/>
+              </w:rPr>
+              <w:t>演示命令</w:t>
             </w:r>
           </w:p>
         </w:tc>
       </w:tr>
       <w:tr>
         <w:tc>
-          <w:p>
-            <w:r>
-              <w:t xml:space="preserve">知识召回与多轮问答</w:t>
-            </w:r>
-          </w:p>
-        </w:tc>
-        <w:tc>
-          <w:p>
-            <w:r>
-              <w:t xml:space="preserve">⚠️ 被外部阻塞（任务 G）</w:t>
-            </w:r>
-          </w:p>
-        </w:tc>
-        <w:tc>
-          <w:p>
-            <w:r>
-              <w:t xml:space="preserve">同上；可复用 RemeLightMemoryManager 框架（docs/harness/02-long-term-memory.md 已讲清架构）</w:t>
-            </w:r>
-          </w:p>
-        </w:tc>
-        <w:tc>
-          <w:p>
-            <w:r>
-              <w:t xml:space="preserve">等任务 G 端点接入后即可演示；本地已有框架调研文档</w:t>
+          <w:tcPr>
+            <w:tcW w:type="dxa" w:w="2256"/>
+          </w:tcPr>
+          <w:p>
+            <w:r/>
+            <w:r>
+              <w:rPr>
+                <w:sz w:val="18"/>
+              </w:rPr>
+              <w:t>知识召回与多轮问答</w:t>
+            </w:r>
+          </w:p>
+        </w:tc>
+        <w:tc>
+          <w:tcPr>
+            <w:tcW w:type="dxa" w:w="2256"/>
+          </w:tcPr>
+          <w:p>
+            <w:r/>
+            <w:r>
+              <w:rPr>
+                <w:sz w:val="18"/>
+              </w:rPr>
+              <w:t>⚠️ 被外部阻塞（任务 G）</w:t>
+            </w:r>
+          </w:p>
+        </w:tc>
+        <w:tc>
+          <w:tcPr>
+            <w:tcW w:type="dxa" w:w="2256"/>
+          </w:tcPr>
+          <w:p>
+            <w:r/>
+            <w:r>
+              <w:rPr>
+                <w:sz w:val="18"/>
+              </w:rPr>
+              <w:t>同上；可复用 RemeLightMemoryManager 框架（docs/harness/02-long-term-memory.md 已讲清架构）</w:t>
+            </w:r>
+          </w:p>
+        </w:tc>
+        <w:tc>
+          <w:tcPr>
+            <w:tcW w:type="dxa" w:w="2256"/>
+          </w:tcPr>
+          <w:p>
+            <w:r/>
+            <w:r>
+              <w:rPr>
+                <w:sz w:val="18"/>
+              </w:rPr>
+              <w:t>等任务 G 端点接入后即可演示；本地已有框架调研文档</w:t>
             </w:r>
           </w:p>
         </w:tc>
       </w:tr>
       <w:tr>
         <w:tc>
-          <w:p>
-            <w:r>
-              <w:t xml:space="preserve">QwenPaw v2.0.0 旁路接入（不改内核）</w:t>
-            </w:r>
-          </w:p>
-        </w:tc>
-        <w:tc>
-          <w:p>
-            <w:r>
-              <w:t xml:space="preserve">✅ 已完成</w:t>
-            </w:r>
-          </w:p>
-        </w:tc>
-        <w:tc>
-          <w:p>
-            <w:r>
-              <w:t xml:space="preserve">poc/requirements.txt 已锁版本；QwenPaw v2.0.0；pytest 全绿 225；红线 2：所有改动在 poc/ 内，git diff QwenPaw/ 始终为空</w:t>
-            </w:r>
-          </w:p>
-        </w:tc>
-        <w:tc>
-          <w:p>
-            <w:r>
-              <w:t xml:space="preserve">git diff --stat QwenPaw/  # 期望 0 行变更</w:t>
+          <w:tcPr>
+            <w:tcW w:type="dxa" w:w="2256"/>
+          </w:tcPr>
+          <w:p>
+            <w:r/>
+            <w:r>
+              <w:rPr>
+                <w:sz w:val="18"/>
+              </w:rPr>
+              <w:t>QwenPaw v2.0.0 旁路接入（不改内核）</w:t>
+            </w:r>
+          </w:p>
+        </w:tc>
+        <w:tc>
+          <w:tcPr>
+            <w:tcW w:type="dxa" w:w="2256"/>
+          </w:tcPr>
+          <w:p>
+            <w:r/>
+            <w:r>
+              <w:rPr>
+                <w:sz w:val="18"/>
+              </w:rPr>
+              <w:t>✅ 已完成</w:t>
+            </w:r>
+          </w:p>
+        </w:tc>
+        <w:tc>
+          <w:tcPr>
+            <w:tcW w:type="dxa" w:w="2256"/>
+          </w:tcPr>
+          <w:p>
+            <w:r/>
+            <w:r>
+              <w:rPr>
+                <w:sz w:val="18"/>
+              </w:rPr>
+              <w:t>poc/requirements.txt 已锁版本；QwenPaw v2.0.0；pytest 全绿 225；红线 2：所有改动在 poc/ 内，git diff QwenPaw/ 始终为空</w:t>
+            </w:r>
+          </w:p>
+        </w:tc>
+        <w:tc>
+          <w:tcPr>
+            <w:tcW w:type="dxa" w:w="2256"/>
+          </w:tcPr>
+          <w:p>
+            <w:r/>
+            <w:r>
+              <w:rPr>
+                <w:sz w:val="18"/>
+              </w:rPr>
+              <w:t>git diff --stat QwenPaw/  # 期望 0 行变更</w:t>
             </w:r>
           </w:p>
         </w:tc>
@@ -18451,7 +18846,7 @@
           <w:highlight w:val="none"/>
         </w:rPr>
       </w:pPr>
-      <w:bookmarkStart w:name="_Toc6580" w:id="17"/>
+      <w:bookmarkStart w:id="17" w:name="_Toc6580"/>
       <w:r>
         <w:rPr>
           <w:rFonts w:hint="default" w:ascii="华文细黑" w:hAnsi="华文细黑" w:eastAsia="华文细黑"/>
@@ -18480,7 +18875,7 @@
           <w:szCs w:val="24"/>
         </w:rPr>
       </w:pPr>
-      <w:bookmarkStart w:name="_Toc7587" w:id="18"/>
+      <w:bookmarkStart w:id="18" w:name="_Toc7587"/>
       <w:r>
         <w:rPr>
           <w:rFonts w:hint="eastAsia" w:ascii="华文细黑" w:hAnsi="华文细黑" w:eastAsia="华文细黑" w:cstheme="majorBidi"/>
@@ -19687,32 +20082,23 @@
           <w:color w:val="C00000"/>
           <w:sz w:val="28"/>
         </w:rPr>
-        <w:t xml:space="preserve">【完成证明 · 3.3.1 运营数据问答和运营数据分析（用例 3-1）】</w:t>
+        <w:t>【完成证明 · 3.3.1 运营数据问答和运营数据分析（用例 3-1）】</w:t>
       </w:r>
     </w:p>
     <w:p>
-      <w:pPr/>
       <w:r>
         <w:rPr>
-          <w:b w:val="false"/>
+          <w:b w:val="0"/>
           <w:sz w:val="22"/>
         </w:rPr>
-        <w:t xml:space="preserve">用例 3-1（对应需求原文 §3.3.1 运营数据问答和运营数据分析）的完成证据与现场演示命令如下。仓库当前测试基线：pytest 225 passed, 1 skipped（基线 101 + 任务 A/B/C/D/E/F 新增 124）。本节直接挂在原评估指标表之后，便于评委按需求原顺序查阅。</w:t>
+        <w:t>用例 3-1（对应需求原文 §3.3.1 运营数据问答和运营数据分析）的完成证据与现场演示命令如下。仓库当前测试基线：pytest 225 passed, 1 skipped（基线 101 + 任务 A/B/C/D/E/F 新增 124）。本节直接挂在原评估指标表之后，便于评委按需求原顺序查阅。</w:t>
       </w:r>
     </w:p>
     <w:tbl>
       <w:tblPr>
-        <w:tblStyle w:val="25"/>
-        <w:tblW w:w="9075" w:type="dxa"/>
-        <w:tblBorders>
-          <w:top w:val="single" w:sz="4"/>
-          <w:left w:val="single" w:sz="4"/>
-          <w:bottom w:val="single" w:sz="4"/>
-          <w:right w:val="single" w:sz="4"/>
-          <w:insideH w:val="single" w:sz="4"/>
-          <w:insideV w:val="single" w:sz="4"/>
-        </w:tblBorders>
-        <w:tblLook w:val="04A0"/>
+        <w:tblStyle w:val="26"/>
+        <w:tblW w:type="auto" w:w="0"/>
+        <w:tblLook w:firstColumn="1" w:firstRow="1" w:lastColumn="0" w:lastRow="0" w:noHBand="0" w:noVBand="1" w:val="04A0"/>
       </w:tblPr>
       <w:tblGrid>
         <w:gridCol w:w="2256"/>
@@ -19722,90 +20108,178 @@
       </w:tblGrid>
       <w:tr>
         <w:tc>
-          <w:p>
-            <w:r>
-              <w:t xml:space="preserve">考察点</w:t>
-            </w:r>
-          </w:p>
-        </w:tc>
-        <w:tc>
-          <w:p>
-            <w:r>
-              <w:t xml:space="preserve">完成状态</w:t>
-            </w:r>
-          </w:p>
-        </w:tc>
-        <w:tc>
-          <w:p>
-            <w:r>
-              <w:t xml:space="preserve">证据（文件/行号）</w:t>
-            </w:r>
-          </w:p>
-        </w:tc>
-        <w:tc>
-          <w:p>
-            <w:r>
-              <w:t xml:space="preserve">演示命令</w:t>
+          <w:tcPr>
+            <w:tcW w:type="dxa" w:w="2256"/>
+          </w:tcPr>
+          <w:p>
+            <w:r/>
+            <w:r>
+              <w:rPr>
+                <w:b/>
+                <w:sz w:val="18"/>
+              </w:rPr>
+              <w:t>考察点</w:t>
+            </w:r>
+          </w:p>
+        </w:tc>
+        <w:tc>
+          <w:tcPr>
+            <w:tcW w:type="dxa" w:w="2256"/>
+          </w:tcPr>
+          <w:p>
+            <w:r/>
+            <w:r>
+              <w:rPr>
+                <w:b/>
+                <w:sz w:val="18"/>
+              </w:rPr>
+              <w:t>完成状态</w:t>
+            </w:r>
+          </w:p>
+        </w:tc>
+        <w:tc>
+          <w:tcPr>
+            <w:tcW w:type="dxa" w:w="2256"/>
+          </w:tcPr>
+          <w:p>
+            <w:r/>
+            <w:r>
+              <w:rPr>
+                <w:b/>
+                <w:sz w:val="18"/>
+              </w:rPr>
+              <w:t>证据（文件/行号）</w:t>
+            </w:r>
+          </w:p>
+        </w:tc>
+        <w:tc>
+          <w:tcPr>
+            <w:tcW w:type="dxa" w:w="2256"/>
+          </w:tcPr>
+          <w:p>
+            <w:r/>
+            <w:r>
+              <w:rPr>
+                <w:b/>
+                <w:sz w:val="18"/>
+              </w:rPr>
+              <w:t>演示命令</w:t>
             </w:r>
           </w:p>
         </w:tc>
       </w:tr>
       <w:tr>
         <w:tc>
-          <w:p>
-            <w:r>
-              <w:t xml:space="preserve">运营数据问答 + 数据分析</w:t>
-            </w:r>
-          </w:p>
-        </w:tc>
-        <w:tc>
-          <w:p>
-            <w:r>
-              <w:t xml:space="preserve">✅ 已完成（任务 C）</w:t>
-            </w:r>
-          </w:p>
-        </w:tc>
-        <w:tc>
-          <w:p>
-            <w:r>
-              <w:t xml:space="preserve">poc/ops_mcp/{server.py, server_lib.py}（3 工具：list_telemetry_files / summarize_calls / recent_events）；poc/skills/ops-assistant/SKILL.md</w:t>
-            </w:r>
-          </w:p>
-        </w:tc>
-        <w:tc>
-          <w:p>
-            <w:r>
-              <w:t xml:space="preserve">python -m poc.ops_mcp   # stdio 子进程；JSON-RPC initialize + tools/list 返回 3 工具</w:t>
+          <w:tcPr>
+            <w:tcW w:type="dxa" w:w="2256"/>
+          </w:tcPr>
+          <w:p>
+            <w:r/>
+            <w:r>
+              <w:rPr>
+                <w:sz w:val="18"/>
+              </w:rPr>
+              <w:t>运营数据问答 + 数据分析</w:t>
+            </w:r>
+          </w:p>
+        </w:tc>
+        <w:tc>
+          <w:tcPr>
+            <w:tcW w:type="dxa" w:w="2256"/>
+          </w:tcPr>
+          <w:p>
+            <w:r/>
+            <w:r>
+              <w:rPr>
+                <w:sz w:val="18"/>
+              </w:rPr>
+              <w:t>✅ 已完成（任务 C）</w:t>
+            </w:r>
+          </w:p>
+        </w:tc>
+        <w:tc>
+          <w:tcPr>
+            <w:tcW w:type="dxa" w:w="2256"/>
+          </w:tcPr>
+          <w:p>
+            <w:r/>
+            <w:r>
+              <w:rPr>
+                <w:sz w:val="18"/>
+              </w:rPr>
+              <w:t>poc/ops_mcp/{server.py, server_lib.py}（3 工具：list_telemetry_files / summarize_calls / recent_events）；poc/skills/ops-assistant/SKILL.md</w:t>
+            </w:r>
+          </w:p>
+        </w:tc>
+        <w:tc>
+          <w:tcPr>
+            <w:tcW w:type="dxa" w:w="2256"/>
+          </w:tcPr>
+          <w:p>
+            <w:r/>
+            <w:r>
+              <w:rPr>
+                <w:sz w:val="18"/>
+              </w:rPr>
+              <w:t>python -m poc.ops_mcp   # stdio 子进程；JSON-RPC initialize + tools/list 返回 3 工具</w:t>
             </w:r>
           </w:p>
         </w:tc>
       </w:tr>
       <w:tr>
         <w:tc>
-          <w:p>
-            <w:r>
-              <w:t xml:space="preserve">QwenPaw v2.0.0 旁路接入（不改内核）</w:t>
-            </w:r>
-          </w:p>
-        </w:tc>
-        <w:tc>
-          <w:p>
-            <w:r>
-              <w:t xml:space="preserve">✅ 已完成</w:t>
-            </w:r>
-          </w:p>
-        </w:tc>
-        <w:tc>
-          <w:p>
-            <w:r>
-              <w:t xml:space="preserve">poc/requirements.txt 已锁版本；QwenPaw v2.0.0；pytest 全绿 225；红线 2：所有改动在 poc/ 内，git diff QwenPaw/ 始终为空</w:t>
-            </w:r>
-          </w:p>
-        </w:tc>
-        <w:tc>
-          <w:p>
-            <w:r>
-              <w:t xml:space="preserve">git diff --stat QwenPaw/  # 期望 0 行变更</w:t>
+          <w:tcPr>
+            <w:tcW w:type="dxa" w:w="2256"/>
+          </w:tcPr>
+          <w:p>
+            <w:r/>
+            <w:r>
+              <w:rPr>
+                <w:sz w:val="18"/>
+              </w:rPr>
+              <w:t>QwenPaw v2.0.0 旁路接入（不改内核）</w:t>
+            </w:r>
+          </w:p>
+        </w:tc>
+        <w:tc>
+          <w:tcPr>
+            <w:tcW w:type="dxa" w:w="2256"/>
+          </w:tcPr>
+          <w:p>
+            <w:r/>
+            <w:r>
+              <w:rPr>
+                <w:sz w:val="18"/>
+              </w:rPr>
+              <w:t>✅ 已完成</w:t>
+            </w:r>
+          </w:p>
+        </w:tc>
+        <w:tc>
+          <w:tcPr>
+            <w:tcW w:type="dxa" w:w="2256"/>
+          </w:tcPr>
+          <w:p>
+            <w:r/>
+            <w:r>
+              <w:rPr>
+                <w:sz w:val="18"/>
+              </w:rPr>
+              <w:t>poc/requirements.txt 已锁版本；QwenPaw v2.0.0；pytest 全绿 225；红线 2：所有改动在 poc/ 内，git diff QwenPaw/ 始终为空</w:t>
+            </w:r>
+          </w:p>
+        </w:tc>
+        <w:tc>
+          <w:tcPr>
+            <w:tcW w:type="dxa" w:w="2256"/>
+          </w:tcPr>
+          <w:p>
+            <w:r/>
+            <w:r>
+              <w:rPr>
+                <w:sz w:val="18"/>
+              </w:rPr>
+              <w:t>git diff --stat QwenPaw/  # 期望 0 行变更</w:t>
             </w:r>
           </w:p>
         </w:tc>
@@ -19835,7 +20309,7 @@
           <w:szCs w:val="24"/>
         </w:rPr>
       </w:pPr>
-      <w:bookmarkStart w:name="_Toc14756" w:id="19"/>
+      <w:bookmarkStart w:id="19" w:name="_Toc14756"/>
       <w:r>
         <w:rPr>
           <w:rFonts w:hint="eastAsia" w:ascii="华文细黑" w:hAnsi="华文细黑" w:eastAsia="华文细黑" w:cstheme="majorBidi"/>
@@ -20950,32 +21424,23 @@
           <w:color w:val="C00000"/>
           <w:sz w:val="28"/>
         </w:rPr>
-        <w:t xml:space="preserve">【完成证明 · 3.3.2 业务理解能力（用例 3-2）】</w:t>
+        <w:t>【完成证明 · 3.3.2 业务理解能力（用例 3-2）】</w:t>
       </w:r>
     </w:p>
     <w:p>
-      <w:pPr/>
       <w:r>
         <w:rPr>
-          <w:b w:val="false"/>
+          <w:b w:val="0"/>
           <w:sz w:val="22"/>
         </w:rPr>
-        <w:t xml:space="preserve">用例 3-2（对应需求原文 §3.3.2 业务理解能力）的完成证据与现场演示命令如下。仓库当前测试基线：pytest 225 passed, 1 skipped（基线 101 + 任务 A/B/C/D/E/F 新增 124）。本节直接挂在原评估指标表之后，便于评委按需求原顺序查阅。</w:t>
+        <w:t>用例 3-2（对应需求原文 §3.3.2 业务理解能力）的完成证据与现场演示命令如下。仓库当前测试基线：pytest 225 passed, 1 skipped（基线 101 + 任务 A/B/C/D/E/F 新增 124）。本节直接挂在原评估指标表之后，便于评委按需求原顺序查阅。</w:t>
       </w:r>
     </w:p>
     <w:tbl>
       <w:tblPr>
-        <w:tblStyle w:val="25"/>
-        <w:tblW w:w="9075" w:type="dxa"/>
-        <w:tblBorders>
-          <w:top w:val="single" w:sz="4"/>
-          <w:left w:val="single" w:sz="4"/>
-          <w:bottom w:val="single" w:sz="4"/>
-          <w:right w:val="single" w:sz="4"/>
-          <w:insideH w:val="single" w:sz="4"/>
-          <w:insideV w:val="single" w:sz="4"/>
-        </w:tblBorders>
-        <w:tblLook w:val="04A0"/>
+        <w:tblStyle w:val="26"/>
+        <w:tblW w:type="auto" w:w="0"/>
+        <w:tblLook w:firstColumn="1" w:firstRow="1" w:lastColumn="0" w:lastRow="0" w:noHBand="0" w:noVBand="1" w:val="04A0"/>
       </w:tblPr>
       <w:tblGrid>
         <w:gridCol w:w="2256"/>
@@ -20985,90 +21450,178 @@
       </w:tblGrid>
       <w:tr>
         <w:tc>
-          <w:p>
-            <w:r>
-              <w:t xml:space="preserve">考察点</w:t>
-            </w:r>
-          </w:p>
-        </w:tc>
-        <w:tc>
-          <w:p>
-            <w:r>
-              <w:t xml:space="preserve">完成状态</w:t>
-            </w:r>
-          </w:p>
-        </w:tc>
-        <w:tc>
-          <w:p>
-            <w:r>
-              <w:t xml:space="preserve">证据（文件/行号）</w:t>
-            </w:r>
-          </w:p>
-        </w:tc>
-        <w:tc>
-          <w:p>
-            <w:r>
-              <w:t xml:space="preserve">演示命令</w:t>
+          <w:tcPr>
+            <w:tcW w:type="dxa" w:w="2256"/>
+          </w:tcPr>
+          <w:p>
+            <w:r/>
+            <w:r>
+              <w:rPr>
+                <w:b/>
+                <w:sz w:val="18"/>
+              </w:rPr>
+              <w:t>考察点</w:t>
+            </w:r>
+          </w:p>
+        </w:tc>
+        <w:tc>
+          <w:tcPr>
+            <w:tcW w:type="dxa" w:w="2256"/>
+          </w:tcPr>
+          <w:p>
+            <w:r/>
+            <w:r>
+              <w:rPr>
+                <w:b/>
+                <w:sz w:val="18"/>
+              </w:rPr>
+              <w:t>完成状态</w:t>
+            </w:r>
+          </w:p>
+        </w:tc>
+        <w:tc>
+          <w:tcPr>
+            <w:tcW w:type="dxa" w:w="2256"/>
+          </w:tcPr>
+          <w:p>
+            <w:r/>
+            <w:r>
+              <w:rPr>
+                <w:b/>
+                <w:sz w:val="18"/>
+              </w:rPr>
+              <w:t>证据（文件/行号）</w:t>
+            </w:r>
+          </w:p>
+        </w:tc>
+        <w:tc>
+          <w:tcPr>
+            <w:tcW w:type="dxa" w:w="2256"/>
+          </w:tcPr>
+          <w:p>
+            <w:r/>
+            <w:r>
+              <w:rPr>
+                <w:b/>
+                <w:sz w:val="18"/>
+              </w:rPr>
+              <w:t>演示命令</w:t>
             </w:r>
           </w:p>
         </w:tc>
       </w:tr>
       <w:tr>
         <w:tc>
-          <w:p>
-            <w:r>
-              <w:t xml:space="preserve">将业务问题翻译为工具调用序列</w:t>
-            </w:r>
-          </w:p>
-        </w:tc>
-        <w:tc>
-          <w:p>
-            <w:r>
-              <w:t xml:space="preserve">✅ 已完成（任务 C）</w:t>
-            </w:r>
-          </w:p>
-        </w:tc>
-        <w:tc>
-          <w:p>
-            <w:r>
-              <w:t xml:space="preserve">poc/skills/ops-assistant/SKILL.md（含完整 inputs/returns/edges）；docs/excel-12题标准答卷.md 每题给出 MCP 调用顺序</w:t>
-            </w:r>
-          </w:p>
-        </w:tc>
-        <w:tc>
-          <w:p>
-            <w:r>
-              <w:t xml:space="preserve">对 ops 智能体下问「调用量分布」「最近一次失败的工具」等，对照 SKILL.md 触发词即可触发</w:t>
+          <w:tcPr>
+            <w:tcW w:type="dxa" w:w="2256"/>
+          </w:tcPr>
+          <w:p>
+            <w:r/>
+            <w:r>
+              <w:rPr>
+                <w:sz w:val="18"/>
+              </w:rPr>
+              <w:t>将业务问题翻译为工具调用序列</w:t>
+            </w:r>
+          </w:p>
+        </w:tc>
+        <w:tc>
+          <w:tcPr>
+            <w:tcW w:type="dxa" w:w="2256"/>
+          </w:tcPr>
+          <w:p>
+            <w:r/>
+            <w:r>
+              <w:rPr>
+                <w:sz w:val="18"/>
+              </w:rPr>
+              <w:t>✅ 已完成（任务 C）</w:t>
+            </w:r>
+          </w:p>
+        </w:tc>
+        <w:tc>
+          <w:tcPr>
+            <w:tcW w:type="dxa" w:w="2256"/>
+          </w:tcPr>
+          <w:p>
+            <w:r/>
+            <w:r>
+              <w:rPr>
+                <w:sz w:val="18"/>
+              </w:rPr>
+              <w:t>poc/skills/ops-assistant/SKILL.md（含完整 inputs/returns/edges）；docs/excel-12题标准答卷.md 每题给出 MCP 调用顺序</w:t>
+            </w:r>
+          </w:p>
+        </w:tc>
+        <w:tc>
+          <w:tcPr>
+            <w:tcW w:type="dxa" w:w="2256"/>
+          </w:tcPr>
+          <w:p>
+            <w:r/>
+            <w:r>
+              <w:rPr>
+                <w:sz w:val="18"/>
+              </w:rPr>
+              <w:t>对 ops 智能体下问「调用量分布」「最近一次失败的工具」等，对照 SKILL.md 触发词即可触发</w:t>
             </w:r>
           </w:p>
         </w:tc>
       </w:tr>
       <w:tr>
         <w:tc>
-          <w:p>
-            <w:r>
-              <w:t xml:space="preserve">QwenPaw v2.0.0 旁路接入（不改内核）</w:t>
-            </w:r>
-          </w:p>
-        </w:tc>
-        <w:tc>
-          <w:p>
-            <w:r>
-              <w:t xml:space="preserve">✅ 已完成</w:t>
-            </w:r>
-          </w:p>
-        </w:tc>
-        <w:tc>
-          <w:p>
-            <w:r>
-              <w:t xml:space="preserve">poc/requirements.txt 已锁版本；QwenPaw v2.0.0；pytest 全绿 225；红线 2：所有改动在 poc/ 内，git diff QwenPaw/ 始终为空</w:t>
-            </w:r>
-          </w:p>
-        </w:tc>
-        <w:tc>
-          <w:p>
-            <w:r>
-              <w:t xml:space="preserve">git diff --stat QwenPaw/  # 期望 0 行变更</w:t>
+          <w:tcPr>
+            <w:tcW w:type="dxa" w:w="2256"/>
+          </w:tcPr>
+          <w:p>
+            <w:r/>
+            <w:r>
+              <w:rPr>
+                <w:sz w:val="18"/>
+              </w:rPr>
+              <w:t>QwenPaw v2.0.0 旁路接入（不改内核）</w:t>
+            </w:r>
+          </w:p>
+        </w:tc>
+        <w:tc>
+          <w:tcPr>
+            <w:tcW w:type="dxa" w:w="2256"/>
+          </w:tcPr>
+          <w:p>
+            <w:r/>
+            <w:r>
+              <w:rPr>
+                <w:sz w:val="18"/>
+              </w:rPr>
+              <w:t>✅ 已完成</w:t>
+            </w:r>
+          </w:p>
+        </w:tc>
+        <w:tc>
+          <w:tcPr>
+            <w:tcW w:type="dxa" w:w="2256"/>
+          </w:tcPr>
+          <w:p>
+            <w:r/>
+            <w:r>
+              <w:rPr>
+                <w:sz w:val="18"/>
+              </w:rPr>
+              <w:t>poc/requirements.txt 已锁版本；QwenPaw v2.0.0；pytest 全绿 225；红线 2：所有改动在 poc/ 内，git diff QwenPaw/ 始终为空</w:t>
+            </w:r>
+          </w:p>
+        </w:tc>
+        <w:tc>
+          <w:tcPr>
+            <w:tcW w:type="dxa" w:w="2256"/>
+          </w:tcPr>
+          <w:p>
+            <w:r/>
+            <w:r>
+              <w:rPr>
+                <w:sz w:val="18"/>
+              </w:rPr>
+              <w:t>git diff --stat QwenPaw/  # 期望 0 行变更</w:t>
             </w:r>
           </w:p>
         </w:tc>
@@ -21098,7 +21651,7 @@
           <w:szCs w:val="24"/>
         </w:rPr>
       </w:pPr>
-      <w:bookmarkStart w:name="_Toc2409" w:id="20"/>
+      <w:bookmarkStart w:id="20" w:name="_Toc2409"/>
       <w:r>
         <w:rPr>
           <w:rFonts w:hint="eastAsia" w:ascii="华文细黑" w:hAnsi="华文细黑" w:eastAsia="华文细黑" w:cstheme="majorBidi"/>
@@ -22372,32 +22925,23 @@
           <w:color w:val="C00000"/>
           <w:sz w:val="28"/>
         </w:rPr>
-        <w:t xml:space="preserve">【完成证明 · 3.3.3 HOOK开发能力（用例 3-3）】</w:t>
+        <w:t>【完成证明 · 3.3.3 HOOK开发能力（用例 3-3）】</w:t>
       </w:r>
     </w:p>
     <w:p>
-      <w:pPr/>
       <w:r>
         <w:rPr>
-          <w:b w:val="false"/>
+          <w:b w:val="0"/>
           <w:sz w:val="22"/>
         </w:rPr>
-        <w:t xml:space="preserve">用例 3-3（对应需求原文 §3.3.3 HOOK开发能力）的完成证据与现场演示命令如下。仓库当前测试基线：pytest 225 passed, 1 skipped（基线 101 + 任务 A/B/C/D/E/F 新增 124）。本节直接挂在原评估指标表之后，便于评委按需求原顺序查阅。</w:t>
+        <w:t>用例 3-3（对应需求原文 §3.3.3 HOOK开发能力）的完成证据与现场演示命令如下。仓库当前测试基线：pytest 225 passed, 1 skipped（基线 101 + 任务 A/B/C/D/E/F 新增 124）。本节直接挂在原评估指标表之后，便于评委按需求原顺序查阅。</w:t>
       </w:r>
     </w:p>
     <w:tbl>
       <w:tblPr>
-        <w:tblStyle w:val="25"/>
-        <w:tblW w:w="9075" w:type="dxa"/>
-        <w:tblBorders>
-          <w:top w:val="single" w:sz="4"/>
-          <w:left w:val="single" w:sz="4"/>
-          <w:bottom w:val="single" w:sz="4"/>
-          <w:right w:val="single" w:sz="4"/>
-          <w:insideH w:val="single" w:sz="4"/>
-          <w:insideV w:val="single" w:sz="4"/>
-        </w:tblBorders>
-        <w:tblLook w:val="04A0"/>
+        <w:tblStyle w:val="26"/>
+        <w:tblW w:type="auto" w:w="0"/>
+        <w:tblLook w:firstColumn="1" w:firstRow="1" w:lastColumn="0" w:lastRow="0" w:noHBand="0" w:noVBand="1" w:val="04A0"/>
       </w:tblPr>
       <w:tblGrid>
         <w:gridCol w:w="2256"/>
@@ -22407,90 +22951,178 @@
       </w:tblGrid>
       <w:tr>
         <w:tc>
-          <w:p>
-            <w:r>
-              <w:t xml:space="preserve">考察点</w:t>
-            </w:r>
-          </w:p>
-        </w:tc>
-        <w:tc>
-          <w:p>
-            <w:r>
-              <w:t xml:space="preserve">完成状态</w:t>
-            </w:r>
-          </w:p>
-        </w:tc>
-        <w:tc>
-          <w:p>
-            <w:r>
-              <w:t xml:space="preserve">证据（文件/行号）</w:t>
-            </w:r>
-          </w:p>
-        </w:tc>
-        <w:tc>
-          <w:p>
-            <w:r>
-              <w:t xml:space="preserve">演示命令</w:t>
+          <w:tcPr>
+            <w:tcW w:type="dxa" w:w="2256"/>
+          </w:tcPr>
+          <w:p>
+            <w:r/>
+            <w:r>
+              <w:rPr>
+                <w:b/>
+                <w:sz w:val="18"/>
+              </w:rPr>
+              <w:t>考察点</w:t>
+            </w:r>
+          </w:p>
+        </w:tc>
+        <w:tc>
+          <w:tcPr>
+            <w:tcW w:type="dxa" w:w="2256"/>
+          </w:tcPr>
+          <w:p>
+            <w:r/>
+            <w:r>
+              <w:rPr>
+                <w:b/>
+                <w:sz w:val="18"/>
+              </w:rPr>
+              <w:t>完成状态</w:t>
+            </w:r>
+          </w:p>
+        </w:tc>
+        <w:tc>
+          <w:tcPr>
+            <w:tcW w:type="dxa" w:w="2256"/>
+          </w:tcPr>
+          <w:p>
+            <w:r/>
+            <w:r>
+              <w:rPr>
+                <w:b/>
+                <w:sz w:val="18"/>
+              </w:rPr>
+              <w:t>证据（文件/行号）</w:t>
+            </w:r>
+          </w:p>
+        </w:tc>
+        <w:tc>
+          <w:tcPr>
+            <w:tcW w:type="dxa" w:w="2256"/>
+          </w:tcPr>
+          <w:p>
+            <w:r/>
+            <w:r>
+              <w:rPr>
+                <w:b/>
+                <w:sz w:val="18"/>
+              </w:rPr>
+              <w:t>演示命令</w:t>
             </w:r>
           </w:p>
         </w:tc>
       </w:tr>
       <w:tr>
         <w:tc>
-          <w:p>
-            <w:r>
-              <w:t xml:space="preserve">四类埋点（调用量 / Token 用量 / 工具成败 / 用户会话 / 耗时）</w:t>
-            </w:r>
-          </w:p>
-        </w:tc>
-        <w:tc>
-          <w:p>
-            <w:r>
-              <w:t xml:space="preserve">✅ 已完成（任务 C）</w:t>
-            </w:r>
-          </w:p>
-        </w:tc>
-        <w:tc>
-          <w:p>
-            <w:r>
-              <w:t xml:space="preserve">poc/hooks/{telemetry.py, ops_hooks.py}（6 个 HookBase 覆盖 5 个 Phase：PRE_DISPATCH / POST_DISPATCH / PRE_AGENT_BUILD / POST_RESPONSE / PRE_EXECUTE / ON_ERROR）；poc/plugins/ops-telemetry/plugin.py</w:t>
-            </w:r>
-          </w:p>
-        </w:tc>
-        <w:tc>
-          <w:p>
-            <w:r>
-              <w:t xml:space="preserve">qwenpaw plugin install &lt;REPO_ROOT&gt;/poc/plugins/ops-telemetry；触发一次请求后 tail -f $POC_WORKSPACE/telemetry/&lt;UTC-date&gt;/ops.jsonl 应见五类事件</w:t>
+          <w:tcPr>
+            <w:tcW w:type="dxa" w:w="2256"/>
+          </w:tcPr>
+          <w:p>
+            <w:r/>
+            <w:r>
+              <w:rPr>
+                <w:sz w:val="18"/>
+              </w:rPr>
+              <w:t>四类埋点（调用量 / Token 用量 / 工具成败 / 用户会话 / 耗时）</w:t>
+            </w:r>
+          </w:p>
+        </w:tc>
+        <w:tc>
+          <w:tcPr>
+            <w:tcW w:type="dxa" w:w="2256"/>
+          </w:tcPr>
+          <w:p>
+            <w:r/>
+            <w:r>
+              <w:rPr>
+                <w:sz w:val="18"/>
+              </w:rPr>
+              <w:t>✅ 已完成（任务 C）</w:t>
+            </w:r>
+          </w:p>
+        </w:tc>
+        <w:tc>
+          <w:tcPr>
+            <w:tcW w:type="dxa" w:w="2256"/>
+          </w:tcPr>
+          <w:p>
+            <w:r/>
+            <w:r>
+              <w:rPr>
+                <w:sz w:val="18"/>
+              </w:rPr>
+              <w:t>poc/hooks/{telemetry.py, ops_hooks.py}（6 个 HookBase 覆盖 5 个 Phase：PRE_DISPATCH / POST_DISPATCH / PRE_AGENT_BUILD / POST_RESPONSE / PRE_EXECUTE / ON_ERROR）；poc/plugins/ops-telemetry/plugin.py</w:t>
+            </w:r>
+          </w:p>
+        </w:tc>
+        <w:tc>
+          <w:tcPr>
+            <w:tcW w:type="dxa" w:w="2256"/>
+          </w:tcPr>
+          <w:p>
+            <w:r/>
+            <w:r>
+              <w:rPr>
+                <w:sz w:val="18"/>
+              </w:rPr>
+              <w:t>qwenpaw plugin install &lt;REPO_ROOT&gt;/poc/plugins/ops-telemetry；触发一次请求后 tail -f $POC_WORKSPACE/telemetry/&lt;UTC-date&gt;/ops.jsonl 应见五类事件</w:t>
             </w:r>
           </w:p>
         </w:tc>
       </w:tr>
       <w:tr>
         <w:tc>
-          <w:p>
-            <w:r>
-              <w:t xml:space="preserve">QwenPaw v2.0.0 旁路接入（不改内核）</w:t>
-            </w:r>
-          </w:p>
-        </w:tc>
-        <w:tc>
-          <w:p>
-            <w:r>
-              <w:t xml:space="preserve">✅ 已完成</w:t>
-            </w:r>
-          </w:p>
-        </w:tc>
-        <w:tc>
-          <w:p>
-            <w:r>
-              <w:t xml:space="preserve">poc/requirements.txt 已锁版本；QwenPaw v2.0.0；pytest 全绿 225；红线 2：所有改动在 poc/ 内，git diff QwenPaw/ 始终为空</w:t>
-            </w:r>
-          </w:p>
-        </w:tc>
-        <w:tc>
-          <w:p>
-            <w:r>
-              <w:t xml:space="preserve">git diff --stat QwenPaw/  # 期望 0 行变更</w:t>
+          <w:tcPr>
+            <w:tcW w:type="dxa" w:w="2256"/>
+          </w:tcPr>
+          <w:p>
+            <w:r/>
+            <w:r>
+              <w:rPr>
+                <w:sz w:val="18"/>
+              </w:rPr>
+              <w:t>QwenPaw v2.0.0 旁路接入（不改内核）</w:t>
+            </w:r>
+          </w:p>
+        </w:tc>
+        <w:tc>
+          <w:tcPr>
+            <w:tcW w:type="dxa" w:w="2256"/>
+          </w:tcPr>
+          <w:p>
+            <w:r/>
+            <w:r>
+              <w:rPr>
+                <w:sz w:val="18"/>
+              </w:rPr>
+              <w:t>✅ 已完成</w:t>
+            </w:r>
+          </w:p>
+        </w:tc>
+        <w:tc>
+          <w:tcPr>
+            <w:tcW w:type="dxa" w:w="2256"/>
+          </w:tcPr>
+          <w:p>
+            <w:r/>
+            <w:r>
+              <w:rPr>
+                <w:sz w:val="18"/>
+              </w:rPr>
+              <w:t>poc/requirements.txt 已锁版本；QwenPaw v2.0.0；pytest 全绿 225；红线 2：所有改动在 poc/ 内，git diff QwenPaw/ 始终为空</w:t>
+            </w:r>
+          </w:p>
+        </w:tc>
+        <w:tc>
+          <w:tcPr>
+            <w:tcW w:type="dxa" w:w="2256"/>
+          </w:tcPr>
+          <w:p>
+            <w:r/>
+            <w:r>
+              <w:rPr>
+                <w:sz w:val="18"/>
+              </w:rPr>
+              <w:t>git diff --stat QwenPaw/  # 期望 0 行变更</w:t>
             </w:r>
           </w:p>
         </w:tc>
@@ -22527,7 +23159,7 @@
           <w:highlight w:val="none"/>
         </w:rPr>
       </w:pPr>
-      <w:bookmarkStart w:name="_Toc7471" w:id="21"/>
+      <w:bookmarkStart w:id="21" w:name="_Toc7471"/>
       <w:r>
         <w:rPr>
           <w:rFonts w:hint="eastAsia" w:ascii="华文细黑" w:hAnsi="华文细黑" w:eastAsia="华文细黑"/>
@@ -22557,7 +23189,7 @@
           <w:szCs w:val="24"/>
         </w:rPr>
       </w:pPr>
-      <w:bookmarkStart w:name="_Toc19788" w:id="22"/>
+      <w:bookmarkStart w:id="22" w:name="_Toc19788"/>
       <w:r>
         <w:rPr>
           <w:rFonts w:hint="eastAsia" w:ascii="华文细黑" w:hAnsi="华文细黑" w:eastAsia="华文细黑" w:cstheme="majorBidi"/>
@@ -23719,32 +24351,23 @@
           <w:color w:val="C00000"/>
           <w:sz w:val="28"/>
         </w:rPr>
-        <w:t xml:space="preserve">【完成证明 · 3.4.1 报告可视化助手（用例 4-1）】</w:t>
+        <w:t>【完成证明 · 3.4.1 报告可视化助手（用例 4-1）】</w:t>
       </w:r>
     </w:p>
     <w:p>
-      <w:pPr/>
       <w:r>
         <w:rPr>
-          <w:b w:val="false"/>
+          <w:b w:val="0"/>
           <w:sz w:val="22"/>
         </w:rPr>
-        <w:t xml:space="preserve">用例 4-1（对应需求原文 §3.4.1 报告可视化助手）的完成证据与现场演示命令如下。仓库当前测试基线：pytest 225 passed, 1 skipped（基线 101 + 任务 A/B/C/D/E/F 新增 124）。本节直接挂在原评估指标表之后，便于评委按需求原顺序查阅。</w:t>
+        <w:t>用例 4-1（对应需求原文 §3.4.1 报告可视化助手）的完成证据与现场演示命令如下。仓库当前测试基线：pytest 225 passed, 1 skipped（基线 101 + 任务 A/B/C/D/E/F 新增 124）。本节直接挂在原评估指标表之后，便于评委按需求原顺序查阅。</w:t>
       </w:r>
     </w:p>
     <w:tbl>
       <w:tblPr>
-        <w:tblStyle w:val="25"/>
-        <w:tblW w:w="9075" w:type="dxa"/>
-        <w:tblBorders>
-          <w:top w:val="single" w:sz="4"/>
-          <w:left w:val="single" w:sz="4"/>
-          <w:bottom w:val="single" w:sz="4"/>
-          <w:right w:val="single" w:sz="4"/>
-          <w:insideH w:val="single" w:sz="4"/>
-          <w:insideV w:val="single" w:sz="4"/>
-        </w:tblBorders>
-        <w:tblLook w:val="04A0"/>
+        <w:tblStyle w:val="26"/>
+        <w:tblW w:type="auto" w:w="0"/>
+        <w:tblLook w:firstColumn="1" w:firstRow="1" w:lastColumn="0" w:lastRow="0" w:noHBand="0" w:noVBand="1" w:val="04A0"/>
       </w:tblPr>
       <w:tblGrid>
         <w:gridCol w:w="2256"/>
@@ -23754,90 +24377,178 @@
       </w:tblGrid>
       <w:tr>
         <w:tc>
-          <w:p>
-            <w:r>
-              <w:t xml:space="preserve">考察点</w:t>
-            </w:r>
-          </w:p>
-        </w:tc>
-        <w:tc>
-          <w:p>
-            <w:r>
-              <w:t xml:space="preserve">完成状态</w:t>
-            </w:r>
-          </w:p>
-        </w:tc>
-        <w:tc>
-          <w:p>
-            <w:r>
-              <w:t xml:space="preserve">证据（文件/行号）</w:t>
-            </w:r>
-          </w:p>
-        </w:tc>
-        <w:tc>
-          <w:p>
-            <w:r>
-              <w:t xml:space="preserve">演示命令</w:t>
+          <w:tcPr>
+            <w:tcW w:type="dxa" w:w="2256"/>
+          </w:tcPr>
+          <w:p>
+            <w:r/>
+            <w:r>
+              <w:rPr>
+                <w:b/>
+                <w:sz w:val="18"/>
+              </w:rPr>
+              <w:t>考察点</w:t>
+            </w:r>
+          </w:p>
+        </w:tc>
+        <w:tc>
+          <w:tcPr>
+            <w:tcW w:type="dxa" w:w="2256"/>
+          </w:tcPr>
+          <w:p>
+            <w:r/>
+            <w:r>
+              <w:rPr>
+                <w:b/>
+                <w:sz w:val="18"/>
+              </w:rPr>
+              <w:t>完成状态</w:t>
+            </w:r>
+          </w:p>
+        </w:tc>
+        <w:tc>
+          <w:tcPr>
+            <w:tcW w:type="dxa" w:w="2256"/>
+          </w:tcPr>
+          <w:p>
+            <w:r/>
+            <w:r>
+              <w:rPr>
+                <w:b/>
+                <w:sz w:val="18"/>
+              </w:rPr>
+              <w:t>证据（文件/行号）</w:t>
+            </w:r>
+          </w:p>
+        </w:tc>
+        <w:tc>
+          <w:tcPr>
+            <w:tcW w:type="dxa" w:w="2256"/>
+          </w:tcPr>
+          <w:p>
+            <w:r/>
+            <w:r>
+              <w:rPr>
+                <w:b/>
+                <w:sz w:val="18"/>
+              </w:rPr>
+              <w:t>演示命令</w:t>
             </w:r>
           </w:p>
         </w:tc>
       </w:tr>
       <w:tr>
         <w:tc>
-          <w:p>
-            <w:r>
-              <w:t xml:space="preserve">docx + 交叉表 + 五类图（柱/折/饼/散点/热力）</w:t>
-            </w:r>
-          </w:p>
-        </w:tc>
-        <w:tc>
-          <w:p>
-            <w:r>
-              <w:t xml:space="preserve">✅ 已完成（任务 A）</w:t>
-            </w:r>
-          </w:p>
-        </w:tc>
-        <w:tc>
-          <w:p>
-            <w:r>
-              <w:t xml:space="preserve">poc/report_mcp/{charts.py, crosstab.py, docx_gen.py}（7 工具）；poc/skills/report-visualizer/SKILL.md；poc/fixtures/report_demo/quarterly_business.json</w:t>
-            </w:r>
-          </w:p>
-        </w:tc>
-        <w:tc>
-          <w:p>
-            <w:r>
-              <w:t xml:space="preserve">python scripts/report_demo.py   # 5 PNG + 1 交叉表嵌入 docx，产物路径见 stdout</w:t>
+          <w:tcPr>
+            <w:tcW w:type="dxa" w:w="2256"/>
+          </w:tcPr>
+          <w:p>
+            <w:r/>
+            <w:r>
+              <w:rPr>
+                <w:sz w:val="18"/>
+              </w:rPr>
+              <w:t>docx + 交叉表 + 五类图（柱/折/饼/散点/热力）</w:t>
+            </w:r>
+          </w:p>
+        </w:tc>
+        <w:tc>
+          <w:tcPr>
+            <w:tcW w:type="dxa" w:w="2256"/>
+          </w:tcPr>
+          <w:p>
+            <w:r/>
+            <w:r>
+              <w:rPr>
+                <w:sz w:val="18"/>
+              </w:rPr>
+              <w:t>✅ 已完成（任务 A）</w:t>
+            </w:r>
+          </w:p>
+        </w:tc>
+        <w:tc>
+          <w:tcPr>
+            <w:tcW w:type="dxa" w:w="2256"/>
+          </w:tcPr>
+          <w:p>
+            <w:r/>
+            <w:r>
+              <w:rPr>
+                <w:sz w:val="18"/>
+              </w:rPr>
+              <w:t>poc/report_mcp/{charts.py, crosstab.py, docx_gen.py}（7 工具）；poc/skills/report-visualizer/SKILL.md；poc/fixtures/report_demo/quarterly_business.json</w:t>
+            </w:r>
+          </w:p>
+        </w:tc>
+        <w:tc>
+          <w:tcPr>
+            <w:tcW w:type="dxa" w:w="2256"/>
+          </w:tcPr>
+          <w:p>
+            <w:r/>
+            <w:r>
+              <w:rPr>
+                <w:sz w:val="18"/>
+              </w:rPr>
+              <w:t>python scripts/report_demo.py   # 5 PNG + 1 交叉表嵌入 docx，产物路径见 stdout</w:t>
             </w:r>
           </w:p>
         </w:tc>
       </w:tr>
       <w:tr>
         <w:tc>
-          <w:p>
-            <w:r>
-              <w:t xml:space="preserve">QwenPaw v2.0.0 旁路接入（不改内核）</w:t>
-            </w:r>
-          </w:p>
-        </w:tc>
-        <w:tc>
-          <w:p>
-            <w:r>
-              <w:t xml:space="preserve">✅ 已完成</w:t>
-            </w:r>
-          </w:p>
-        </w:tc>
-        <w:tc>
-          <w:p>
-            <w:r>
-              <w:t xml:space="preserve">poc/requirements.txt 已锁版本；QwenPaw v2.0.0；pytest 全绿 225；红线 2：所有改动在 poc/ 内，git diff QwenPaw/ 始终为空</w:t>
-            </w:r>
-          </w:p>
-        </w:tc>
-        <w:tc>
-          <w:p>
-            <w:r>
-              <w:t xml:space="preserve">git diff --stat QwenPaw/  # 期望 0 行变更</w:t>
+          <w:tcPr>
+            <w:tcW w:type="dxa" w:w="2256"/>
+          </w:tcPr>
+          <w:p>
+            <w:r/>
+            <w:r>
+              <w:rPr>
+                <w:sz w:val="18"/>
+              </w:rPr>
+              <w:t>QwenPaw v2.0.0 旁路接入（不改内核）</w:t>
+            </w:r>
+          </w:p>
+        </w:tc>
+        <w:tc>
+          <w:tcPr>
+            <w:tcW w:type="dxa" w:w="2256"/>
+          </w:tcPr>
+          <w:p>
+            <w:r/>
+            <w:r>
+              <w:rPr>
+                <w:sz w:val="18"/>
+              </w:rPr>
+              <w:t>✅ 已完成</w:t>
+            </w:r>
+          </w:p>
+        </w:tc>
+        <w:tc>
+          <w:tcPr>
+            <w:tcW w:type="dxa" w:w="2256"/>
+          </w:tcPr>
+          <w:p>
+            <w:r/>
+            <w:r>
+              <w:rPr>
+                <w:sz w:val="18"/>
+              </w:rPr>
+              <w:t>poc/requirements.txt 已锁版本；QwenPaw v2.0.0；pytest 全绿 225；红线 2：所有改动在 poc/ 内，git diff QwenPaw/ 始终为空</w:t>
+            </w:r>
+          </w:p>
+        </w:tc>
+        <w:tc>
+          <w:tcPr>
+            <w:tcW w:type="dxa" w:w="2256"/>
+          </w:tcPr>
+          <w:p>
+            <w:r/>
+            <w:r>
+              <w:rPr>
+                <w:sz w:val="18"/>
+              </w:rPr>
+              <w:t>git diff --stat QwenPaw/  # 期望 0 行变更</w:t>
             </w:r>
           </w:p>
         </w:tc>
@@ -23867,7 +24578,7 @@
           <w:szCs w:val="24"/>
         </w:rPr>
       </w:pPr>
-      <w:bookmarkStart w:name="_Toc23702" w:id="23"/>
+      <w:bookmarkStart w:id="23" w:name="_Toc23702"/>
       <w:r>
         <w:rPr>
           <w:rFonts w:hint="eastAsia" w:ascii="华文细黑" w:hAnsi="华文细黑" w:eastAsia="华文细黑" w:cstheme="majorBidi"/>
@@ -25006,32 +25717,23 @@
           <w:color w:val="C00000"/>
           <w:sz w:val="28"/>
         </w:rPr>
-        <w:t xml:space="preserve">【完成证明 · 3.4.2 后端开发能力（用例 4-2）】</w:t>
+        <w:t>【完成证明 · 3.4.2 后端开发能力（用例 4-2）】</w:t>
       </w:r>
     </w:p>
     <w:p>
-      <w:pPr/>
       <w:r>
         <w:rPr>
-          <w:b w:val="false"/>
+          <w:b w:val="0"/>
           <w:sz w:val="22"/>
         </w:rPr>
-        <w:t xml:space="preserve">用例 4-2（对应需求原文 §3.4.2 后端开发能力）的完成证据与现场演示命令如下。仓库当前测试基线：pytest 225 passed, 1 skipped（基线 101 + 任务 A/B/C/D/E/F 新增 124）。本节直接挂在原评估指标表之后，便于评委按需求原顺序查阅。</w:t>
+        <w:t>用例 4-2（对应需求原文 §3.4.2 后端开发能力）的完成证据与现场演示命令如下。仓库当前测试基线：pytest 225 passed, 1 skipped（基线 101 + 任务 A/B/C/D/E/F 新增 124）。本节直接挂在原评估指标表之后，便于评委按需求原顺序查阅。</w:t>
       </w:r>
     </w:p>
     <w:tbl>
       <w:tblPr>
-        <w:tblStyle w:val="25"/>
-        <w:tblW w:w="9075" w:type="dxa"/>
-        <w:tblBorders>
-          <w:top w:val="single" w:sz="4"/>
-          <w:left w:val="single" w:sz="4"/>
-          <w:bottom w:val="single" w:sz="4"/>
-          <w:right w:val="single" w:sz="4"/>
-          <w:insideH w:val="single" w:sz="4"/>
-          <w:insideV w:val="single" w:sz="4"/>
-        </w:tblBorders>
-        <w:tblLook w:val="04A0"/>
+        <w:tblStyle w:val="26"/>
+        <w:tblW w:type="auto" w:w="0"/>
+        <w:tblLook w:firstColumn="1" w:firstRow="1" w:lastColumn="0" w:lastRow="0" w:noHBand="0" w:noVBand="1" w:val="04A0"/>
       </w:tblPr>
       <w:tblGrid>
         <w:gridCol w:w="2256"/>
@@ -25041,90 +25743,178 @@
       </w:tblGrid>
       <w:tr>
         <w:tc>
-          <w:p>
-            <w:r>
-              <w:t xml:space="preserve">考察点</w:t>
-            </w:r>
-          </w:p>
-        </w:tc>
-        <w:tc>
-          <w:p>
-            <w:r>
-              <w:t xml:space="preserve">完成状态</w:t>
-            </w:r>
-          </w:p>
-        </w:tc>
-        <w:tc>
-          <w:p>
-            <w:r>
-              <w:t xml:space="preserve">证据（文件/行号）</w:t>
-            </w:r>
-          </w:p>
-        </w:tc>
-        <w:tc>
-          <w:p>
-            <w:r>
-              <w:t xml:space="preserve">演示命令</w:t>
+          <w:tcPr>
+            <w:tcW w:type="dxa" w:w="2256"/>
+          </w:tcPr>
+          <w:p>
+            <w:r/>
+            <w:r>
+              <w:rPr>
+                <w:b/>
+                <w:sz w:val="18"/>
+              </w:rPr>
+              <w:t>考察点</w:t>
+            </w:r>
+          </w:p>
+        </w:tc>
+        <w:tc>
+          <w:tcPr>
+            <w:tcW w:type="dxa" w:w="2256"/>
+          </w:tcPr>
+          <w:p>
+            <w:r/>
+            <w:r>
+              <w:rPr>
+                <w:b/>
+                <w:sz w:val="18"/>
+              </w:rPr>
+              <w:t>完成状态</w:t>
+            </w:r>
+          </w:p>
+        </w:tc>
+        <w:tc>
+          <w:tcPr>
+            <w:tcW w:type="dxa" w:w="2256"/>
+          </w:tcPr>
+          <w:p>
+            <w:r/>
+            <w:r>
+              <w:rPr>
+                <w:b/>
+                <w:sz w:val="18"/>
+              </w:rPr>
+              <w:t>证据（文件/行号）</w:t>
+            </w:r>
+          </w:p>
+        </w:tc>
+        <w:tc>
+          <w:tcPr>
+            <w:tcW w:type="dxa" w:w="2256"/>
+          </w:tcPr>
+          <w:p>
+            <w:r/>
+            <w:r>
+              <w:rPr>
+                <w:b/>
+                <w:sz w:val="18"/>
+              </w:rPr>
+              <w:t>演示命令</w:t>
             </w:r>
           </w:p>
         </w:tc>
       </w:tr>
       <w:tr>
         <w:tc>
-          <w:p>
-            <w:r>
-              <w:t xml:space="preserve">镜像 &lt; 500MB + GET /health 端点</w:t>
-            </w:r>
-          </w:p>
-        </w:tc>
-        <w:tc>
-          <w:p>
-            <w:r>
-              <w:t xml:space="preserve">✅ 已完成（任务 D）</w:t>
-            </w:r>
-          </w:p>
-        </w:tc>
-        <w:tc>
-          <w:p>
-            <w:r>
-              <w:t xml:space="preserve">poc/deploy/Dockerfile.poc（multi-stage python:3.13-slim，无 XFCE/Chromium，装 fonts-wqy-zenhei）；poc/plugins/health/{router.py, plugin.py}（/api/poc/health 200 {"status":"ok"}）</w:t>
-            </w:r>
-          </w:p>
-        </w:tc>
-        <w:tc>
-          <w:p>
-            <w:r>
-              <w:t xml:space="preserve">docker build -f poc/deploy/Dockerfile.poc -t shunde-poc:dev . &amp;&amp; docker run --rm -p 8080:8080 shunde-poc:dev；curl http://localhost:8080/api/poc/health</w:t>
+          <w:tcPr>
+            <w:tcW w:type="dxa" w:w="2256"/>
+          </w:tcPr>
+          <w:p>
+            <w:r/>
+            <w:r>
+              <w:rPr>
+                <w:sz w:val="18"/>
+              </w:rPr>
+              <w:t>镜像 &lt; 500MB + GET /health 端点</w:t>
+            </w:r>
+          </w:p>
+        </w:tc>
+        <w:tc>
+          <w:tcPr>
+            <w:tcW w:type="dxa" w:w="2256"/>
+          </w:tcPr>
+          <w:p>
+            <w:r/>
+            <w:r>
+              <w:rPr>
+                <w:sz w:val="18"/>
+              </w:rPr>
+              <w:t>✅ 已完成（任务 D）</w:t>
+            </w:r>
+          </w:p>
+        </w:tc>
+        <w:tc>
+          <w:tcPr>
+            <w:tcW w:type="dxa" w:w="2256"/>
+          </w:tcPr>
+          <w:p>
+            <w:r/>
+            <w:r>
+              <w:rPr>
+                <w:sz w:val="18"/>
+              </w:rPr>
+              <w:t>poc/deploy/Dockerfile.poc（multi-stage python:3.13-slim，无 XFCE/Chromium，装 fonts-wqy-zenhei）；poc/plugins/health/{router.py, plugin.py}（/api/poc/health 200 {"status":"ok"}）</w:t>
+            </w:r>
+          </w:p>
+        </w:tc>
+        <w:tc>
+          <w:tcPr>
+            <w:tcW w:type="dxa" w:w="2256"/>
+          </w:tcPr>
+          <w:p>
+            <w:r/>
+            <w:r>
+              <w:rPr>
+                <w:sz w:val="18"/>
+              </w:rPr>
+              <w:t>docker build -f poc/deploy/Dockerfile.poc -t shunde-poc:dev . &amp;&amp; docker run --rm -p 8080:8080 shunde-poc:dev；curl http://localhost:8080/api/poc/health</w:t>
             </w:r>
           </w:p>
         </w:tc>
       </w:tr>
       <w:tr>
         <w:tc>
-          <w:p>
-            <w:r>
-              <w:t xml:space="preserve">QwenPaw v2.0.0 旁路接入（不改内核）</w:t>
-            </w:r>
-          </w:p>
-        </w:tc>
-        <w:tc>
-          <w:p>
-            <w:r>
-              <w:t xml:space="preserve">✅ 已完成</w:t>
-            </w:r>
-          </w:p>
-        </w:tc>
-        <w:tc>
-          <w:p>
-            <w:r>
-              <w:t xml:space="preserve">poc/requirements.txt 已锁版本；QwenPaw v2.0.0；pytest 全绿 225；红线 2：所有改动在 poc/ 内，git diff QwenPaw/ 始终为空</w:t>
-            </w:r>
-          </w:p>
-        </w:tc>
-        <w:tc>
-          <w:p>
-            <w:r>
-              <w:t xml:space="preserve">git diff --stat QwenPaw/  # 期望 0 行变更</w:t>
+          <w:tcPr>
+            <w:tcW w:type="dxa" w:w="2256"/>
+          </w:tcPr>
+          <w:p>
+            <w:r/>
+            <w:r>
+              <w:rPr>
+                <w:sz w:val="18"/>
+              </w:rPr>
+              <w:t>QwenPaw v2.0.0 旁路接入（不改内核）</w:t>
+            </w:r>
+          </w:p>
+        </w:tc>
+        <w:tc>
+          <w:tcPr>
+            <w:tcW w:type="dxa" w:w="2256"/>
+          </w:tcPr>
+          <w:p>
+            <w:r/>
+            <w:r>
+              <w:rPr>
+                <w:sz w:val="18"/>
+              </w:rPr>
+              <w:t>✅ 已完成</w:t>
+            </w:r>
+          </w:p>
+        </w:tc>
+        <w:tc>
+          <w:tcPr>
+            <w:tcW w:type="dxa" w:w="2256"/>
+          </w:tcPr>
+          <w:p>
+            <w:r/>
+            <w:r>
+              <w:rPr>
+                <w:sz w:val="18"/>
+              </w:rPr>
+              <w:t>poc/requirements.txt 已锁版本；QwenPaw v2.0.0；pytest 全绿 225；红线 2：所有改动在 poc/ 内，git diff QwenPaw/ 始终为空</w:t>
+            </w:r>
+          </w:p>
+        </w:tc>
+        <w:tc>
+          <w:tcPr>
+            <w:tcW w:type="dxa" w:w="2256"/>
+          </w:tcPr>
+          <w:p>
+            <w:r/>
+            <w:r>
+              <w:rPr>
+                <w:sz w:val="18"/>
+              </w:rPr>
+              <w:t>git diff --stat QwenPaw/  # 期望 0 行变更</w:t>
             </w:r>
           </w:p>
         </w:tc>
@@ -25154,7 +25944,7 @@
           <w:szCs w:val="24"/>
         </w:rPr>
       </w:pPr>
-      <w:bookmarkStart w:name="_Toc27142" w:id="24"/>
+      <w:bookmarkStart w:id="24" w:name="_Toc27142"/>
       <w:r>
         <w:rPr>
           <w:rFonts w:hint="eastAsia" w:ascii="华文细黑" w:hAnsi="华文细黑" w:eastAsia="华文细黑" w:cstheme="majorBidi"/>
@@ -26283,32 +27073,23 @@
           <w:color w:val="C00000"/>
           <w:sz w:val="28"/>
         </w:rPr>
-        <w:t xml:space="preserve">【完成证明 · 3.4.3 HARNESS能力（用例 4-3）】</w:t>
+        <w:t>【完成证明 · 3.4.3 HARNESS能力（用例 4-3）】</w:t>
       </w:r>
     </w:p>
     <w:p>
-      <w:pPr/>
       <w:r>
         <w:rPr>
-          <w:b w:val="false"/>
+          <w:b w:val="0"/>
           <w:sz w:val="22"/>
         </w:rPr>
-        <w:t xml:space="preserve">用例 4-3（对应需求原文 §3.4.3 HARNESS能力）的完成证据与现场演示命令如下。仓库当前测试基线：pytest 225 passed, 1 skipped（基线 101 + 任务 A/B/C/D/E/F 新增 124）。本节直接挂在原评估指标表之后，便于评委按需求原顺序查阅。</w:t>
+        <w:t>用例 4-3（对应需求原文 §3.4.3 HARNESS能力）的完成证据与现场演示命令如下。仓库当前测试基线：pytest 225 passed, 1 skipped（基线 101 + 任务 A/B/C/D/E/F 新增 124）。本节直接挂在原评估指标表之后，便于评委按需求原顺序查阅。</w:t>
       </w:r>
     </w:p>
     <w:tbl>
       <w:tblPr>
-        <w:tblStyle w:val="25"/>
-        <w:tblW w:w="9075" w:type="dxa"/>
-        <w:tblBorders>
-          <w:top w:val="single" w:sz="4"/>
-          <w:left w:val="single" w:sz="4"/>
-          <w:bottom w:val="single" w:sz="4"/>
-          <w:right w:val="single" w:sz="4"/>
-          <w:insideH w:val="single" w:sz="4"/>
-          <w:insideV w:val="single" w:sz="4"/>
-        </w:tblBorders>
-        <w:tblLook w:val="04A0"/>
+        <w:tblStyle w:val="26"/>
+        <w:tblW w:type="auto" w:w="0"/>
+        <w:tblLook w:firstColumn="1" w:firstRow="1" w:lastColumn="0" w:lastRow="0" w:noHBand="0" w:noVBand="1" w:val="04A0"/>
       </w:tblPr>
       <w:tblGrid>
         <w:gridCol w:w="2256"/>
@@ -26318,90 +27099,178 @@
       </w:tblGrid>
       <w:tr>
         <w:tc>
-          <w:p>
-            <w:r>
-              <w:t xml:space="preserve">考察点</w:t>
-            </w:r>
-          </w:p>
-        </w:tc>
-        <w:tc>
-          <w:p>
-            <w:r>
-              <w:t xml:space="preserve">完成状态</w:t>
-            </w:r>
-          </w:p>
-        </w:tc>
-        <w:tc>
-          <w:p>
-            <w:r>
-              <w:t xml:space="preserve">证据（文件/行号）</w:t>
-            </w:r>
-          </w:p>
-        </w:tc>
-        <w:tc>
-          <w:p>
-            <w:r>
-              <w:t xml:space="preserve">演示命令</w:t>
+          <w:tcPr>
+            <w:tcW w:type="dxa" w:w="2256"/>
+          </w:tcPr>
+          <w:p>
+            <w:r/>
+            <w:r>
+              <w:rPr>
+                <w:b/>
+                <w:sz w:val="18"/>
+              </w:rPr>
+              <w:t>考察点</w:t>
+            </w:r>
+          </w:p>
+        </w:tc>
+        <w:tc>
+          <w:tcPr>
+            <w:tcW w:type="dxa" w:w="2256"/>
+          </w:tcPr>
+          <w:p>
+            <w:r/>
+            <w:r>
+              <w:rPr>
+                <w:b/>
+                <w:sz w:val="18"/>
+              </w:rPr>
+              <w:t>完成状态</w:t>
+            </w:r>
+          </w:p>
+        </w:tc>
+        <w:tc>
+          <w:tcPr>
+            <w:tcW w:type="dxa" w:w="2256"/>
+          </w:tcPr>
+          <w:p>
+            <w:r/>
+            <w:r>
+              <w:rPr>
+                <w:b/>
+                <w:sz w:val="18"/>
+              </w:rPr>
+              <w:t>证据（文件/行号）</w:t>
+            </w:r>
+          </w:p>
+        </w:tc>
+        <w:tc>
+          <w:tcPr>
+            <w:tcW w:type="dxa" w:w="2256"/>
+          </w:tcPr>
+          <w:p>
+            <w:r/>
+            <w:r>
+              <w:rPr>
+                <w:b/>
+                <w:sz w:val="18"/>
+              </w:rPr>
+              <w:t>演示命令</w:t>
             </w:r>
           </w:p>
         </w:tc>
       </w:tr>
       <w:tr>
         <w:tc>
-          <w:p>
-            <w:r>
-              <w:t xml:space="preserve">上下文压缩 / 长期记忆 / 沙箱 三方案</w:t>
-            </w:r>
-          </w:p>
-        </w:tc>
-        <w:tc>
-          <w:p>
-            <w:r>
-              <w:t xml:space="preserve">✅ 已完成（任务 F）</w:t>
-            </w:r>
-          </w:p>
-        </w:tc>
-        <w:tc>
-          <w:p>
-            <w:r>
-              <w:t xml:space="preserve">docs/harness/{01-context-compression, 02-long-term-memory, 03-sandbox}.md + README.md 索引；每份讲义引用 QwenPaw v2.0.0 源码行号 + POC 落地证据</w:t>
-            </w:r>
-          </w:p>
-        </w:tc>
-        <w:tc>
-          <w:p>
-            <w:r>
-              <w:t xml:space="preserve">按 docs/harness/03-sandbox.md §4 演示剧本：构造 symlink 攻击向量 + POC_WORKSPACE=/ 验证 fail-closed；pytest poc/tests/test_security_regressions.py -v</w:t>
+          <w:tcPr>
+            <w:tcW w:type="dxa" w:w="2256"/>
+          </w:tcPr>
+          <w:p>
+            <w:r/>
+            <w:r>
+              <w:rPr>
+                <w:sz w:val="18"/>
+              </w:rPr>
+              <w:t>上下文压缩 / 长期记忆 / 沙箱 三方案</w:t>
+            </w:r>
+          </w:p>
+        </w:tc>
+        <w:tc>
+          <w:tcPr>
+            <w:tcW w:type="dxa" w:w="2256"/>
+          </w:tcPr>
+          <w:p>
+            <w:r/>
+            <w:r>
+              <w:rPr>
+                <w:sz w:val="18"/>
+              </w:rPr>
+              <w:t>✅ 已完成（任务 F）</w:t>
+            </w:r>
+          </w:p>
+        </w:tc>
+        <w:tc>
+          <w:tcPr>
+            <w:tcW w:type="dxa" w:w="2256"/>
+          </w:tcPr>
+          <w:p>
+            <w:r/>
+            <w:r>
+              <w:rPr>
+                <w:sz w:val="18"/>
+              </w:rPr>
+              <w:t>docs/harness/{01-context-compression, 02-long-term-memory, 03-sandbox}.md + README.md 索引；每份讲义引用 QwenPaw v2.0.0 源码行号 + POC 落地证据</w:t>
+            </w:r>
+          </w:p>
+        </w:tc>
+        <w:tc>
+          <w:tcPr>
+            <w:tcW w:type="dxa" w:w="2256"/>
+          </w:tcPr>
+          <w:p>
+            <w:r/>
+            <w:r>
+              <w:rPr>
+                <w:sz w:val="18"/>
+              </w:rPr>
+              <w:t>按 docs/harness/03-sandbox.md §4 演示剧本：构造 symlink 攻击向量 + POC_WORKSPACE=/ 验证 fail-closed；pytest poc/tests/test_security_regressions.py -v</w:t>
             </w:r>
           </w:p>
         </w:tc>
       </w:tr>
       <w:tr>
         <w:tc>
-          <w:p>
-            <w:r>
-              <w:t xml:space="preserve">QwenPaw v2.0.0 旁路接入（不改内核）</w:t>
-            </w:r>
-          </w:p>
-        </w:tc>
-        <w:tc>
-          <w:p>
-            <w:r>
-              <w:t xml:space="preserve">✅ 已完成</w:t>
-            </w:r>
-          </w:p>
-        </w:tc>
-        <w:tc>
-          <w:p>
-            <w:r>
-              <w:t xml:space="preserve">poc/requirements.txt 已锁版本；QwenPaw v2.0.0；pytest 全绿 225；红线 2：所有改动在 poc/ 内，git diff QwenPaw/ 始终为空</w:t>
-            </w:r>
-          </w:p>
-        </w:tc>
-        <w:tc>
-          <w:p>
-            <w:r>
-              <w:t xml:space="preserve">git diff --stat QwenPaw/  # 期望 0 行变更</w:t>
+          <w:tcPr>
+            <w:tcW w:type="dxa" w:w="2256"/>
+          </w:tcPr>
+          <w:p>
+            <w:r/>
+            <w:r>
+              <w:rPr>
+                <w:sz w:val="18"/>
+              </w:rPr>
+              <w:t>QwenPaw v2.0.0 旁路接入（不改内核）</w:t>
+            </w:r>
+          </w:p>
+        </w:tc>
+        <w:tc>
+          <w:tcPr>
+            <w:tcW w:type="dxa" w:w="2256"/>
+          </w:tcPr>
+          <w:p>
+            <w:r/>
+            <w:r>
+              <w:rPr>
+                <w:sz w:val="18"/>
+              </w:rPr>
+              <w:t>✅ 已完成</w:t>
+            </w:r>
+          </w:p>
+        </w:tc>
+        <w:tc>
+          <w:tcPr>
+            <w:tcW w:type="dxa" w:w="2256"/>
+          </w:tcPr>
+          <w:p>
+            <w:r/>
+            <w:r>
+              <w:rPr>
+                <w:sz w:val="18"/>
+              </w:rPr>
+              <w:t>poc/requirements.txt 已锁版本；QwenPaw v2.0.0；pytest 全绿 225；红线 2：所有改动在 poc/ 内，git diff QwenPaw/ 始终为空</w:t>
+            </w:r>
+          </w:p>
+        </w:tc>
+        <w:tc>
+          <w:tcPr>
+            <w:tcW w:type="dxa" w:w="2256"/>
+          </w:tcPr>
+          <w:p>
+            <w:r/>
+            <w:r>
+              <w:rPr>
+                <w:sz w:val="18"/>
+              </w:rPr>
+              <w:t>git diff --stat QwenPaw/  # 期望 0 行变更</w:t>
             </w:r>
           </w:p>
         </w:tc>
@@ -27724,260 +28593,260 @@
     </w:rPrDefault>
     <w:pPrDefault/>
   </w:docDefaults>
-  <w:latentStyles w:defLockedState="0" w:defUIPriority="99" w:defSemiHidden="1" w:defUnhideWhenUsed="1" w:defQFormat="0" w:count="260">
-    <w:lsdException w:name="Normal" w:uiPriority="0" w:semiHidden="0" w:unhideWhenUsed="0" w:qFormat="1"/>
-    <w:lsdException w:name="heading 1" w:uiPriority="9" w:semiHidden="0" w:unhideWhenUsed="0" w:qFormat="1"/>
-    <w:lsdException w:name="heading 2" w:uiPriority="9" w:semiHidden="0" w:qFormat="1"/>
-    <w:lsdException w:name="heading 3" w:uiPriority="9" w:semiHidden="0" w:qFormat="1"/>
-    <w:lsdException w:name="heading 4" w:uiPriority="9" w:semiHidden="0" w:qFormat="1"/>
-    <w:lsdException w:name="heading 5" w:uiPriority="9" w:semiHidden="0" w:qFormat="1"/>
-    <w:lsdException w:name="heading 6" w:uiPriority="9" w:semiHidden="0" w:qFormat="1"/>
-    <w:lsdException w:name="heading 7" w:uiPriority="9" w:qFormat="1"/>
-    <w:lsdException w:name="heading 8" w:uiPriority="9" w:qFormat="1"/>
-    <w:lsdException w:name="heading 9" w:uiPriority="9" w:qFormat="1"/>
-    <w:lsdException w:name="index 1" w:uiPriority="99"/>
-    <w:lsdException w:name="index 2" w:uiPriority="99"/>
-    <w:lsdException w:name="index 3" w:uiPriority="99"/>
-    <w:lsdException w:name="index 4" w:uiPriority="99"/>
-    <w:lsdException w:name="index 5" w:uiPriority="99"/>
-    <w:lsdException w:name="index 6" w:uiPriority="99"/>
-    <w:lsdException w:name="index 7" w:uiPriority="99"/>
-    <w:lsdException w:name="index 8" w:uiPriority="99"/>
-    <w:lsdException w:name="index 9" w:uiPriority="99"/>
-    <w:lsdException w:name="toc 1" w:uiPriority="39" w:semiHidden="0" w:qFormat="1"/>
-    <w:lsdException w:name="toc 2" w:uiPriority="39" w:semiHidden="0" w:qFormat="1"/>
-    <w:lsdException w:name="toc 3" w:uiPriority="39" w:semiHidden="0" w:qFormat="1"/>
-    <w:lsdException w:name="toc 4" w:uiPriority="39"/>
-    <w:lsdException w:name="toc 5" w:uiPriority="39"/>
-    <w:lsdException w:name="toc 6" w:uiPriority="39"/>
-    <w:lsdException w:name="toc 7" w:uiPriority="39"/>
-    <w:lsdException w:name="toc 8" w:uiPriority="39"/>
-    <w:lsdException w:name="toc 9" w:uiPriority="39"/>
-    <w:lsdException w:name="Normal Indent" w:uiPriority="99"/>
-    <w:lsdException w:name="footnote text" w:uiPriority="99"/>
-    <w:lsdException w:name="annotation text" w:uiPriority="99" w:semiHidden="0" w:qFormat="1"/>
-    <w:lsdException w:name="header" w:uiPriority="99" w:semiHidden="0" w:qFormat="1"/>
-    <w:lsdException w:name="footer" w:uiPriority="99" w:semiHidden="0" w:qFormat="1"/>
-    <w:lsdException w:name="index heading" w:uiPriority="99"/>
-    <w:lsdException w:name="caption" w:uiPriority="37" w:unhideWhenUsed="0" w:qFormat="1"/>
-    <w:lsdException w:name="table of figures" w:uiPriority="99"/>
-    <w:lsdException w:name="envelope address" w:uiPriority="99"/>
-    <w:lsdException w:name="envelope return" w:uiPriority="99"/>
-    <w:lsdException w:name="footnote reference" w:uiPriority="99"/>
-    <w:lsdException w:name="annotation reference" w:uiPriority="99" w:qFormat="1"/>
-    <w:lsdException w:name="line number" w:uiPriority="99"/>
-    <w:lsdException w:name="page number" w:uiPriority="99"/>
-    <w:lsdException w:name="endnote reference" w:uiPriority="99"/>
-    <w:lsdException w:name="endnote text" w:uiPriority="99"/>
-    <w:lsdException w:name="table of authorities" w:uiPriority="99"/>
-    <w:lsdException w:name="macro" w:uiPriority="99"/>
-    <w:lsdException w:name="toa heading" w:uiPriority="99"/>
-    <w:lsdException w:name="List" w:uiPriority="99"/>
-    <w:lsdException w:name="List Bullet" w:uiPriority="99"/>
-    <w:lsdException w:name="List Number" w:uiPriority="99"/>
-    <w:lsdException w:name="List 2" w:uiPriority="99"/>
-    <w:lsdException w:name="List 3" w:uiPriority="99"/>
-    <w:lsdException w:name="List 4" w:uiPriority="99"/>
-    <w:lsdException w:name="List 5" w:uiPriority="99"/>
-    <w:lsdException w:name="List Bullet 2" w:uiPriority="99"/>
-    <w:lsdException w:name="List Bullet 3" w:uiPriority="99"/>
-    <w:lsdException w:name="List Bullet 4" w:uiPriority="99"/>
-    <w:lsdException w:name="List Bullet 5" w:uiPriority="99"/>
-    <w:lsdException w:name="List Number 2" w:uiPriority="99"/>
-    <w:lsdException w:name="List Number 3" w:uiPriority="99"/>
-    <w:lsdException w:name="List Number 4" w:uiPriority="99"/>
-    <w:lsdException w:name="List Number 5" w:uiPriority="99"/>
-    <w:lsdException w:name="Title" w:uiPriority="10" w:semiHidden="0" w:unhideWhenUsed="0" w:qFormat="1"/>
-    <w:lsdException w:name="Closing" w:uiPriority="99"/>
-    <w:lsdException w:name="Signature" w:uiPriority="99"/>
-    <w:lsdException w:name="Default Paragraph Font" w:uiPriority="1" w:qFormat="1"/>
-    <w:lsdException w:name="Body Text" w:uiPriority="0" w:semiHidden="0" w:unhideWhenUsed="0" w:qFormat="1"/>
-    <w:lsdException w:name="Body Text Indent" w:uiPriority="99"/>
-    <w:lsdException w:name="List Continue" w:uiPriority="99"/>
-    <w:lsdException w:name="List Continue 2" w:uiPriority="99"/>
-    <w:lsdException w:name="List Continue 3" w:uiPriority="99"/>
-    <w:lsdException w:name="List Continue 4" w:uiPriority="99"/>
-    <w:lsdException w:name="List Continue 5" w:uiPriority="99"/>
-    <w:lsdException w:name="Message Header" w:uiPriority="99"/>
-    <w:lsdException w:name="Subtitle" w:uiPriority="11" w:semiHidden="0" w:unhideWhenUsed="0" w:qFormat="1"/>
-    <w:lsdException w:name="Salutation" w:uiPriority="99"/>
-    <w:lsdException w:name="Date" w:uiPriority="99"/>
-    <w:lsdException w:name="Body Text First Indent" w:uiPriority="0" w:semiHidden="0" w:qFormat="1"/>
-    <w:lsdException w:name="Body Text First Indent 2" w:uiPriority="99"/>
-    <w:lsdException w:name="Note Heading" w:uiPriority="99"/>
-    <w:lsdException w:name="Body Text 2" w:uiPriority="99"/>
-    <w:lsdException w:name="Body Text 3" w:uiPriority="99"/>
-    <w:lsdException w:name="Body Text Indent 2" w:uiPriority="99"/>
-    <w:lsdException w:name="Body Text Indent 3" w:uiPriority="99"/>
-    <w:lsdException w:name="Block Text" w:uiPriority="99"/>
-    <w:lsdException w:name="Hyperlink" w:uiPriority="99" w:semiHidden="0" w:qFormat="1"/>
-    <w:lsdException w:name="FollowedHyperlink" w:uiPriority="99"/>
-    <w:lsdException w:name="Strong" w:uiPriority="22" w:semiHidden="0" w:unhideWhenUsed="0"/>
-    <w:lsdException w:name="Emphasis" w:uiPriority="20" w:semiHidden="0" w:unhideWhenUsed="0"/>
-    <w:lsdException w:name="Document Map" w:uiPriority="99"/>
-    <w:lsdException w:name="Plain Text" w:uiPriority="99"/>
-    <w:lsdException w:name="E-mail Signature" w:uiPriority="99"/>
-    <w:lsdException w:name="Normal (Web)" w:uiPriority="99" w:qFormat="1"/>
-    <w:lsdException w:name="HTML Acronym" w:uiPriority="99"/>
-    <w:lsdException w:name="HTML Address" w:uiPriority="99"/>
-    <w:lsdException w:name="HTML Cite" w:uiPriority="99"/>
-    <w:lsdException w:name="HTML Code" w:uiPriority="99"/>
-    <w:lsdException w:name="HTML Definition" w:uiPriority="99"/>
-    <w:lsdException w:name="HTML Keyboard" w:uiPriority="99"/>
-    <w:lsdException w:name="HTML Preformatted" w:uiPriority="99"/>
-    <w:lsdException w:name="HTML Sample" w:uiPriority="99"/>
-    <w:lsdException w:name="HTML Typewriter" w:uiPriority="99"/>
-    <w:lsdException w:name="HTML Variable" w:uiPriority="99"/>
-    <w:lsdException w:name="Normal Table" w:uiPriority="99" w:qFormat="1"/>
-    <w:lsdException w:name="annotation subject" w:uiPriority="99" w:qFormat="1"/>
-    <w:lsdException w:name="Table Simple 1" w:uiPriority="99"/>
-    <w:lsdException w:name="Table Simple 2" w:uiPriority="99"/>
-    <w:lsdException w:name="Table Simple 3" w:uiPriority="99"/>
-    <w:lsdException w:name="Table Classic 1" w:uiPriority="99"/>
-    <w:lsdException w:name="Table Classic 2" w:uiPriority="99"/>
-    <w:lsdException w:name="Table Classic 3" w:uiPriority="99"/>
-    <w:lsdException w:name="Table Classic 4" w:uiPriority="99"/>
-    <w:lsdException w:name="Table Colorful 1" w:uiPriority="99"/>
-    <w:lsdException w:name="Table Colorful 2" w:uiPriority="99"/>
-    <w:lsdException w:name="Table Colorful 3" w:uiPriority="99"/>
-    <w:lsdException w:name="Table Columns 1" w:uiPriority="99"/>
-    <w:lsdException w:name="Table Columns 2" w:uiPriority="99"/>
-    <w:lsdException w:name="Table Columns 3" w:uiPriority="99"/>
-    <w:lsdException w:name="Table Columns 4" w:uiPriority="99"/>
-    <w:lsdException w:name="Table Columns 5" w:uiPriority="99"/>
-    <w:lsdException w:name="Table Grid 1" w:uiPriority="99"/>
-    <w:lsdException w:name="Table Grid 2" w:uiPriority="99"/>
-    <w:lsdException w:name="Table Grid 3" w:uiPriority="99"/>
-    <w:lsdException w:name="Table Grid 4" w:uiPriority="99"/>
-    <w:lsdException w:name="Table Grid 5" w:uiPriority="99"/>
-    <w:lsdException w:name="Table Grid 6" w:uiPriority="99"/>
-    <w:lsdException w:name="Table Grid 7" w:uiPriority="99"/>
-    <w:lsdException w:name="Table Grid 8" w:uiPriority="99"/>
-    <w:lsdException w:name="Table List 1" w:uiPriority="99"/>
-    <w:lsdException w:name="Table List 2" w:uiPriority="99"/>
-    <w:lsdException w:name="Table List 3" w:uiPriority="99"/>
-    <w:lsdException w:name="Table List 4" w:uiPriority="99"/>
-    <w:lsdException w:name="Table List 5" w:uiPriority="99"/>
-    <w:lsdException w:name="Table List 6" w:uiPriority="99"/>
-    <w:lsdException w:name="Table List 7" w:uiPriority="99"/>
-    <w:lsdException w:name="Table List 8" w:uiPriority="99"/>
-    <w:lsdException w:name="Table 3D effects 1" w:uiPriority="99"/>
-    <w:lsdException w:name="Table 3D effects 2" w:uiPriority="99"/>
-    <w:lsdException w:name="Table 3D effects 3" w:uiPriority="99"/>
-    <w:lsdException w:name="Table Contemporary" w:uiPriority="99"/>
-    <w:lsdException w:name="Table Elegant" w:uiPriority="99"/>
-    <w:lsdException w:name="Table Professional" w:uiPriority="99"/>
-    <w:lsdException w:name="Table Subtle 1" w:uiPriority="99"/>
-    <w:lsdException w:name="Table Subtle 2" w:uiPriority="99"/>
-    <w:lsdException w:name="Table Web 1" w:uiPriority="99"/>
-    <w:lsdException w:name="Table Web 2" w:uiPriority="99"/>
-    <w:lsdException w:name="Table Web 3" w:uiPriority="99"/>
-    <w:lsdException w:name="Balloon Text" w:uiPriority="99" w:qFormat="1"/>
-    <w:lsdException w:name="Table Grid" w:uiPriority="39" w:semiHidden="0" w:unhideWhenUsed="0" w:qFormat="1"/>
-    <w:lsdException w:name="Table Theme" w:uiPriority="99"/>
-    <w:lsdException w:name="Light Shading" w:uiPriority="60" w:semiHidden="0" w:unhideWhenUsed="0"/>
-    <w:lsdException w:name="Light List" w:uiPriority="61" w:semiHidden="0" w:unhideWhenUsed="0"/>
-    <w:lsdException w:name="Light Grid" w:uiPriority="62" w:semiHidden="0" w:unhideWhenUsed="0"/>
-    <w:lsdException w:name="Medium Shading 1" w:uiPriority="63" w:semiHidden="0" w:unhideWhenUsed="0"/>
-    <w:lsdException w:name="Medium Shading 2" w:uiPriority="64" w:semiHidden="0" w:unhideWhenUsed="0"/>
-    <w:lsdException w:name="Medium List 1" w:uiPriority="65" w:semiHidden="0" w:unhideWhenUsed="0"/>
-    <w:lsdException w:name="Medium List 2" w:uiPriority="66" w:semiHidden="0" w:unhideWhenUsed="0"/>
-    <w:lsdException w:name="Medium Grid 1" w:uiPriority="67" w:semiHidden="0" w:unhideWhenUsed="0"/>
-    <w:lsdException w:name="Medium Grid 2" w:uiPriority="68" w:semiHidden="0" w:unhideWhenUsed="0"/>
-    <w:lsdException w:name="Medium Grid 3" w:uiPriority="69" w:semiHidden="0" w:unhideWhenUsed="0"/>
-    <w:lsdException w:name="Dark List" w:uiPriority="70" w:semiHidden="0" w:unhideWhenUsed="0"/>
-    <w:lsdException w:name="Colorful Shading" w:uiPriority="71" w:semiHidden="0" w:unhideWhenUsed="0"/>
-    <w:lsdException w:name="Colorful List" w:uiPriority="72" w:semiHidden="0" w:unhideWhenUsed="0"/>
-    <w:lsdException w:name="Colorful Grid" w:uiPriority="73" w:semiHidden="0" w:unhideWhenUsed="0"/>
-    <w:lsdException w:name="Light Shading Accent 1" w:uiPriority="60" w:semiHidden="0" w:unhideWhenUsed="0"/>
-    <w:lsdException w:name="Light List Accent 1" w:uiPriority="61" w:semiHidden="0" w:unhideWhenUsed="0"/>
-    <w:lsdException w:name="Light Grid Accent 1" w:uiPriority="62" w:semiHidden="0" w:unhideWhenUsed="0"/>
-    <w:lsdException w:name="Medium Shading 1 Accent 1" w:uiPriority="63" w:semiHidden="0" w:unhideWhenUsed="0"/>
-    <w:lsdException w:name="Medium Shading 2 Accent 1" w:uiPriority="64" w:semiHidden="0" w:unhideWhenUsed="0"/>
-    <w:lsdException w:name="Medium List 1 Accent 1" w:uiPriority="65" w:semiHidden="0" w:unhideWhenUsed="0"/>
-    <w:lsdException w:name="List Paragraph" w:uiPriority="34" w:semiHidden="0" w:unhideWhenUsed="0" w:qFormat="1"/>
-    <w:lsdException w:name="Quote" w:uiPriority="12" w:semiHidden="0" w:unhideWhenUsed="0" w:qFormat="1"/>
-    <w:lsdException w:name="Intense Quote" w:uiPriority="13" w:semiHidden="0" w:unhideWhenUsed="0" w:qFormat="1"/>
-    <w:lsdException w:name="Medium List 2 Accent 1" w:uiPriority="66" w:semiHidden="0" w:unhideWhenUsed="0"/>
-    <w:lsdException w:name="Medium Grid 1 Accent 1" w:uiPriority="67" w:semiHidden="0" w:unhideWhenUsed="0"/>
-    <w:lsdException w:name="Medium Grid 2 Accent 1" w:uiPriority="68" w:semiHidden="0" w:unhideWhenUsed="0"/>
-    <w:lsdException w:name="Medium Grid 3 Accent 1" w:uiPriority="69" w:semiHidden="0" w:unhideWhenUsed="0"/>
-    <w:lsdException w:name="Dark List Accent 1" w:uiPriority="70" w:semiHidden="0" w:unhideWhenUsed="0"/>
-    <w:lsdException w:name="Colorful Shading Accent 1" w:uiPriority="71" w:semiHidden="0" w:unhideWhenUsed="0"/>
-    <w:lsdException w:name="Colorful List Accent 1" w:uiPriority="72" w:semiHidden="0" w:unhideWhenUsed="0"/>
-    <w:lsdException w:name="Colorful Grid Accent 1" w:uiPriority="73" w:semiHidden="0" w:unhideWhenUsed="0"/>
-    <w:lsdException w:name="Light Shading Accent 2" w:uiPriority="60" w:semiHidden="0" w:unhideWhenUsed="0"/>
-    <w:lsdException w:name="Light List Accent 2" w:uiPriority="61" w:semiHidden="0" w:unhideWhenUsed="0"/>
-    <w:lsdException w:name="Light Grid Accent 2" w:uiPriority="62" w:semiHidden="0" w:unhideWhenUsed="0"/>
-    <w:lsdException w:name="Medium Shading 1 Accent 2" w:uiPriority="63" w:semiHidden="0" w:unhideWhenUsed="0"/>
-    <w:lsdException w:name="Medium Shading 2 Accent 2" w:uiPriority="64" w:semiHidden="0" w:unhideWhenUsed="0"/>
-    <w:lsdException w:name="Medium List 1 Accent 2" w:uiPriority="65" w:semiHidden="0" w:unhideWhenUsed="0"/>
-    <w:lsdException w:name="Medium List 2 Accent 2" w:uiPriority="66" w:semiHidden="0" w:unhideWhenUsed="0"/>
-    <w:lsdException w:name="Medium Grid 1 Accent 2" w:uiPriority="67" w:semiHidden="0" w:unhideWhenUsed="0"/>
-    <w:lsdException w:name="Medium Grid 2 Accent 2" w:uiPriority="68" w:semiHidden="0" w:unhideWhenUsed="0"/>
-    <w:lsdException w:name="Medium Grid 3 Accent 2" w:uiPriority="69" w:semiHidden="0" w:unhideWhenUsed="0"/>
-    <w:lsdException w:name="Dark List Accent 2" w:uiPriority="70" w:semiHidden="0" w:unhideWhenUsed="0"/>
-    <w:lsdException w:name="Colorful Shading Accent 2" w:uiPriority="71" w:semiHidden="0" w:unhideWhenUsed="0"/>
-    <w:lsdException w:name="Colorful List Accent 2" w:uiPriority="72" w:semiHidden="0" w:unhideWhenUsed="0"/>
-    <w:lsdException w:name="Colorful Grid Accent 2" w:uiPriority="73" w:semiHidden="0" w:unhideWhenUsed="0"/>
-    <w:lsdException w:name="Light Shading Accent 3" w:uiPriority="60" w:semiHidden="0" w:unhideWhenUsed="0"/>
-    <w:lsdException w:name="Light List Accent 3" w:uiPriority="61" w:semiHidden="0" w:unhideWhenUsed="0"/>
-    <w:lsdException w:name="Light Grid Accent 3" w:uiPriority="62" w:semiHidden="0" w:unhideWhenUsed="0"/>
-    <w:lsdException w:name="Medium Shading 1 Accent 3" w:uiPriority="63" w:semiHidden="0" w:unhideWhenUsed="0"/>
-    <w:lsdException w:name="Medium Shading 2 Accent 3" w:uiPriority="64" w:semiHidden="0" w:unhideWhenUsed="0"/>
-    <w:lsdException w:name="Medium List 1 Accent 3" w:uiPriority="65" w:semiHidden="0" w:unhideWhenUsed="0"/>
-    <w:lsdException w:name="Medium List 2 Accent 3" w:uiPriority="66" w:semiHidden="0" w:unhideWhenUsed="0"/>
-    <w:lsdException w:name="Medium Grid 1 Accent 3" w:uiPriority="67" w:semiHidden="0" w:unhideWhenUsed="0"/>
-    <w:lsdException w:name="Medium Grid 2 Accent 3" w:uiPriority="68" w:semiHidden="0" w:unhideWhenUsed="0"/>
-    <w:lsdException w:name="Medium Grid 3 Accent 3" w:uiPriority="69" w:semiHidden="0" w:unhideWhenUsed="0"/>
-    <w:lsdException w:name="Dark List Accent 3" w:uiPriority="70" w:semiHidden="0" w:unhideWhenUsed="0"/>
-    <w:lsdException w:name="Colorful Shading Accent 3" w:uiPriority="71" w:semiHidden="0" w:unhideWhenUsed="0"/>
-    <w:lsdException w:name="Colorful List Accent 3" w:uiPriority="72" w:semiHidden="0" w:unhideWhenUsed="0"/>
-    <w:lsdException w:name="Colorful Grid Accent 3" w:uiPriority="73" w:semiHidden="0" w:unhideWhenUsed="0"/>
-    <w:lsdException w:name="Light Shading Accent 4" w:uiPriority="60" w:semiHidden="0" w:unhideWhenUsed="0"/>
-    <w:lsdException w:name="Light List Accent 4" w:uiPriority="61" w:semiHidden="0" w:unhideWhenUsed="0"/>
-    <w:lsdException w:name="Light Grid Accent 4" w:uiPriority="62" w:semiHidden="0" w:unhideWhenUsed="0"/>
-    <w:lsdException w:name="Medium Shading 1 Accent 4" w:uiPriority="63" w:semiHidden="0" w:unhideWhenUsed="0"/>
-    <w:lsdException w:name="Medium Shading 2 Accent 4" w:uiPriority="64" w:semiHidden="0" w:unhideWhenUsed="0"/>
-    <w:lsdException w:name="Medium List 1 Accent 4" w:uiPriority="65" w:semiHidden="0" w:unhideWhenUsed="0"/>
-    <w:lsdException w:name="Medium List 2 Accent 4" w:uiPriority="66" w:semiHidden="0" w:unhideWhenUsed="0"/>
-    <w:lsdException w:name="Medium Grid 1 Accent 4" w:uiPriority="67" w:semiHidden="0" w:unhideWhenUsed="0"/>
-    <w:lsdException w:name="Medium Grid 2 Accent 4" w:uiPriority="68" w:semiHidden="0" w:unhideWhenUsed="0"/>
-    <w:lsdException w:name="Medium Grid 3 Accent 4" w:uiPriority="69" w:semiHidden="0" w:unhideWhenUsed="0"/>
-    <w:lsdException w:name="Dark List Accent 4" w:uiPriority="70" w:semiHidden="0" w:unhideWhenUsed="0"/>
-    <w:lsdException w:name="Colorful Shading Accent 4" w:uiPriority="71" w:semiHidden="0" w:unhideWhenUsed="0"/>
-    <w:lsdException w:name="Colorful List Accent 4" w:uiPriority="72" w:semiHidden="0" w:unhideWhenUsed="0"/>
-    <w:lsdException w:name="Colorful Grid Accent 4" w:uiPriority="73" w:semiHidden="0" w:unhideWhenUsed="0"/>
-    <w:lsdException w:name="Light Shading Accent 5" w:uiPriority="60" w:semiHidden="0" w:unhideWhenUsed="0"/>
-    <w:lsdException w:name="Light List Accent 5" w:uiPriority="61" w:semiHidden="0" w:unhideWhenUsed="0"/>
-    <w:lsdException w:name="Light Grid Accent 5" w:uiPriority="62" w:semiHidden="0" w:unhideWhenUsed="0"/>
-    <w:lsdException w:name="Medium Shading 1 Accent 5" w:uiPriority="63" w:semiHidden="0" w:unhideWhenUsed="0"/>
-    <w:lsdException w:name="Medium Shading 2 Accent 5" w:uiPriority="64" w:semiHidden="0" w:unhideWhenUsed="0"/>
-    <w:lsdException w:name="Medium List 1 Accent 5" w:uiPriority="65" w:semiHidden="0" w:unhideWhenUsed="0"/>
-    <w:lsdException w:name="Medium List 2 Accent 5" w:uiPriority="66" w:semiHidden="0" w:unhideWhenUsed="0"/>
-    <w:lsdException w:name="Medium Grid 1 Accent 5" w:uiPriority="67" w:semiHidden="0" w:unhideWhenUsed="0"/>
-    <w:lsdException w:name="Medium Grid 2 Accent 5" w:uiPriority="68" w:semiHidden="0" w:unhideWhenUsed="0"/>
-    <w:lsdException w:name="Medium Grid 3 Accent 5" w:uiPriority="69" w:semiHidden="0" w:unhideWhenUsed="0"/>
-    <w:lsdException w:name="Dark List Accent 5" w:uiPriority="70" w:semiHidden="0" w:unhideWhenUsed="0"/>
-    <w:lsdException w:name="Colorful Shading Accent 5" w:uiPriority="71" w:semiHidden="0" w:unhideWhenUsed="0"/>
-    <w:lsdException w:name="Colorful List Accent 5" w:uiPriority="72" w:semiHidden="0" w:unhideWhenUsed="0"/>
-    <w:lsdException w:name="Colorful Grid Accent 5" w:uiPriority="73" w:semiHidden="0" w:unhideWhenUsed="0"/>
-    <w:lsdException w:name="Light Shading Accent 6" w:uiPriority="60" w:semiHidden="0" w:unhideWhenUsed="0"/>
-    <w:lsdException w:name="Light List Accent 6" w:uiPriority="61" w:semiHidden="0" w:unhideWhenUsed="0"/>
-    <w:lsdException w:name="Light Grid Accent 6" w:uiPriority="62" w:semiHidden="0" w:unhideWhenUsed="0"/>
-    <w:lsdException w:name="Medium Shading 1 Accent 6" w:uiPriority="63" w:semiHidden="0" w:unhideWhenUsed="0"/>
-    <w:lsdException w:name="Medium Shading 2 Accent 6" w:uiPriority="64" w:semiHidden="0" w:unhideWhenUsed="0"/>
-    <w:lsdException w:name="Medium List 1 Accent 6" w:uiPriority="65" w:semiHidden="0" w:unhideWhenUsed="0"/>
-    <w:lsdException w:name="Medium List 2 Accent 6" w:uiPriority="66" w:semiHidden="0" w:unhideWhenUsed="0"/>
-    <w:lsdException w:name="Medium Grid 1 Accent 6" w:uiPriority="67" w:semiHidden="0" w:unhideWhenUsed="0"/>
-    <w:lsdException w:name="Medium Grid 2 Accent 6" w:uiPriority="68" w:semiHidden="0" w:unhideWhenUsed="0"/>
-    <w:lsdException w:name="Medium Grid 3 Accent 6" w:uiPriority="69" w:semiHidden="0" w:unhideWhenUsed="0"/>
-    <w:lsdException w:name="Dark List Accent 6" w:uiPriority="70" w:semiHidden="0" w:unhideWhenUsed="0"/>
-    <w:lsdException w:name="Colorful Shading Accent 6" w:uiPriority="71" w:semiHidden="0" w:unhideWhenUsed="0"/>
-    <w:lsdException w:name="Colorful List Accent 6" w:uiPriority="72" w:semiHidden="0" w:unhideWhenUsed="0"/>
-    <w:lsdException w:name="Colorful Grid Accent 6" w:uiPriority="73" w:semiHidden="0" w:unhideWhenUsed="0"/>
+  <w:latentStyles w:count="260" w:defQFormat="0" w:defUnhideWhenUsed="1" w:defSemiHidden="1" w:defUIPriority="99" w:defLockedState="0">
+    <w:lsdException w:qFormat="1" w:unhideWhenUsed="0" w:uiPriority="0" w:semiHidden="0" w:name="Normal"/>
+    <w:lsdException w:qFormat="1" w:unhideWhenUsed="0" w:uiPriority="9" w:semiHidden="0" w:name="heading 1"/>
+    <w:lsdException w:qFormat="1" w:uiPriority="9" w:semiHidden="0" w:name="heading 2"/>
+    <w:lsdException w:qFormat="1" w:uiPriority="9" w:semiHidden="0" w:name="heading 3"/>
+    <w:lsdException w:qFormat="1" w:uiPriority="9" w:semiHidden="0" w:name="heading 4"/>
+    <w:lsdException w:qFormat="1" w:uiPriority="9" w:semiHidden="0" w:name="heading 5"/>
+    <w:lsdException w:qFormat="1" w:uiPriority="9" w:semiHidden="0" w:name="heading 6"/>
+    <w:lsdException w:qFormat="1" w:uiPriority="9" w:name="heading 7"/>
+    <w:lsdException w:qFormat="1" w:uiPriority="9" w:name="heading 8"/>
+    <w:lsdException w:qFormat="1" w:uiPriority="9" w:name="heading 9"/>
+    <w:lsdException w:uiPriority="99" w:name="index 1"/>
+    <w:lsdException w:uiPriority="99" w:name="index 2"/>
+    <w:lsdException w:uiPriority="99" w:name="index 3"/>
+    <w:lsdException w:uiPriority="99" w:name="index 4"/>
+    <w:lsdException w:uiPriority="99" w:name="index 5"/>
+    <w:lsdException w:uiPriority="99" w:name="index 6"/>
+    <w:lsdException w:uiPriority="99" w:name="index 7"/>
+    <w:lsdException w:uiPriority="99" w:name="index 8"/>
+    <w:lsdException w:uiPriority="99" w:name="index 9"/>
+    <w:lsdException w:qFormat="1" w:uiPriority="39" w:semiHidden="0" w:name="toc 1"/>
+    <w:lsdException w:qFormat="1" w:uiPriority="39" w:semiHidden="0" w:name="toc 2"/>
+    <w:lsdException w:qFormat="1" w:uiPriority="39" w:semiHidden="0" w:name="toc 3"/>
+    <w:lsdException w:uiPriority="39" w:name="toc 4"/>
+    <w:lsdException w:uiPriority="39" w:name="toc 5"/>
+    <w:lsdException w:uiPriority="39" w:name="toc 6"/>
+    <w:lsdException w:uiPriority="39" w:name="toc 7"/>
+    <w:lsdException w:uiPriority="39" w:name="toc 8"/>
+    <w:lsdException w:uiPriority="39" w:name="toc 9"/>
+    <w:lsdException w:uiPriority="99" w:name="Normal Indent"/>
+    <w:lsdException w:uiPriority="99" w:name="footnote text"/>
+    <w:lsdException w:qFormat="1" w:uiPriority="99" w:semiHidden="0" w:name="annotation text"/>
+    <w:lsdException w:qFormat="1" w:uiPriority="99" w:semiHidden="0" w:name="header"/>
+    <w:lsdException w:qFormat="1" w:uiPriority="99" w:semiHidden="0" w:name="footer"/>
+    <w:lsdException w:uiPriority="99" w:name="index heading"/>
+    <w:lsdException w:qFormat="1" w:unhideWhenUsed="0" w:uiPriority="37" w:name="caption"/>
+    <w:lsdException w:uiPriority="99" w:name="table of figures"/>
+    <w:lsdException w:uiPriority="99" w:name="envelope address"/>
+    <w:lsdException w:uiPriority="99" w:name="envelope return"/>
+    <w:lsdException w:uiPriority="99" w:name="footnote reference"/>
+    <w:lsdException w:qFormat="1" w:uiPriority="99" w:name="annotation reference"/>
+    <w:lsdException w:uiPriority="99" w:name="line number"/>
+    <w:lsdException w:uiPriority="99" w:name="page number"/>
+    <w:lsdException w:uiPriority="99" w:name="endnote reference"/>
+    <w:lsdException w:uiPriority="99" w:name="endnote text"/>
+    <w:lsdException w:uiPriority="99" w:name="table of authorities"/>
+    <w:lsdException w:uiPriority="99" w:name="macro"/>
+    <w:lsdException w:uiPriority="99" w:name="toa heading"/>
+    <w:lsdException w:uiPriority="99" w:name="List"/>
+    <w:lsdException w:uiPriority="99" w:name="List Bullet"/>
+    <w:lsdException w:uiPriority="99" w:name="List Number"/>
+    <w:lsdException w:uiPriority="99" w:name="List 2"/>
+    <w:lsdException w:uiPriority="99" w:name="List 3"/>
+    <w:lsdException w:uiPriority="99" w:name="List 4"/>
+    <w:lsdException w:uiPriority="99" w:name="List 5"/>
+    <w:lsdException w:uiPriority="99" w:name="List Bullet 2"/>
+    <w:lsdException w:uiPriority="99" w:name="List Bullet 3"/>
+    <w:lsdException w:uiPriority="99" w:name="List Bullet 4"/>
+    <w:lsdException w:uiPriority="99" w:name="List Bullet 5"/>
+    <w:lsdException w:uiPriority="99" w:name="List Number 2"/>
+    <w:lsdException w:uiPriority="99" w:name="List Number 3"/>
+    <w:lsdException w:uiPriority="99" w:name="List Number 4"/>
+    <w:lsdException w:uiPriority="99" w:name="List Number 5"/>
+    <w:lsdException w:qFormat="1" w:unhideWhenUsed="0" w:uiPriority="10" w:semiHidden="0" w:name="Title"/>
+    <w:lsdException w:uiPriority="99" w:name="Closing"/>
+    <w:lsdException w:uiPriority="99" w:name="Signature"/>
+    <w:lsdException w:qFormat="1" w:uiPriority="1" w:name="Default Paragraph Font"/>
+    <w:lsdException w:qFormat="1" w:unhideWhenUsed="0" w:uiPriority="0" w:semiHidden="0" w:name="Body Text"/>
+    <w:lsdException w:uiPriority="99" w:name="Body Text Indent"/>
+    <w:lsdException w:uiPriority="99" w:name="List Continue"/>
+    <w:lsdException w:uiPriority="99" w:name="List Continue 2"/>
+    <w:lsdException w:uiPriority="99" w:name="List Continue 3"/>
+    <w:lsdException w:uiPriority="99" w:name="List Continue 4"/>
+    <w:lsdException w:uiPriority="99" w:name="List Continue 5"/>
+    <w:lsdException w:uiPriority="99" w:name="Message Header"/>
+    <w:lsdException w:qFormat="1" w:unhideWhenUsed="0" w:uiPriority="11" w:semiHidden="0" w:name="Subtitle"/>
+    <w:lsdException w:uiPriority="99" w:name="Salutation"/>
+    <w:lsdException w:uiPriority="99" w:name="Date"/>
+    <w:lsdException w:qFormat="1" w:uiPriority="0" w:semiHidden="0" w:name="Body Text First Indent"/>
+    <w:lsdException w:uiPriority="99" w:name="Body Text First Indent 2"/>
+    <w:lsdException w:uiPriority="99" w:name="Note Heading"/>
+    <w:lsdException w:uiPriority="99" w:name="Body Text 2"/>
+    <w:lsdException w:uiPriority="99" w:name="Body Text 3"/>
+    <w:lsdException w:uiPriority="99" w:name="Body Text Indent 2"/>
+    <w:lsdException w:uiPriority="99" w:name="Body Text Indent 3"/>
+    <w:lsdException w:uiPriority="99" w:name="Block Text"/>
+    <w:lsdException w:qFormat="1" w:uiPriority="99" w:semiHidden="0" w:name="Hyperlink"/>
+    <w:lsdException w:uiPriority="99" w:name="FollowedHyperlink"/>
+    <w:lsdException w:unhideWhenUsed="0" w:uiPriority="22" w:semiHidden="0" w:name="Strong"/>
+    <w:lsdException w:unhideWhenUsed="0" w:uiPriority="20" w:semiHidden="0" w:name="Emphasis"/>
+    <w:lsdException w:uiPriority="99" w:name="Document Map"/>
+    <w:lsdException w:uiPriority="99" w:name="Plain Text"/>
+    <w:lsdException w:uiPriority="99" w:name="E-mail Signature"/>
+    <w:lsdException w:qFormat="1" w:uiPriority="99" w:name="Normal (Web)"/>
+    <w:lsdException w:uiPriority="99" w:name="HTML Acronym"/>
+    <w:lsdException w:uiPriority="99" w:name="HTML Address"/>
+    <w:lsdException w:uiPriority="99" w:name="HTML Cite"/>
+    <w:lsdException w:uiPriority="99" w:name="HTML Code"/>
+    <w:lsdException w:uiPriority="99" w:name="HTML Definition"/>
+    <w:lsdException w:uiPriority="99" w:name="HTML Keyboard"/>
+    <w:lsdException w:uiPriority="99" w:name="HTML Preformatted"/>
+    <w:lsdException w:uiPriority="99" w:name="HTML Sample"/>
+    <w:lsdException w:uiPriority="99" w:name="HTML Typewriter"/>
+    <w:lsdException w:uiPriority="99" w:name="HTML Variable"/>
+    <w:lsdException w:qFormat="1" w:uiPriority="99" w:name="Normal Table"/>
+    <w:lsdException w:qFormat="1" w:uiPriority="99" w:name="annotation subject"/>
+    <w:lsdException w:uiPriority="99" w:name="Table Simple 1"/>
+    <w:lsdException w:uiPriority="99" w:name="Table Simple 2"/>
+    <w:lsdException w:uiPriority="99" w:name="Table Simple 3"/>
+    <w:lsdException w:uiPriority="99" w:name="Table Classic 1"/>
+    <w:lsdException w:uiPriority="99" w:name="Table Classic 2"/>
+    <w:lsdException w:uiPriority="99" w:name="Table Classic 3"/>
+    <w:lsdException w:uiPriority="99" w:name="Table Classic 4"/>
+    <w:lsdException w:uiPriority="99" w:name="Table Colorful 1"/>
+    <w:lsdException w:uiPriority="99" w:name="Table Colorful 2"/>
+    <w:lsdException w:uiPriority="99" w:name="Table Colorful 3"/>
+    <w:lsdException w:uiPriority="99" w:name="Table Columns 1"/>
+    <w:lsdException w:uiPriority="99" w:name="Table Columns 2"/>
+    <w:lsdException w:uiPriority="99" w:name="Table Columns 3"/>
+    <w:lsdException w:uiPriority="99" w:name="Table Columns 4"/>
+    <w:lsdException w:uiPriority="99" w:name="Table Columns 5"/>
+    <w:lsdException w:uiPriority="99" w:name="Table Grid 1"/>
+    <w:lsdException w:uiPriority="99" w:name="Table Grid 2"/>
+    <w:lsdException w:uiPriority="99" w:name="Table Grid 3"/>
+    <w:lsdException w:uiPriority="99" w:name="Table Grid 4"/>
+    <w:lsdException w:uiPriority="99" w:name="Table Grid 5"/>
+    <w:lsdException w:uiPriority="99" w:name="Table Grid 6"/>
+    <w:lsdException w:uiPriority="99" w:name="Table Grid 7"/>
+    <w:lsdException w:uiPriority="99" w:name="Table Grid 8"/>
+    <w:lsdException w:uiPriority="99" w:name="Table List 1"/>
+    <w:lsdException w:uiPriority="99" w:name="Table List 2"/>
+    <w:lsdException w:uiPriority="99" w:name="Table List 3"/>
+    <w:lsdException w:uiPriority="99" w:name="Table List 4"/>
+    <w:lsdException w:uiPriority="99" w:name="Table List 5"/>
+    <w:lsdException w:uiPriority="99" w:name="Table List 6"/>
+    <w:lsdException w:uiPriority="99" w:name="Table List 7"/>
+    <w:lsdException w:uiPriority="99" w:name="Table List 8"/>
+    <w:lsdException w:uiPriority="99" w:name="Table 3D effects 1"/>
+    <w:lsdException w:uiPriority="99" w:name="Table 3D effects 2"/>
+    <w:lsdException w:uiPriority="99" w:name="Table 3D effects 3"/>
+    <w:lsdException w:uiPriority="99" w:name="Table Contemporary"/>
+    <w:lsdException w:uiPriority="99" w:name="Table Elegant"/>
+    <w:lsdException w:uiPriority="99" w:name="Table Professional"/>
+    <w:lsdException w:uiPriority="99" w:name="Table Subtle 1"/>
+    <w:lsdException w:uiPriority="99" w:name="Table Subtle 2"/>
+    <w:lsdException w:uiPriority="99" w:name="Table Web 1"/>
+    <w:lsdException w:uiPriority="99" w:name="Table Web 2"/>
+    <w:lsdException w:uiPriority="99" w:name="Table Web 3"/>
+    <w:lsdException w:qFormat="1" w:uiPriority="99" w:name="Balloon Text"/>
+    <w:lsdException w:qFormat="1" w:unhideWhenUsed="0" w:uiPriority="39" w:semiHidden="0" w:name="Table Grid"/>
+    <w:lsdException w:uiPriority="99" w:name="Table Theme"/>
+    <w:lsdException w:unhideWhenUsed="0" w:uiPriority="60" w:semiHidden="0" w:name="Light Shading"/>
+    <w:lsdException w:unhideWhenUsed="0" w:uiPriority="61" w:semiHidden="0" w:name="Light List"/>
+    <w:lsdException w:unhideWhenUsed="0" w:uiPriority="62" w:semiHidden="0" w:name="Light Grid"/>
+    <w:lsdException w:unhideWhenUsed="0" w:uiPriority="63" w:semiHidden="0" w:name="Medium Shading 1"/>
+    <w:lsdException w:unhideWhenUsed="0" w:uiPriority="64" w:semiHidden="0" w:name="Medium Shading 2"/>
+    <w:lsdException w:unhideWhenUsed="0" w:uiPriority="65" w:semiHidden="0" w:name="Medium List 1"/>
+    <w:lsdException w:unhideWhenUsed="0" w:uiPriority="66" w:semiHidden="0" w:name="Medium List 2"/>
+    <w:lsdException w:unhideWhenUsed="0" w:uiPriority="67" w:semiHidden="0" w:name="Medium Grid 1"/>
+    <w:lsdException w:unhideWhenUsed="0" w:uiPriority="68" w:semiHidden="0" w:name="Medium Grid 2"/>
+    <w:lsdException w:unhideWhenUsed="0" w:uiPriority="69" w:semiHidden="0" w:name="Medium Grid 3"/>
+    <w:lsdException w:unhideWhenUsed="0" w:uiPriority="70" w:semiHidden="0" w:name="Dark List"/>
+    <w:lsdException w:unhideWhenUsed="0" w:uiPriority="71" w:semiHidden="0" w:name="Colorful Shading"/>
+    <w:lsdException w:unhideWhenUsed="0" w:uiPriority="72" w:semiHidden="0" w:name="Colorful List"/>
+    <w:lsdException w:unhideWhenUsed="0" w:uiPriority="73" w:semiHidden="0" w:name="Colorful Grid"/>
+    <w:lsdException w:unhideWhenUsed="0" w:uiPriority="60" w:semiHidden="0" w:name="Light Shading Accent 1"/>
+    <w:lsdException w:unhideWhenUsed="0" w:uiPriority="61" w:semiHidden="0" w:name="Light List Accent 1"/>
+    <w:lsdException w:unhideWhenUsed="0" w:uiPriority="62" w:semiHidden="0" w:name="Light Grid Accent 1"/>
+    <w:lsdException w:unhideWhenUsed="0" w:uiPriority="63" w:semiHidden="0" w:name="Medium Shading 1 Accent 1"/>
+    <w:lsdException w:unhideWhenUsed="0" w:uiPriority="64" w:semiHidden="0" w:name="Medium Shading 2 Accent 1"/>
+    <w:lsdException w:unhideWhenUsed="0" w:uiPriority="65" w:semiHidden="0" w:name="Medium List 1 Accent 1"/>
+    <w:lsdException w:qFormat="1" w:unhideWhenUsed="0" w:uiPriority="34" w:semiHidden="0" w:name="List Paragraph"/>
+    <w:lsdException w:qFormat="1" w:unhideWhenUsed="0" w:uiPriority="12" w:semiHidden="0" w:name="Quote"/>
+    <w:lsdException w:qFormat="1" w:unhideWhenUsed="0" w:uiPriority="13" w:semiHidden="0" w:name="Intense Quote"/>
+    <w:lsdException w:unhideWhenUsed="0" w:uiPriority="66" w:semiHidden="0" w:name="Medium List 2 Accent 1"/>
+    <w:lsdException w:unhideWhenUsed="0" w:uiPriority="67" w:semiHidden="0" w:name="Medium Grid 1 Accent 1"/>
+    <w:lsdException w:unhideWhenUsed="0" w:uiPriority="68" w:semiHidden="0" w:name="Medium Grid 2 Accent 1"/>
+    <w:lsdException w:unhideWhenUsed="0" w:uiPriority="69" w:semiHidden="0" w:name="Medium Grid 3 Accent 1"/>
+    <w:lsdException w:unhideWhenUsed="0" w:uiPriority="70" w:semiHidden="0" w:name="Dark List Accent 1"/>
+    <w:lsdException w:unhideWhenUsed="0" w:uiPriority="71" w:semiHidden="0" w:name="Colorful Shading Accent 1"/>
+    <w:lsdException w:unhideWhenUsed="0" w:uiPriority="72" w:semiHidden="0" w:name="Colorful List Accent 1"/>
+    <w:lsdException w:unhideWhenUsed="0" w:uiPriority="73" w:semiHidden="0" w:name="Colorful Grid Accent 1"/>
+    <w:lsdException w:unhideWhenUsed="0" w:uiPriority="60" w:semiHidden="0" w:name="Light Shading Accent 2"/>
+    <w:lsdException w:unhideWhenUsed="0" w:uiPriority="61" w:semiHidden="0" w:name="Light List Accent 2"/>
+    <w:lsdException w:unhideWhenUsed="0" w:uiPriority="62" w:semiHidden="0" w:name="Light Grid Accent 2"/>
+    <w:lsdException w:unhideWhenUsed="0" w:uiPriority="63" w:semiHidden="0" w:name="Medium Shading 1 Accent 2"/>
+    <w:lsdException w:unhideWhenUsed="0" w:uiPriority="64" w:semiHidden="0" w:name="Medium Shading 2 Accent 2"/>
+    <w:lsdException w:unhideWhenUsed="0" w:uiPriority="65" w:semiHidden="0" w:name="Medium List 1 Accent 2"/>
+    <w:lsdException w:unhideWhenUsed="0" w:uiPriority="66" w:semiHidden="0" w:name="Medium List 2 Accent 2"/>
+    <w:lsdException w:unhideWhenUsed="0" w:uiPriority="67" w:semiHidden="0" w:name="Medium Grid 1 Accent 2"/>
+    <w:lsdException w:unhideWhenUsed="0" w:uiPriority="68" w:semiHidden="0" w:name="Medium Grid 2 Accent 2"/>
+    <w:lsdException w:unhideWhenUsed="0" w:uiPriority="69" w:semiHidden="0" w:name="Medium Grid 3 Accent 2"/>
+    <w:lsdException w:unhideWhenUsed="0" w:uiPriority="70" w:semiHidden="0" w:name="Dark List Accent 2"/>
+    <w:lsdException w:unhideWhenUsed="0" w:uiPriority="71" w:semiHidden="0" w:name="Colorful Shading Accent 2"/>
+    <w:lsdException w:unhideWhenUsed="0" w:uiPriority="72" w:semiHidden="0" w:name="Colorful List Accent 2"/>
+    <w:lsdException w:unhideWhenUsed="0" w:uiPriority="73" w:semiHidden="0" w:name="Colorful Grid Accent 2"/>
+    <w:lsdException w:unhideWhenUsed="0" w:uiPriority="60" w:semiHidden="0" w:name="Light Shading Accent 3"/>
+    <w:lsdException w:unhideWhenUsed="0" w:uiPriority="61" w:semiHidden="0" w:name="Light List Accent 3"/>
+    <w:lsdException w:unhideWhenUsed="0" w:uiPriority="62" w:semiHidden="0" w:name="Light Grid Accent 3"/>
+    <w:lsdException w:unhideWhenUsed="0" w:uiPriority="63" w:semiHidden="0" w:name="Medium Shading 1 Accent 3"/>
+    <w:lsdException w:unhideWhenUsed="0" w:uiPriority="64" w:semiHidden="0" w:name="Medium Shading 2 Accent 3"/>
+    <w:lsdException w:unhideWhenUsed="0" w:uiPriority="65" w:semiHidden="0" w:name="Medium List 1 Accent 3"/>
+    <w:lsdException w:unhideWhenUsed="0" w:uiPriority="66" w:semiHidden="0" w:name="Medium List 2 Accent 3"/>
+    <w:lsdException w:unhideWhenUsed="0" w:uiPriority="67" w:semiHidden="0" w:name="Medium Grid 1 Accent 3"/>
+    <w:lsdException w:unhideWhenUsed="0" w:uiPriority="68" w:semiHidden="0" w:name="Medium Grid 2 Accent 3"/>
+    <w:lsdException w:unhideWhenUsed="0" w:uiPriority="69" w:semiHidden="0" w:name="Medium Grid 3 Accent 3"/>
+    <w:lsdException w:unhideWhenUsed="0" w:uiPriority="70" w:semiHidden="0" w:name="Dark List Accent 3"/>
+    <w:lsdException w:unhideWhenUsed="0" w:uiPriority="71" w:semiHidden="0" w:name="Colorful Shading Accent 3"/>
+    <w:lsdException w:unhideWhenUsed="0" w:uiPriority="72" w:semiHidden="0" w:name="Colorful List Accent 3"/>
+    <w:lsdException w:unhideWhenUsed="0" w:uiPriority="73" w:semiHidden="0" w:name="Colorful Grid Accent 3"/>
+    <w:lsdException w:unhideWhenUsed="0" w:uiPriority="60" w:semiHidden="0" w:name="Light Shading Accent 4"/>
+    <w:lsdException w:unhideWhenUsed="0" w:uiPriority="61" w:semiHidden="0" w:name="Light List Accent 4"/>
+    <w:lsdException w:unhideWhenUsed="0" w:uiPriority="62" w:semiHidden="0" w:name="Light Grid Accent 4"/>
+    <w:lsdException w:unhideWhenUsed="0" w:uiPriority="63" w:semiHidden="0" w:name="Medium Shading 1 Accent 4"/>
+    <w:lsdException w:unhideWhenUsed="0" w:uiPriority="64" w:semiHidden="0" w:name="Medium Shading 2 Accent 4"/>
+    <w:lsdException w:unhideWhenUsed="0" w:uiPriority="65" w:semiHidden="0" w:name="Medium List 1 Accent 4"/>
+    <w:lsdException w:unhideWhenUsed="0" w:uiPriority="66" w:semiHidden="0" w:name="Medium List 2 Accent 4"/>
+    <w:lsdException w:unhideWhenUsed="0" w:uiPriority="67" w:semiHidden="0" w:name="Medium Grid 1 Accent 4"/>
+    <w:lsdException w:unhideWhenUsed="0" w:uiPriority="68" w:semiHidden="0" w:name="Medium Grid 2 Accent 4"/>
+    <w:lsdException w:unhideWhenUsed="0" w:uiPriority="69" w:semiHidden="0" w:name="Medium Grid 3 Accent 4"/>
+    <w:lsdException w:unhideWhenUsed="0" w:uiPriority="70" w:semiHidden="0" w:name="Dark List Accent 4"/>
+    <w:lsdException w:unhideWhenUsed="0" w:uiPriority="71" w:semiHidden="0" w:name="Colorful Shading Accent 4"/>
+    <w:lsdException w:unhideWhenUsed="0" w:uiPriority="72" w:semiHidden="0" w:name="Colorful List Accent 4"/>
+    <w:lsdException w:unhideWhenUsed="0" w:uiPriority="73" w:semiHidden="0" w:name="Colorful Grid Accent 4"/>
+    <w:lsdException w:unhideWhenUsed="0" w:uiPriority="60" w:semiHidden="0" w:name="Light Shading Accent 5"/>
+    <w:lsdException w:unhideWhenUsed="0" w:uiPriority="61" w:semiHidden="0" w:name="Light List Accent 5"/>
+    <w:lsdException w:unhideWhenUsed="0" w:uiPriority="62" w:semiHidden="0" w:name="Light Grid Accent 5"/>
+    <w:lsdException w:unhideWhenUsed="0" w:uiPriority="63" w:semiHidden="0" w:name="Medium Shading 1 Accent 5"/>
+    <w:lsdException w:unhideWhenUsed="0" w:uiPriority="64" w:semiHidden="0" w:name="Medium Shading 2 Accent 5"/>
+    <w:lsdException w:unhideWhenUsed="0" w:uiPriority="65" w:semiHidden="0" w:name="Medium List 1 Accent 5"/>
+    <w:lsdException w:unhideWhenUsed="0" w:uiPriority="66" w:semiHidden="0" w:name="Medium List 2 Accent 5"/>
+    <w:lsdException w:unhideWhenUsed="0" w:uiPriority="67" w:semiHidden="0" w:name="Medium Grid 1 Accent 5"/>
+    <w:lsdException w:unhideWhenUsed="0" w:uiPriority="68" w:semiHidden="0" w:name="Medium Grid 2 Accent 5"/>
+    <w:lsdException w:unhideWhenUsed="0" w:uiPriority="69" w:semiHidden="0" w:name="Medium Grid 3 Accent 5"/>
+    <w:lsdException w:unhideWhenUsed="0" w:uiPriority="70" w:semiHidden="0" w:name="Dark List Accent 5"/>
+    <w:lsdException w:unhideWhenUsed="0" w:uiPriority="71" w:semiHidden="0" w:name="Colorful Shading Accent 5"/>
+    <w:lsdException w:unhideWhenUsed="0" w:uiPriority="72" w:semiHidden="0" w:name="Colorful List Accent 5"/>
+    <w:lsdException w:unhideWhenUsed="0" w:uiPriority="73" w:semiHidden="0" w:name="Colorful Grid Accent 5"/>
+    <w:lsdException w:unhideWhenUsed="0" w:uiPriority="60" w:semiHidden="0" w:name="Light Shading Accent 6"/>
+    <w:lsdException w:unhideWhenUsed="0" w:uiPriority="61" w:semiHidden="0" w:name="Light List Accent 6"/>
+    <w:lsdException w:unhideWhenUsed="0" w:uiPriority="62" w:semiHidden="0" w:name="Light Grid Accent 6"/>
+    <w:lsdException w:unhideWhenUsed="0" w:uiPriority="63" w:semiHidden="0" w:name="Medium Shading 1 Accent 6"/>
+    <w:lsdException w:unhideWhenUsed="0" w:uiPriority="64" w:semiHidden="0" w:name="Medium Shading 2 Accent 6"/>
+    <w:lsdException w:unhideWhenUsed="0" w:uiPriority="65" w:semiHidden="0" w:name="Medium List 1 Accent 6"/>
+    <w:lsdException w:unhideWhenUsed="0" w:uiPriority="66" w:semiHidden="0" w:name="Medium List 2 Accent 6"/>
+    <w:lsdException w:unhideWhenUsed="0" w:uiPriority="67" w:semiHidden="0" w:name="Medium Grid 1 Accent 6"/>
+    <w:lsdException w:unhideWhenUsed="0" w:uiPriority="68" w:semiHidden="0" w:name="Medium Grid 2 Accent 6"/>
+    <w:lsdException w:unhideWhenUsed="0" w:uiPriority="69" w:semiHidden="0" w:name="Medium Grid 3 Accent 6"/>
+    <w:lsdException w:unhideWhenUsed="0" w:uiPriority="70" w:semiHidden="0" w:name="Dark List Accent 6"/>
+    <w:lsdException w:unhideWhenUsed="0" w:uiPriority="71" w:semiHidden="0" w:name="Colorful Shading Accent 6"/>
+    <w:lsdException w:unhideWhenUsed="0" w:uiPriority="72" w:semiHidden="0" w:name="Colorful List Accent 6"/>
+    <w:lsdException w:unhideWhenUsed="0" w:uiPriority="73" w:semiHidden="0" w:name="Colorful Grid Accent 6"/>
   </w:latentStyles>
-  <w:style w:type="paragraph" w:styleId="1" w:default="1">
+  <w:style w:type="paragraph" w:default="1" w:styleId="1">
     <w:name w:val="Normal"/>
     <w:qFormat/>
     <w:uiPriority w:val="0"/>
@@ -28259,14 +29128,14 @@
       <w:lang w:val="en-GB" w:eastAsia="zh-CN" w:bidi="ar-SA"/>
     </w:rPr>
   </w:style>
-  <w:style w:type="character" w:styleId="27" w:default="1">
+  <w:style w:type="character" w:default="1" w:styleId="27">
     <w:name w:val="Default Paragraph Font"/>
     <w:semiHidden/>
     <w:unhideWhenUsed/>
     <w:qFormat/>
     <w:uiPriority w:val="1"/>
   </w:style>
-  <w:style w:type="table" w:styleId="25" w:default="1">
+  <w:style w:type="table" w:default="1" w:styleId="25">
     <w:name w:val="Normal Table"/>
     <w:semiHidden/>
     <w:unhideWhenUsed/>
@@ -28408,7 +29277,7 @@
     <w:qFormat/>
     <w:uiPriority w:val="10"/>
     <w:pPr>
-      <w:framePr w:wrap="notBeside" w:hAnchor="text" w:vAnchor="text" w:y="1"/>
+      <w:framePr w:wrap="notBeside" w:vAnchor="text" w:hAnchor="text" w:y="1"/>
       <w:spacing w:before="1200" w:after="240"/>
       <w:contextualSpacing/>
     </w:pPr>
@@ -28525,7 +29394,7 @@
       <w:szCs w:val="16"/>
     </w:rPr>
   </w:style>
-  <w:style w:type="character" w:styleId="30" w:customStyle="1">
+  <w:style w:type="character" w:customStyle="1" w:styleId="30">
     <w:name w:val="标题 1 字符"/>
     <w:basedOn w:val="27"/>
     <w:link w:val="2"/>
@@ -28544,7 +29413,7 @@
       </w14:textFill>
     </w:rPr>
   </w:style>
-  <w:style w:type="character" w:styleId="31" w:customStyle="1">
+  <w:style w:type="character" w:customStyle="1" w:styleId="31">
     <w:name w:val="标题 2 字符"/>
     <w:basedOn w:val="27"/>
     <w:link w:val="3"/>
@@ -28562,7 +29431,7 @@
       </w14:textFill>
     </w:rPr>
   </w:style>
-  <w:style w:type="character" w:styleId="32" w:customStyle="1">
+  <w:style w:type="character" w:customStyle="1" w:styleId="32">
     <w:name w:val="标题 3 字符"/>
     <w:basedOn w:val="27"/>
     <w:link w:val="4"/>
@@ -28582,7 +29451,7 @@
       </w14:textFill>
     </w:rPr>
   </w:style>
-  <w:style w:type="character" w:styleId="33" w:customStyle="1">
+  <w:style w:type="character" w:customStyle="1" w:styleId="33">
     <w:name w:val="标题 4 字符"/>
     <w:basedOn w:val="27"/>
     <w:link w:val="5"/>
@@ -28602,7 +29471,7 @@
       </w14:textFill>
     </w:rPr>
   </w:style>
-  <w:style w:type="character" w:styleId="34" w:customStyle="1">
+  <w:style w:type="character" w:customStyle="1" w:styleId="34">
     <w:name w:val="标题 5 字符"/>
     <w:basedOn w:val="27"/>
     <w:link w:val="6"/>
@@ -28622,7 +29491,7 @@
       </w14:textFill>
     </w:rPr>
   </w:style>
-  <w:style w:type="character" w:styleId="35" w:customStyle="1">
+  <w:style w:type="character" w:customStyle="1" w:styleId="35">
     <w:name w:val="标题 6 字符"/>
     <w:basedOn w:val="27"/>
     <w:link w:val="7"/>
@@ -28642,7 +29511,7 @@
       </w14:textFill>
     </w:rPr>
   </w:style>
-  <w:style w:type="character" w:styleId="36" w:customStyle="1">
+  <w:style w:type="character" w:customStyle="1" w:styleId="36">
     <w:name w:val="标题 7 字符"/>
     <w:basedOn w:val="27"/>
     <w:link w:val="8"/>
@@ -28663,7 +29532,7 @@
       </w14:textFill>
     </w:rPr>
   </w:style>
-  <w:style w:type="character" w:styleId="37" w:customStyle="1">
+  <w:style w:type="character" w:customStyle="1" w:styleId="37">
     <w:name w:val="标题 8 字符"/>
     <w:basedOn w:val="27"/>
     <w:link w:val="9"/>
@@ -28679,7 +29548,7 @@
       <w:szCs w:val="28"/>
     </w:rPr>
   </w:style>
-  <w:style w:type="character" w:styleId="38" w:customStyle="1">
+  <w:style w:type="character" w:customStyle="1" w:styleId="38">
     <w:name w:val="标题 9 字符"/>
     <w:basedOn w:val="27"/>
     <w:link w:val="10"/>
@@ -28694,21 +29563,21 @@
       <w:szCs w:val="28"/>
     </w:rPr>
   </w:style>
-  <w:style w:type="character" w:styleId="39" w:customStyle="1">
+  <w:style w:type="character" w:customStyle="1" w:styleId="39">
     <w:name w:val="页眉 字符"/>
     <w:basedOn w:val="27"/>
     <w:link w:val="18"/>
     <w:qFormat/>
     <w:uiPriority w:val="99"/>
   </w:style>
-  <w:style w:type="character" w:styleId="40" w:customStyle="1">
+  <w:style w:type="character" w:customStyle="1" w:styleId="40">
     <w:name w:val="页脚 字符"/>
     <w:basedOn w:val="27"/>
     <w:link w:val="17"/>
     <w:qFormat/>
     <w:uiPriority w:val="99"/>
   </w:style>
-  <w:style w:type="character" w:styleId="41" w:customStyle="1">
+  <w:style w:type="character" w:customStyle="1" w:styleId="41">
     <w:name w:val="副标题 字符"/>
     <w:basedOn w:val="27"/>
     <w:link w:val="19"/>
@@ -28727,7 +29596,7 @@
       </w14:textFill>
     </w:rPr>
   </w:style>
-  <w:style w:type="character" w:styleId="42" w:customStyle="1">
+  <w:style w:type="character" w:customStyle="1" w:styleId="42">
     <w:name w:val="标题 字符"/>
     <w:basedOn w:val="27"/>
     <w:link w:val="20"/>
@@ -28752,7 +29621,7 @@
     <w:qFormat/>
     <w:uiPriority w:val="12"/>
     <w:pPr>
-      <w:framePr w:wrap="notBeside" w:hAnchor="text" w:vAnchor="text" w:y="1"/>
+      <w:framePr w:wrap="notBeside" w:vAnchor="text" w:hAnchor="text" w:y="1"/>
       <w:spacing w:before="360" w:after="360"/>
       <w:contextualSpacing/>
     </w:pPr>
@@ -28770,7 +29639,7 @@
       </w14:textFill>
     </w:rPr>
   </w:style>
-  <w:style w:type="character" w:styleId="44" w:customStyle="1">
+  <w:style w:type="character" w:customStyle="1" w:styleId="44">
     <w:name w:val="引用 字符"/>
     <w:basedOn w:val="27"/>
     <w:link w:val="43"/>
@@ -28804,7 +29673,7 @@
       </w14:textFill>
     </w:rPr>
   </w:style>
-  <w:style w:type="character" w:styleId="46" w:customStyle="1">
+  <w:style w:type="character" w:customStyle="1" w:styleId="46">
     <w:name w:val="明显引用 字符"/>
     <w:basedOn w:val="27"/>
     <w:link w:val="45"/>
@@ -28823,7 +29692,7 @@
       </w14:textFill>
     </w:rPr>
   </w:style>
-  <w:style w:type="paragraph" w:styleId="47" w:customStyle="1">
+  <w:style w:type="paragraph" w:customStyle="1" w:styleId="47">
     <w:name w:val="TOC Heading"/>
     <w:basedOn w:val="2"/>
     <w:next w:val="1"/>
@@ -28842,7 +29711,7 @@
       </w14:textFill>
     </w:rPr>
   </w:style>
-  <w:style w:type="paragraph" w:styleId="48" w:customStyle="1">
+  <w:style w:type="paragraph" w:customStyle="1" w:styleId="48">
     <w:name w:val="KPMG_L1"/>
     <w:basedOn w:val="1"/>
     <w:link w:val="49"/>
@@ -28861,7 +29730,7 @@
       <w:lang w:val="en-US"/>
     </w:rPr>
   </w:style>
-  <w:style w:type="character" w:styleId="49" w:customStyle="1">
+  <w:style w:type="character" w:customStyle="1" w:styleId="49">
     <w:name w:val="KPMG_L1 Char"/>
     <w:basedOn w:val="27"/>
     <w:link w:val="48"/>
@@ -28885,7 +29754,7 @@
       <w:contextualSpacing/>
     </w:pPr>
   </w:style>
-  <w:style w:type="paragraph" w:styleId="51" w:customStyle="1">
+  <w:style w:type="paragraph" w:customStyle="1" w:styleId="51">
     <w:name w:val="KPMG_正文"/>
     <w:basedOn w:val="1"/>
     <w:link w:val="52"/>
@@ -28903,7 +29772,7 @@
       <w:lang w:val="en-US"/>
     </w:rPr>
   </w:style>
-  <w:style w:type="character" w:styleId="52" w:customStyle="1">
+  <w:style w:type="character" w:customStyle="1" w:styleId="52">
     <w:name w:val="KPMG_正文 Char"/>
     <w:basedOn w:val="27"/>
     <w:link w:val="51"/>
@@ -28916,7 +29785,7 @@
       <w:lang w:val="en-US"/>
     </w:rPr>
   </w:style>
-  <w:style w:type="paragraph" w:styleId="53" w:customStyle="1">
+  <w:style w:type="paragraph" w:customStyle="1" w:styleId="53">
     <w:name w:val="KPMG_B1"/>
     <w:basedOn w:val="1"/>
     <w:link w:val="54"/>
@@ -28938,7 +29807,7 @@
       <w:lang w:val="en-US"/>
     </w:rPr>
   </w:style>
-  <w:style w:type="character" w:styleId="54" w:customStyle="1">
+  <w:style w:type="character" w:customStyle="1" w:styleId="54">
     <w:name w:val="KPMG_B1 Char"/>
     <w:basedOn w:val="27"/>
     <w:link w:val="53"/>
@@ -28951,7 +29820,7 @@
       <w:lang w:val="en-US"/>
     </w:rPr>
   </w:style>
-  <w:style w:type="paragraph" w:styleId="55" w:customStyle="1">
+  <w:style w:type="paragraph" w:customStyle="1" w:styleId="55">
     <w:name w:val="KPMG_L4"/>
     <w:basedOn w:val="1"/>
     <w:next w:val="53"/>
@@ -28975,7 +29844,7 @@
       <w:szCs w:val="28"/>
     </w:rPr>
   </w:style>
-  <w:style w:type="character" w:styleId="56" w:customStyle="1">
+  <w:style w:type="character" w:customStyle="1" w:styleId="56">
     <w:name w:val="KPMG_L4 Char"/>
     <w:basedOn w:val="27"/>
     <w:link w:val="55"/>
@@ -28989,7 +29858,7 @@
       <w:szCs w:val="28"/>
     </w:rPr>
   </w:style>
-  <w:style w:type="character" w:styleId="57" w:customStyle="1">
+  <w:style w:type="character" w:customStyle="1" w:styleId="57">
     <w:name w:val="批注框文本 字符"/>
     <w:basedOn w:val="27"/>
     <w:link w:val="16"/>
@@ -29002,14 +29871,14 @@
       <w:szCs w:val="18"/>
     </w:rPr>
   </w:style>
-  <w:style w:type="character" w:styleId="58" w:customStyle="1">
+  <w:style w:type="character" w:customStyle="1" w:styleId="58">
     <w:name w:val="批注文字 字符"/>
     <w:basedOn w:val="27"/>
     <w:link w:val="12"/>
     <w:qFormat/>
     <w:uiPriority w:val="99"/>
   </w:style>
-  <w:style w:type="character" w:styleId="59" w:customStyle="1">
+  <w:style w:type="character" w:customStyle="1" w:styleId="59">
     <w:name w:val="批注主题 字符"/>
     <w:basedOn w:val="58"/>
     <w:link w:val="23"/>
@@ -29021,7 +29890,7 @@
       <w:bCs/>
     </w:rPr>
   </w:style>
-  <w:style w:type="paragraph" w:styleId="60" w:customStyle="1">
+  <w:style w:type="paragraph" w:customStyle="1" w:styleId="60">
     <w:name w:val="Revision"/>
     <w:hidden/>
     <w:semiHidden/>
@@ -29032,7 +29901,7 @@
       <w:lang w:val="en-GB" w:eastAsia="zh-CN" w:bidi="ar-SA"/>
     </w:rPr>
   </w:style>
-  <w:style w:type="table" w:styleId="61" w:customStyle="1">
+  <w:style w:type="table" w:customStyle="1" w:styleId="61">
     <w:name w:val="Table Grid1"/>
     <w:basedOn w:val="25"/>
     <w:qFormat/>
@@ -29048,7 +29917,7 @@
       </w:tblBorders>
     </w:tblPr>
   </w:style>
-  <w:style w:type="paragraph" w:styleId="62" w:customStyle="1">
+  <w:style w:type="paragraph" w:customStyle="1" w:styleId="62">
     <w:name w:val="DT_BodyText"/>
     <w:basedOn w:val="1"/>
     <w:link w:val="63"/>
@@ -29068,7 +29937,7 @@
       <w:lang w:val="zh-CN"/>
     </w:rPr>
   </w:style>
-  <w:style w:type="character" w:styleId="63" w:customStyle="1">
+  <w:style w:type="character" w:customStyle="1" w:styleId="63">
     <w:name w:val="DT_BodyText 字符"/>
     <w:basedOn w:val="27"/>
     <w:link w:val="62"/>
@@ -29081,7 +29950,7 @@
       <w:lang w:val="zh-CN"/>
     </w:rPr>
   </w:style>
-  <w:style w:type="paragraph" w:styleId="64" w:customStyle="1">
+  <w:style w:type="paragraph" w:customStyle="1" w:styleId="64">
     <w:name w:val="bullet 1"/>
     <w:basedOn w:val="1"/>
     <w:link w:val="65"/>
@@ -29104,7 +29973,7 @@
       <w:lang w:val="en-US"/>
     </w:rPr>
   </w:style>
-  <w:style w:type="character" w:styleId="65" w:customStyle="1">
+  <w:style w:type="character" w:customStyle="1" w:styleId="65">
     <w:name w:val="bullet 1 Char"/>
     <w:link w:val="64"/>
     <w:qFormat/>
@@ -29117,7 +29986,7 @@
       <w:lang w:val="en-US"/>
     </w:rPr>
   </w:style>
-  <w:style w:type="paragraph" w:styleId="66" w:customStyle="1">
+  <w:style w:type="paragraph" w:customStyle="1" w:styleId="66">
     <w:name w:val="bullet 2"/>
     <w:basedOn w:val="64"/>
     <w:link w:val="67"/>
@@ -29129,7 +29998,7 @@
       </w:numPr>
     </w:pPr>
   </w:style>
-  <w:style w:type="character" w:styleId="67" w:customStyle="1">
+  <w:style w:type="character" w:customStyle="1" w:styleId="67">
     <w:name w:val="bullet 2 Char"/>
     <w:link w:val="66"/>
     <w:qFormat/>
@@ -29142,7 +30011,7 @@
       <w:lang w:val="en-US"/>
     </w:rPr>
   </w:style>
-  <w:style w:type="paragraph" w:styleId="68" w:customStyle="1">
+  <w:style w:type="paragraph" w:customStyle="1" w:styleId="68">
     <w:name w:val="DTT_正文"/>
     <w:basedOn w:val="1"/>
     <w:link w:val="69"/>
@@ -29160,7 +30029,7 @@
       <w:lang w:val="en-US"/>
     </w:rPr>
   </w:style>
-  <w:style w:type="character" w:styleId="69" w:customStyle="1">
+  <w:style w:type="character" w:customStyle="1" w:styleId="69">
     <w:name w:val="DTT_正文 字符"/>
     <w:basedOn w:val="27"/>
     <w:link w:val="68"/>
@@ -29173,7 +30042,7 @@
       <w:lang w:val="en-US"/>
     </w:rPr>
   </w:style>
-  <w:style w:type="paragraph" w:styleId="70" w:customStyle="1">
+  <w:style w:type="paragraph" w:customStyle="1" w:styleId="70">
     <w:name w:val="正文段落"/>
     <w:basedOn w:val="1"/>
     <w:link w:val="71"/>
@@ -29193,7 +30062,7 @@
       <w:lang w:val="en-US"/>
     </w:rPr>
   </w:style>
-  <w:style w:type="character" w:styleId="71" w:customStyle="1">
+  <w:style w:type="character" w:customStyle="1" w:styleId="71">
     <w:name w:val="正文段落 字符"/>
     <w:basedOn w:val="27"/>
     <w:link w:val="70"/>
@@ -29207,7 +30076,7 @@
       <w:lang w:val="en-US"/>
     </w:rPr>
   </w:style>
-  <w:style w:type="paragraph" w:styleId="72" w:customStyle="1">
+  <w:style w:type="paragraph" w:customStyle="1" w:styleId="72">
     <w:name w:val="1级正文列表"/>
     <w:basedOn w:val="70"/>
     <w:link w:val="73"/>
@@ -29224,7 +30093,7 @@
       <w:rFonts w:cs="Times New Roman"/>
     </w:rPr>
   </w:style>
-  <w:style w:type="character" w:styleId="73" w:customStyle="1">
+  <w:style w:type="character" w:customStyle="1" w:styleId="73">
     <w:name w:val="1级正文列表 字符"/>
     <w:link w:val="72"/>
     <w:qFormat/>
@@ -29237,7 +30106,7 @@
       <w:lang w:val="en-US"/>
     </w:rPr>
   </w:style>
-  <w:style w:type="character" w:styleId="74" w:customStyle="1">
+  <w:style w:type="character" w:customStyle="1" w:styleId="74">
     <w:name w:val="font21"/>
     <w:basedOn w:val="27"/>
     <w:qFormat/>

</xml_diff>